<commit_message>
docs:franz/ "registro de riesgos ,informes de avance semanal y tablero kpi"
</commit_message>
<xml_diff>
--- a/documentos/Documentacion_Proyecto.docx
+++ b/documentos/Documentacion_Proyecto.docx
@@ -146,16 +146,7 @@
           <w:sz w:val="22"/>
           <w:szCs w:val="22"/>
         </w:rPr>
-        <w:t xml:space="preserve"> Alcaldía de Sucre </w:t>
-      </w:r>
-      <w:r>
-        <w:rPr>
-          <w:rFonts w:ascii="Arial" w:eastAsia="Arial" w:hAnsi="Arial" w:cs="Arial"/>
-          <w:color w:val="1F1F1F"/>
-          <w:sz w:val="22"/>
-          <w:szCs w:val="22"/>
-        </w:rPr>
-        <w:t xml:space="preserve"> </w:t>
+        <w:t xml:space="preserve"> Alcaldía de Sucre  </w:t>
       </w:r>
     </w:p>
     <w:p>
@@ -3842,6 +3833,467 @@
         <w:t xml:space="preserve"> Dos desarrolladores clave presentaron su renuncia al finalizar el mes 3. Para compensar esta pérdida sin contratar personal externo (lo que requeriría tiempo de inducción), los 2 programadores restantes absorbieron el 100% de las tareas de codificación de los módulos de licencias, reportes y geolocalización, trabajando bajo un régimen de horas extra remuneradas con el fondo de sueldos sobrante (3,600 Bs del subtotal de personal).</w:t>
       </w:r>
     </w:p>
+    <w:p>
+      <w:pPr>
+        <w:pStyle w:val="Ttulo3"/>
+        <w:spacing w:after="120" w:line="275" w:lineRule="auto"/>
+        <w:rPr>
+          <w:b/>
+          <w:bCs/>
+          <w:color w:val="1F1F1F"/>
+          <w:sz w:val="22"/>
+          <w:szCs w:val="22"/>
+        </w:rPr>
+      </w:pPr>
+      <w:r>
+        <w:rPr>
+          <w:b/>
+          <w:bCs/>
+          <w:color w:val="1F1F1F"/>
+          <w:sz w:val="22"/>
+          <w:szCs w:val="22"/>
+        </w:rPr>
+        <w:t>Registro de Riesgos</w:t>
+      </w:r>
+    </w:p>
+    <w:p>
+      <w:pPr>
+        <w:pBdr>
+          <w:top w:val="nil"/>
+          <w:left w:val="nil"/>
+          <w:bottom w:val="nil"/>
+          <w:right w:val="nil"/>
+          <w:between w:val="nil"/>
+        </w:pBdr>
+        <w:spacing w:before="240" w:after="120" w:line="275" w:lineRule="auto"/>
+        <w:rPr>
+          <w:color w:val="1F1F1F"/>
+        </w:rPr>
+      </w:pPr>
+      <w:r>
+        <w:rPr>
+          <w:color w:val="1F1F1F"/>
+        </w:rPr>
+        <w:t>Antes de iniciar el proyecto, el equipo identificó las amenazas potenciales en una matriz inicial para preparar respuestas inmediatas en caso de ocurrencia:</w:t>
+      </w:r>
+    </w:p>
+    <w:p>
+      <w:pPr>
+        <w:widowControl w:val="0"/>
+        <w:numPr>
+          <w:ilvl w:val="0"/>
+          <w:numId w:val="13"/>
+        </w:numPr>
+        <w:pBdr>
+          <w:top w:val="nil"/>
+          <w:left w:val="nil"/>
+          <w:bottom w:val="nil"/>
+          <w:right w:val="nil"/>
+          <w:between w:val="nil"/>
+        </w:pBdr>
+        <w:spacing w:before="240" w:after="0" w:line="275" w:lineRule="auto"/>
+      </w:pPr>
+      <w:r>
+        <w:rPr>
+          <w:b/>
+          <w:bCs/>
+          <w:color w:val="1F1F1F"/>
+        </w:rPr>
+        <w:t>Riesgo de Personal:</w:t>
+      </w:r>
+      <w:r>
+        <w:rPr>
+          <w:color w:val="1F1F1F"/>
+        </w:rPr>
+        <w:t xml:space="preserve"> Renuncia de desarrolladores clave durante la fase crítica de programación. </w:t>
+      </w:r>
+      <w:r>
+        <w:rPr>
+          <w:b/>
+          <w:bCs/>
+          <w:color w:val="1F1F1F"/>
+        </w:rPr>
+        <w:t>Probabilidad:</w:t>
+      </w:r>
+      <w:r>
+        <w:rPr>
+          <w:color w:val="1F1F1F"/>
+        </w:rPr>
+        <w:t xml:space="preserve"> Media. </w:t>
+      </w:r>
+      <w:r>
+        <w:rPr>
+          <w:b/>
+          <w:bCs/>
+          <w:color w:val="1F1F1F"/>
+        </w:rPr>
+        <w:t>Impacto:</w:t>
+      </w:r>
+      <w:r>
+        <w:rPr>
+          <w:color w:val="1F1F1F"/>
+        </w:rPr>
+        <w:t xml:space="preserve"> Alto. Plan de mitigación: Mantener el código guardado diariamente en Git y usar una arquitectura ordenada y documentada para que otros puedan entender el trabajo fácilmente.</w:t>
+      </w:r>
+    </w:p>
+    <w:p>
+      <w:pPr>
+        <w:widowControl w:val="0"/>
+        <w:numPr>
+          <w:ilvl w:val="0"/>
+          <w:numId w:val="13"/>
+        </w:numPr>
+        <w:pBdr>
+          <w:top w:val="nil"/>
+          <w:left w:val="nil"/>
+          <w:bottom w:val="nil"/>
+          <w:right w:val="nil"/>
+          <w:between w:val="nil"/>
+        </w:pBdr>
+        <w:spacing w:before="240" w:after="120" w:line="275" w:lineRule="auto"/>
+      </w:pPr>
+      <w:r>
+        <w:rPr>
+          <w:b/>
+          <w:bCs/>
+          <w:color w:val="1F1F1F"/>
+        </w:rPr>
+        <w:t>Riesgo Político/Legal:</w:t>
+      </w:r>
+      <w:r>
+        <w:rPr>
+          <w:color w:val="1F1F1F"/>
+        </w:rPr>
+        <w:t xml:space="preserve"> Cambios imprevistos en las leyes y normativas de la Alcaldía sobre las licencias sanitarias de los comerciantes. </w:t>
+      </w:r>
+      <w:r>
+        <w:rPr>
+          <w:b/>
+          <w:bCs/>
+          <w:color w:val="1F1F1F"/>
+        </w:rPr>
+        <w:t>Probabilidad:</w:t>
+      </w:r>
+      <w:r>
+        <w:rPr>
+          <w:color w:val="1F1F1F"/>
+        </w:rPr>
+        <w:t xml:space="preserve"> Media. </w:t>
+      </w:r>
+      <w:r>
+        <w:rPr>
+          <w:b/>
+          <w:bCs/>
+          <w:color w:val="1F1F1F"/>
+        </w:rPr>
+        <w:t>Impacto:</w:t>
+      </w:r>
+      <w:r>
+        <w:rPr>
+          <w:color w:val="1F1F1F"/>
+        </w:rPr>
+        <w:t xml:space="preserve"> Medio. Plan de mitigación: Programar las reglas de validación de forma modular e independiente para que modificarlas no rompa el resto del sistema web.</w:t>
+      </w:r>
+    </w:p>
+    <w:p>
+      <w:pPr>
+        <w:pStyle w:val="Ttulo3"/>
+        <w:spacing w:after="120" w:line="275" w:lineRule="auto"/>
+        <w:rPr>
+          <w:b/>
+          <w:bCs/>
+          <w:color w:val="1F1F1F"/>
+          <w:sz w:val="22"/>
+          <w:szCs w:val="22"/>
+        </w:rPr>
+      </w:pPr>
+      <w:r>
+        <w:rPr>
+          <w:b/>
+          <w:bCs/>
+          <w:color w:val="1F1F1F"/>
+          <w:sz w:val="22"/>
+          <w:szCs w:val="22"/>
+        </w:rPr>
+        <w:t>Informes de Avance</w:t>
+      </w:r>
+    </w:p>
+    <w:p>
+      <w:pPr>
+        <w:pBdr>
+          <w:top w:val="nil"/>
+          <w:left w:val="nil"/>
+          <w:bottom w:val="nil"/>
+          <w:right w:val="nil"/>
+          <w:between w:val="nil"/>
+        </w:pBdr>
+        <w:spacing w:before="240" w:after="187" w:line="275" w:lineRule="auto"/>
+        <w:rPr>
+          <w:color w:val="1F1F1F"/>
+        </w:rPr>
+      </w:pPr>
+      <w:r>
+        <w:rPr>
+          <w:color w:val="1F1F1F"/>
+        </w:rPr>
+        <w:t xml:space="preserve">Siguiendo las directrices del contrato, el </w:t>
+      </w:r>
+      <w:proofErr w:type="gramStart"/>
+      <w:r>
+        <w:rPr>
+          <w:color w:val="1F1F1F"/>
+        </w:rPr>
+        <w:t>Jefe</w:t>
+      </w:r>
+      <w:proofErr w:type="gramEnd"/>
+      <w:r>
+        <w:rPr>
+          <w:color w:val="1F1F1F"/>
+        </w:rPr>
+        <w:t xml:space="preserve"> de Proyecto redactó y entregó un informe de estado de manera semanal a la Dirección de Ingresos de la Alcaldía de Sucre.</w:t>
+      </w:r>
+    </w:p>
+    <w:p>
+      <w:pPr>
+        <w:rPr>
+          <w:color w:val="1F1F1F"/>
+        </w:rPr>
+      </w:pPr>
+      <w:r>
+        <w:rPr>
+          <w:color w:val="1F1F1F"/>
+        </w:rPr>
+        <w:t xml:space="preserve">Estos informes cumplieron la función de notificar el avance del desarrollo de los módulos, justificar el uso del dinero y alertar de inmediato sobre los obstáculos encontrados, tales como la renuncia de los dos desarrolladores en el mes 3 y el </w:t>
+      </w:r>
+      <w:r>
+        <w:rPr>
+          <w:color w:val="1F1F1F"/>
+        </w:rPr>
+        <w:lastRenderedPageBreak/>
+        <w:t>retraso en la lógica del sistema provocado por el cambio repentino en las leyes municipales de sanidad en el mes 4. Esto evitó sorpresas de última hora y mantuvo una relación transparente con la Alcaldía.</w:t>
+      </w:r>
+    </w:p>
+    <w:p>
+      <w:pPr>
+        <w:pStyle w:val="Ttulo3"/>
+        <w:spacing w:after="120" w:line="275" w:lineRule="auto"/>
+        <w:rPr>
+          <w:b/>
+          <w:bCs/>
+          <w:color w:val="1F1F1F"/>
+          <w:sz w:val="22"/>
+          <w:szCs w:val="22"/>
+        </w:rPr>
+      </w:pPr>
+      <w:r>
+        <w:rPr>
+          <w:b/>
+          <w:bCs/>
+          <w:color w:val="1F1F1F"/>
+          <w:sz w:val="22"/>
+          <w:szCs w:val="22"/>
+        </w:rPr>
+        <w:t>Tablero de Seguimiento KPI</w:t>
+      </w:r>
+    </w:p>
+    <w:p>
+      <w:pPr>
+        <w:pBdr>
+          <w:top w:val="nil"/>
+          <w:left w:val="nil"/>
+          <w:bottom w:val="nil"/>
+          <w:right w:val="nil"/>
+          <w:between w:val="nil"/>
+        </w:pBdr>
+        <w:spacing w:before="240" w:after="120" w:line="275" w:lineRule="auto"/>
+        <w:rPr>
+          <w:color w:val="1F1F1F"/>
+        </w:rPr>
+      </w:pPr>
+      <w:r>
+        <w:rPr>
+          <w:color w:val="1F1F1F"/>
+        </w:rPr>
+        <w:t>Para controlar el estado real del proyecto, se utilizaron tres indicadores clave de rendimiento (</w:t>
+      </w:r>
+      <w:proofErr w:type="spellStart"/>
+      <w:r>
+        <w:rPr>
+          <w:color w:val="1F1F1F"/>
+        </w:rPr>
+        <w:t>KPIs</w:t>
+      </w:r>
+      <w:proofErr w:type="spellEnd"/>
+      <w:r>
+        <w:rPr>
+          <w:color w:val="1F1F1F"/>
+        </w:rPr>
+        <w:t>), los cuales muestran el impacto de los cambios aplicados:</w:t>
+      </w:r>
+    </w:p>
+    <w:p>
+      <w:pPr>
+        <w:widowControl w:val="0"/>
+        <w:numPr>
+          <w:ilvl w:val="0"/>
+          <w:numId w:val="14"/>
+        </w:numPr>
+        <w:pBdr>
+          <w:top w:val="nil"/>
+          <w:left w:val="nil"/>
+          <w:bottom w:val="nil"/>
+          <w:right w:val="nil"/>
+          <w:between w:val="nil"/>
+        </w:pBdr>
+        <w:spacing w:before="240" w:after="0" w:line="275" w:lineRule="auto"/>
+      </w:pPr>
+      <w:r>
+        <w:rPr>
+          <w:b/>
+          <w:bCs/>
+          <w:color w:val="1F1F1F"/>
+        </w:rPr>
+        <w:t>KPI de Cronograma:</w:t>
+      </w:r>
+      <w:r>
+        <w:rPr>
+          <w:color w:val="1F1F1F"/>
+        </w:rPr>
+        <w:t xml:space="preserve"> Meta de cumplir el 100% de los </w:t>
+      </w:r>
+      <w:proofErr w:type="spellStart"/>
+      <w:r>
+        <w:rPr>
+          <w:color w:val="1F1F1F"/>
+        </w:rPr>
+        <w:t>Sprints</w:t>
+      </w:r>
+      <w:proofErr w:type="spellEnd"/>
+      <w:r>
+        <w:rPr>
+          <w:color w:val="1F1F1F"/>
+        </w:rPr>
+        <w:t xml:space="preserve"> a tiempo. Estado final: </w:t>
+      </w:r>
+      <w:r>
+        <w:rPr>
+          <w:b/>
+          <w:bCs/>
+          <w:color w:val="1F1F1F"/>
+        </w:rPr>
+        <w:t>Ajustado</w:t>
+      </w:r>
+      <w:r>
+        <w:rPr>
+          <w:color w:val="1F1F1F"/>
+        </w:rPr>
+        <w:t>. El cronograma sufrió un desfase de 3 semanas en el mes 5 debido al desarrollo del mapa de geolocalización solicitado fuera de alcance, logrando estabilizarse en el mes 6 con el aumento de horas de desarrollo.</w:t>
+      </w:r>
+    </w:p>
+    <w:p>
+      <w:pPr>
+        <w:widowControl w:val="0"/>
+        <w:numPr>
+          <w:ilvl w:val="0"/>
+          <w:numId w:val="14"/>
+        </w:numPr>
+        <w:pBdr>
+          <w:top w:val="nil"/>
+          <w:left w:val="nil"/>
+          <w:bottom w:val="nil"/>
+          <w:right w:val="nil"/>
+          <w:between w:val="nil"/>
+        </w:pBdr>
+        <w:spacing w:before="240" w:after="0" w:line="275" w:lineRule="auto"/>
+      </w:pPr>
+      <w:r>
+        <w:rPr>
+          <w:b/>
+          <w:bCs/>
+          <w:color w:val="1F1F1F"/>
+        </w:rPr>
+        <w:t>KPI de Presupuesto:</w:t>
+      </w:r>
+      <w:r>
+        <w:rPr>
+          <w:color w:val="1F1F1F"/>
+        </w:rPr>
+        <w:t xml:space="preserve"> Meta de no sobrepasar los 70,000 Bs iniciales. Estado final: </w:t>
+      </w:r>
+      <w:r>
+        <w:rPr>
+          <w:b/>
+          <w:bCs/>
+          <w:color w:val="1F1F1F"/>
+        </w:rPr>
+        <w:t>Dentro del límite</w:t>
+      </w:r>
+      <w:r>
+        <w:rPr>
+          <w:color w:val="1F1F1F"/>
+        </w:rPr>
+        <w:t xml:space="preserve">. Se gastaron exactamente los 70,000 Bs gracias a la redistribución de sueldos hacia el pago de horas extra del equipo restante y uso del fondo de contingencia para las </w:t>
+      </w:r>
+      <w:proofErr w:type="spellStart"/>
+      <w:r>
+        <w:rPr>
+          <w:color w:val="1F1F1F"/>
+        </w:rPr>
+        <w:t>APIs</w:t>
+      </w:r>
+      <w:proofErr w:type="spellEnd"/>
+      <w:r>
+        <w:rPr>
+          <w:color w:val="1F1F1F"/>
+        </w:rPr>
+        <w:t xml:space="preserve"> de mapas.</w:t>
+      </w:r>
+    </w:p>
+    <w:p>
+      <w:pPr>
+        <w:widowControl w:val="0"/>
+        <w:numPr>
+          <w:ilvl w:val="0"/>
+          <w:numId w:val="14"/>
+        </w:numPr>
+        <w:pBdr>
+          <w:top w:val="nil"/>
+          <w:left w:val="nil"/>
+          <w:bottom w:val="nil"/>
+          <w:right w:val="nil"/>
+          <w:between w:val="nil"/>
+        </w:pBdr>
+        <w:spacing w:before="240" w:after="120" w:line="275" w:lineRule="auto"/>
+      </w:pPr>
+      <w:r>
+        <w:rPr>
+          <w:b/>
+          <w:bCs/>
+          <w:color w:val="1F1F1F"/>
+        </w:rPr>
+        <w:t>KPI de Calidad:</w:t>
+      </w:r>
+      <w:r>
+        <w:rPr>
+          <w:color w:val="1F1F1F"/>
+        </w:rPr>
+        <w:t xml:space="preserve"> Meta de registrar menos de 5 errores de programación críticos en la fase de pruebas finales. Estado final: </w:t>
+      </w:r>
+      <w:r>
+        <w:rPr>
+          <w:b/>
+          <w:bCs/>
+          <w:color w:val="1F1F1F"/>
+        </w:rPr>
+        <w:t>Controlado</w:t>
+      </w:r>
+      <w:r>
+        <w:rPr>
+          <w:color w:val="1F1F1F"/>
+        </w:rPr>
+        <w:t>. Las pruebas de caja negra arrojaron solo 2 errores menores que se subsanaron antes de la entrega final.</w:t>
+      </w:r>
+    </w:p>
     <w:p/>
     <w:sectPr>
       <w:pgSz w:w="11906" w:h="16838"/>
@@ -4668,121 +5120,9 @@
     </w:lvl>
   </w:abstractNum>
   <w:abstractNum w:abstractNumId="4" w15:restartNumberingAfterBreak="0">
-    <w:nsid w:val="3AAE717A"/>
-    <w:multiLevelType w:val="hybridMultilevel"/>
-    <w:tmpl w:val="7CCAD1B8"/>
-    <w:lvl w:ilvl="0" w:tplc="400A0001">
-      <w:numFmt w:val="bullet"/>
-      <w:lvlText w:val=""/>
-      <w:lvlJc w:val="left"/>
-      <w:pPr>
-        <w:ind w:left="720" w:hanging="360"/>
-      </w:pPr>
-      <w:rPr>
-        <w:rFonts w:ascii="Symbol" w:eastAsia="Times New Roman" w:hAnsi="Symbol" w:cs="Times New Roman" w:hint="default"/>
-      </w:rPr>
-    </w:lvl>
-    <w:lvl w:ilvl="1" w:tplc="400A0003" w:tentative="1">
-      <w:start w:val="1"/>
-      <w:numFmt w:val="bullet"/>
-      <w:lvlText w:val="o"/>
-      <w:lvlJc w:val="left"/>
-      <w:pPr>
-        <w:ind w:left="1440" w:hanging="360"/>
-      </w:pPr>
-      <w:rPr>
-        <w:rFonts w:ascii="Courier New" w:hAnsi="Courier New" w:cs="Courier New" w:hint="default"/>
-      </w:rPr>
-    </w:lvl>
-    <w:lvl w:ilvl="2" w:tplc="400A0005" w:tentative="1">
-      <w:start w:val="1"/>
-      <w:numFmt w:val="bullet"/>
-      <w:lvlText w:val=""/>
-      <w:lvlJc w:val="left"/>
-      <w:pPr>
-        <w:ind w:left="2160" w:hanging="360"/>
-      </w:pPr>
-      <w:rPr>
-        <w:rFonts w:ascii="Wingdings" w:hAnsi="Wingdings" w:hint="default"/>
-      </w:rPr>
-    </w:lvl>
-    <w:lvl w:ilvl="3" w:tplc="400A0001" w:tentative="1">
-      <w:start w:val="1"/>
-      <w:numFmt w:val="bullet"/>
-      <w:lvlText w:val=""/>
-      <w:lvlJc w:val="left"/>
-      <w:pPr>
-        <w:ind w:left="2880" w:hanging="360"/>
-      </w:pPr>
-      <w:rPr>
-        <w:rFonts w:ascii="Symbol" w:hAnsi="Symbol" w:hint="default"/>
-      </w:rPr>
-    </w:lvl>
-    <w:lvl w:ilvl="4" w:tplc="400A0003" w:tentative="1">
-      <w:start w:val="1"/>
-      <w:numFmt w:val="bullet"/>
-      <w:lvlText w:val="o"/>
-      <w:lvlJc w:val="left"/>
-      <w:pPr>
-        <w:ind w:left="3600" w:hanging="360"/>
-      </w:pPr>
-      <w:rPr>
-        <w:rFonts w:ascii="Courier New" w:hAnsi="Courier New" w:cs="Courier New" w:hint="default"/>
-      </w:rPr>
-    </w:lvl>
-    <w:lvl w:ilvl="5" w:tplc="400A0005" w:tentative="1">
-      <w:start w:val="1"/>
-      <w:numFmt w:val="bullet"/>
-      <w:lvlText w:val=""/>
-      <w:lvlJc w:val="left"/>
-      <w:pPr>
-        <w:ind w:left="4320" w:hanging="360"/>
-      </w:pPr>
-      <w:rPr>
-        <w:rFonts w:ascii="Wingdings" w:hAnsi="Wingdings" w:hint="default"/>
-      </w:rPr>
-    </w:lvl>
-    <w:lvl w:ilvl="6" w:tplc="400A0001" w:tentative="1">
-      <w:start w:val="1"/>
-      <w:numFmt w:val="bullet"/>
-      <w:lvlText w:val=""/>
-      <w:lvlJc w:val="left"/>
-      <w:pPr>
-        <w:ind w:left="5040" w:hanging="360"/>
-      </w:pPr>
-      <w:rPr>
-        <w:rFonts w:ascii="Symbol" w:hAnsi="Symbol" w:hint="default"/>
-      </w:rPr>
-    </w:lvl>
-    <w:lvl w:ilvl="7" w:tplc="400A0003" w:tentative="1">
-      <w:start w:val="1"/>
-      <w:numFmt w:val="bullet"/>
-      <w:lvlText w:val="o"/>
-      <w:lvlJc w:val="left"/>
-      <w:pPr>
-        <w:ind w:left="5760" w:hanging="360"/>
-      </w:pPr>
-      <w:rPr>
-        <w:rFonts w:ascii="Courier New" w:hAnsi="Courier New" w:cs="Courier New" w:hint="default"/>
-      </w:rPr>
-    </w:lvl>
-    <w:lvl w:ilvl="8" w:tplc="400A0005" w:tentative="1">
-      <w:start w:val="1"/>
-      <w:numFmt w:val="bullet"/>
-      <w:lvlText w:val=""/>
-      <w:lvlJc w:val="left"/>
-      <w:pPr>
-        <w:ind w:left="6480" w:hanging="360"/>
-      </w:pPr>
-      <w:rPr>
-        <w:rFonts w:ascii="Wingdings" w:hAnsi="Wingdings" w:hint="default"/>
-      </w:rPr>
-    </w:lvl>
-  </w:abstractNum>
-  <w:abstractNum w:abstractNumId="5" w15:restartNumberingAfterBreak="0">
-    <w:nsid w:val="3D7858A5"/>
+    <w:nsid w:val="196F7BFD"/>
     <w:multiLevelType w:val="multilevel"/>
-    <w:tmpl w:val="C6229DE4"/>
+    <w:tmpl w:val="DC8806CE"/>
     <w:lvl w:ilvl="0">
       <w:start w:val="1"/>
       <w:numFmt w:val="bullet"/>
@@ -5000,159 +5340,10 @@
       </w:rPr>
     </w:lvl>
   </w:abstractNum>
-  <w:abstractNum w:abstractNumId="6" w15:restartNumberingAfterBreak="0">
-    <w:nsid w:val="42B1333A"/>
+  <w:abstractNum w:abstractNumId="5" w15:restartNumberingAfterBreak="0">
+    <w:nsid w:val="308F252C"/>
     <w:multiLevelType w:val="multilevel"/>
-    <w:tmpl w:val="F2CC0728"/>
-    <w:lvl w:ilvl="0">
-      <w:start w:val="1"/>
-      <w:numFmt w:val="bullet"/>
-      <w:lvlText w:val=""/>
-      <w:lvlJc w:val="left"/>
-      <w:pPr>
-        <w:tabs>
-          <w:tab w:val="num" w:pos="720"/>
-        </w:tabs>
-        <w:ind w:left="720" w:hanging="360"/>
-      </w:pPr>
-      <w:rPr>
-        <w:rFonts w:ascii="Symbol" w:hAnsi="Symbol" w:hint="default"/>
-        <w:sz w:val="20"/>
-      </w:rPr>
-    </w:lvl>
-    <w:lvl w:ilvl="1" w:tentative="1">
-      <w:start w:val="1"/>
-      <w:numFmt w:val="bullet"/>
-      <w:lvlText w:val="o"/>
-      <w:lvlJc w:val="left"/>
-      <w:pPr>
-        <w:tabs>
-          <w:tab w:val="num" w:pos="1440"/>
-        </w:tabs>
-        <w:ind w:left="1440" w:hanging="360"/>
-      </w:pPr>
-      <w:rPr>
-        <w:rFonts w:ascii="Courier New" w:hAnsi="Courier New" w:hint="default"/>
-        <w:sz w:val="20"/>
-      </w:rPr>
-    </w:lvl>
-    <w:lvl w:ilvl="2" w:tentative="1">
-      <w:start w:val="1"/>
-      <w:numFmt w:val="bullet"/>
-      <w:lvlText w:val=""/>
-      <w:lvlJc w:val="left"/>
-      <w:pPr>
-        <w:tabs>
-          <w:tab w:val="num" w:pos="2160"/>
-        </w:tabs>
-        <w:ind w:left="2160" w:hanging="360"/>
-      </w:pPr>
-      <w:rPr>
-        <w:rFonts w:ascii="Wingdings" w:hAnsi="Wingdings" w:hint="default"/>
-        <w:sz w:val="20"/>
-      </w:rPr>
-    </w:lvl>
-    <w:lvl w:ilvl="3" w:tentative="1">
-      <w:start w:val="1"/>
-      <w:numFmt w:val="bullet"/>
-      <w:lvlText w:val=""/>
-      <w:lvlJc w:val="left"/>
-      <w:pPr>
-        <w:tabs>
-          <w:tab w:val="num" w:pos="2880"/>
-        </w:tabs>
-        <w:ind w:left="2880" w:hanging="360"/>
-      </w:pPr>
-      <w:rPr>
-        <w:rFonts w:ascii="Wingdings" w:hAnsi="Wingdings" w:hint="default"/>
-        <w:sz w:val="20"/>
-      </w:rPr>
-    </w:lvl>
-    <w:lvl w:ilvl="4" w:tentative="1">
-      <w:start w:val="1"/>
-      <w:numFmt w:val="bullet"/>
-      <w:lvlText w:val=""/>
-      <w:lvlJc w:val="left"/>
-      <w:pPr>
-        <w:tabs>
-          <w:tab w:val="num" w:pos="3600"/>
-        </w:tabs>
-        <w:ind w:left="3600" w:hanging="360"/>
-      </w:pPr>
-      <w:rPr>
-        <w:rFonts w:ascii="Wingdings" w:hAnsi="Wingdings" w:hint="default"/>
-        <w:sz w:val="20"/>
-      </w:rPr>
-    </w:lvl>
-    <w:lvl w:ilvl="5" w:tentative="1">
-      <w:start w:val="1"/>
-      <w:numFmt w:val="bullet"/>
-      <w:lvlText w:val=""/>
-      <w:lvlJc w:val="left"/>
-      <w:pPr>
-        <w:tabs>
-          <w:tab w:val="num" w:pos="4320"/>
-        </w:tabs>
-        <w:ind w:left="4320" w:hanging="360"/>
-      </w:pPr>
-      <w:rPr>
-        <w:rFonts w:ascii="Wingdings" w:hAnsi="Wingdings" w:hint="default"/>
-        <w:sz w:val="20"/>
-      </w:rPr>
-    </w:lvl>
-    <w:lvl w:ilvl="6" w:tentative="1">
-      <w:start w:val="1"/>
-      <w:numFmt w:val="bullet"/>
-      <w:lvlText w:val=""/>
-      <w:lvlJc w:val="left"/>
-      <w:pPr>
-        <w:tabs>
-          <w:tab w:val="num" w:pos="5040"/>
-        </w:tabs>
-        <w:ind w:left="5040" w:hanging="360"/>
-      </w:pPr>
-      <w:rPr>
-        <w:rFonts w:ascii="Wingdings" w:hAnsi="Wingdings" w:hint="default"/>
-        <w:sz w:val="20"/>
-      </w:rPr>
-    </w:lvl>
-    <w:lvl w:ilvl="7" w:tentative="1">
-      <w:start w:val="1"/>
-      <w:numFmt w:val="bullet"/>
-      <w:lvlText w:val=""/>
-      <w:lvlJc w:val="left"/>
-      <w:pPr>
-        <w:tabs>
-          <w:tab w:val="num" w:pos="5760"/>
-        </w:tabs>
-        <w:ind w:left="5760" w:hanging="360"/>
-      </w:pPr>
-      <w:rPr>
-        <w:rFonts w:ascii="Wingdings" w:hAnsi="Wingdings" w:hint="default"/>
-        <w:sz w:val="20"/>
-      </w:rPr>
-    </w:lvl>
-    <w:lvl w:ilvl="8" w:tentative="1">
-      <w:start w:val="1"/>
-      <w:numFmt w:val="bullet"/>
-      <w:lvlText w:val=""/>
-      <w:lvlJc w:val="left"/>
-      <w:pPr>
-        <w:tabs>
-          <w:tab w:val="num" w:pos="6480"/>
-        </w:tabs>
-        <w:ind w:left="6480" w:hanging="360"/>
-      </w:pPr>
-      <w:rPr>
-        <w:rFonts w:ascii="Wingdings" w:hAnsi="Wingdings" w:hint="default"/>
-        <w:sz w:val="20"/>
-      </w:rPr>
-    </w:lvl>
-  </w:abstractNum>
-  <w:abstractNum w:abstractNumId="7" w15:restartNumberingAfterBreak="0">
-    <w:nsid w:val="43BF3054"/>
-    <w:multiLevelType w:val="multilevel"/>
-    <w:tmpl w:val="A6BA997A"/>
+    <w:tmpl w:val="61766410"/>
     <w:lvl w:ilvl="0">
       <w:start w:val="1"/>
       <w:numFmt w:val="bullet"/>
@@ -5370,272 +5561,122 @@
       </w:rPr>
     </w:lvl>
   </w:abstractNum>
-  <w:abstractNum w:abstractNumId="8" w15:restartNumberingAfterBreak="0">
-    <w:nsid w:val="5933549B"/>
+  <w:abstractNum w:abstractNumId="6" w15:restartNumberingAfterBreak="0">
+    <w:nsid w:val="3AAE717A"/>
+    <w:multiLevelType w:val="hybridMultilevel"/>
+    <w:tmpl w:val="7CCAD1B8"/>
+    <w:lvl w:ilvl="0" w:tplc="400A0001">
+      <w:numFmt w:val="bullet"/>
+      <w:lvlText w:val=""/>
+      <w:lvlJc w:val="left"/>
+      <w:pPr>
+        <w:ind w:left="720" w:hanging="360"/>
+      </w:pPr>
+      <w:rPr>
+        <w:rFonts w:ascii="Symbol" w:eastAsia="Times New Roman" w:hAnsi="Symbol" w:cs="Times New Roman" w:hint="default"/>
+      </w:rPr>
+    </w:lvl>
+    <w:lvl w:ilvl="1" w:tplc="400A0003" w:tentative="1">
+      <w:start w:val="1"/>
+      <w:numFmt w:val="bullet"/>
+      <w:lvlText w:val="o"/>
+      <w:lvlJc w:val="left"/>
+      <w:pPr>
+        <w:ind w:left="1440" w:hanging="360"/>
+      </w:pPr>
+      <w:rPr>
+        <w:rFonts w:ascii="Courier New" w:hAnsi="Courier New" w:cs="Courier New" w:hint="default"/>
+      </w:rPr>
+    </w:lvl>
+    <w:lvl w:ilvl="2" w:tplc="400A0005" w:tentative="1">
+      <w:start w:val="1"/>
+      <w:numFmt w:val="bullet"/>
+      <w:lvlText w:val=""/>
+      <w:lvlJc w:val="left"/>
+      <w:pPr>
+        <w:ind w:left="2160" w:hanging="360"/>
+      </w:pPr>
+      <w:rPr>
+        <w:rFonts w:ascii="Wingdings" w:hAnsi="Wingdings" w:hint="default"/>
+      </w:rPr>
+    </w:lvl>
+    <w:lvl w:ilvl="3" w:tplc="400A0001" w:tentative="1">
+      <w:start w:val="1"/>
+      <w:numFmt w:val="bullet"/>
+      <w:lvlText w:val=""/>
+      <w:lvlJc w:val="left"/>
+      <w:pPr>
+        <w:ind w:left="2880" w:hanging="360"/>
+      </w:pPr>
+      <w:rPr>
+        <w:rFonts w:ascii="Symbol" w:hAnsi="Symbol" w:hint="default"/>
+      </w:rPr>
+    </w:lvl>
+    <w:lvl w:ilvl="4" w:tplc="400A0003" w:tentative="1">
+      <w:start w:val="1"/>
+      <w:numFmt w:val="bullet"/>
+      <w:lvlText w:val="o"/>
+      <w:lvlJc w:val="left"/>
+      <w:pPr>
+        <w:ind w:left="3600" w:hanging="360"/>
+      </w:pPr>
+      <w:rPr>
+        <w:rFonts w:ascii="Courier New" w:hAnsi="Courier New" w:cs="Courier New" w:hint="default"/>
+      </w:rPr>
+    </w:lvl>
+    <w:lvl w:ilvl="5" w:tplc="400A0005" w:tentative="1">
+      <w:start w:val="1"/>
+      <w:numFmt w:val="bullet"/>
+      <w:lvlText w:val=""/>
+      <w:lvlJc w:val="left"/>
+      <w:pPr>
+        <w:ind w:left="4320" w:hanging="360"/>
+      </w:pPr>
+      <w:rPr>
+        <w:rFonts w:ascii="Wingdings" w:hAnsi="Wingdings" w:hint="default"/>
+      </w:rPr>
+    </w:lvl>
+    <w:lvl w:ilvl="6" w:tplc="400A0001" w:tentative="1">
+      <w:start w:val="1"/>
+      <w:numFmt w:val="bullet"/>
+      <w:lvlText w:val=""/>
+      <w:lvlJc w:val="left"/>
+      <w:pPr>
+        <w:ind w:left="5040" w:hanging="360"/>
+      </w:pPr>
+      <w:rPr>
+        <w:rFonts w:ascii="Symbol" w:hAnsi="Symbol" w:hint="default"/>
+      </w:rPr>
+    </w:lvl>
+    <w:lvl w:ilvl="7" w:tplc="400A0003" w:tentative="1">
+      <w:start w:val="1"/>
+      <w:numFmt w:val="bullet"/>
+      <w:lvlText w:val="o"/>
+      <w:lvlJc w:val="left"/>
+      <w:pPr>
+        <w:ind w:left="5760" w:hanging="360"/>
+      </w:pPr>
+      <w:rPr>
+        <w:rFonts w:ascii="Courier New" w:hAnsi="Courier New" w:cs="Courier New" w:hint="default"/>
+      </w:rPr>
+    </w:lvl>
+    <w:lvl w:ilvl="8" w:tplc="400A0005" w:tentative="1">
+      <w:start w:val="1"/>
+      <w:numFmt w:val="bullet"/>
+      <w:lvlText w:val=""/>
+      <w:lvlJc w:val="left"/>
+      <w:pPr>
+        <w:ind w:left="6480" w:hanging="360"/>
+      </w:pPr>
+      <w:rPr>
+        <w:rFonts w:ascii="Wingdings" w:hAnsi="Wingdings" w:hint="default"/>
+      </w:rPr>
+    </w:lvl>
+  </w:abstractNum>
+  <w:abstractNum w:abstractNumId="7" w15:restartNumberingAfterBreak="0">
+    <w:nsid w:val="3D7858A5"/>
     <w:multiLevelType w:val="multilevel"/>
-    <w:tmpl w:val="FAF64B00"/>
-    <w:lvl w:ilvl="0">
-      <w:start w:val="1"/>
-      <w:numFmt w:val="bullet"/>
-      <w:lvlText w:val=""/>
-      <w:lvlJc w:val="left"/>
-      <w:pPr>
-        <w:tabs>
-          <w:tab w:val="num" w:pos="720"/>
-        </w:tabs>
-        <w:ind w:left="720" w:hanging="360"/>
-      </w:pPr>
-      <w:rPr>
-        <w:rFonts w:ascii="Symbol" w:hAnsi="Symbol" w:hint="default"/>
-        <w:sz w:val="20"/>
-      </w:rPr>
-    </w:lvl>
-    <w:lvl w:ilvl="1" w:tentative="1">
-      <w:start w:val="1"/>
-      <w:numFmt w:val="bullet"/>
-      <w:lvlText w:val="o"/>
-      <w:lvlJc w:val="left"/>
-      <w:pPr>
-        <w:tabs>
-          <w:tab w:val="num" w:pos="1440"/>
-        </w:tabs>
-        <w:ind w:left="1440" w:hanging="360"/>
-      </w:pPr>
-      <w:rPr>
-        <w:rFonts w:ascii="Courier New" w:hAnsi="Courier New" w:hint="default"/>
-        <w:sz w:val="20"/>
-      </w:rPr>
-    </w:lvl>
-    <w:lvl w:ilvl="2" w:tentative="1">
-      <w:start w:val="1"/>
-      <w:numFmt w:val="bullet"/>
-      <w:lvlText w:val=""/>
-      <w:lvlJc w:val="left"/>
-      <w:pPr>
-        <w:tabs>
-          <w:tab w:val="num" w:pos="2160"/>
-        </w:tabs>
-        <w:ind w:left="2160" w:hanging="360"/>
-      </w:pPr>
-      <w:rPr>
-        <w:rFonts w:ascii="Wingdings" w:hAnsi="Wingdings" w:hint="default"/>
-        <w:sz w:val="20"/>
-      </w:rPr>
-    </w:lvl>
-    <w:lvl w:ilvl="3" w:tentative="1">
-      <w:start w:val="1"/>
-      <w:numFmt w:val="bullet"/>
-      <w:lvlText w:val=""/>
-      <w:lvlJc w:val="left"/>
-      <w:pPr>
-        <w:tabs>
-          <w:tab w:val="num" w:pos="2880"/>
-        </w:tabs>
-        <w:ind w:left="2880" w:hanging="360"/>
-      </w:pPr>
-      <w:rPr>
-        <w:rFonts w:ascii="Wingdings" w:hAnsi="Wingdings" w:hint="default"/>
-        <w:sz w:val="20"/>
-      </w:rPr>
-    </w:lvl>
-    <w:lvl w:ilvl="4" w:tentative="1">
-      <w:start w:val="1"/>
-      <w:numFmt w:val="bullet"/>
-      <w:lvlText w:val=""/>
-      <w:lvlJc w:val="left"/>
-      <w:pPr>
-        <w:tabs>
-          <w:tab w:val="num" w:pos="3600"/>
-        </w:tabs>
-        <w:ind w:left="3600" w:hanging="360"/>
-      </w:pPr>
-      <w:rPr>
-        <w:rFonts w:ascii="Wingdings" w:hAnsi="Wingdings" w:hint="default"/>
-        <w:sz w:val="20"/>
-      </w:rPr>
-    </w:lvl>
-    <w:lvl w:ilvl="5" w:tentative="1">
-      <w:start w:val="1"/>
-      <w:numFmt w:val="bullet"/>
-      <w:lvlText w:val=""/>
-      <w:lvlJc w:val="left"/>
-      <w:pPr>
-        <w:tabs>
-          <w:tab w:val="num" w:pos="4320"/>
-        </w:tabs>
-        <w:ind w:left="4320" w:hanging="360"/>
-      </w:pPr>
-      <w:rPr>
-        <w:rFonts w:ascii="Wingdings" w:hAnsi="Wingdings" w:hint="default"/>
-        <w:sz w:val="20"/>
-      </w:rPr>
-    </w:lvl>
-    <w:lvl w:ilvl="6" w:tentative="1">
-      <w:start w:val="1"/>
-      <w:numFmt w:val="bullet"/>
-      <w:lvlText w:val=""/>
-      <w:lvlJc w:val="left"/>
-      <w:pPr>
-        <w:tabs>
-          <w:tab w:val="num" w:pos="5040"/>
-        </w:tabs>
-        <w:ind w:left="5040" w:hanging="360"/>
-      </w:pPr>
-      <w:rPr>
-        <w:rFonts w:ascii="Wingdings" w:hAnsi="Wingdings" w:hint="default"/>
-        <w:sz w:val="20"/>
-      </w:rPr>
-    </w:lvl>
-    <w:lvl w:ilvl="7" w:tentative="1">
-      <w:start w:val="1"/>
-      <w:numFmt w:val="bullet"/>
-      <w:lvlText w:val=""/>
-      <w:lvlJc w:val="left"/>
-      <w:pPr>
-        <w:tabs>
-          <w:tab w:val="num" w:pos="5760"/>
-        </w:tabs>
-        <w:ind w:left="5760" w:hanging="360"/>
-      </w:pPr>
-      <w:rPr>
-        <w:rFonts w:ascii="Wingdings" w:hAnsi="Wingdings" w:hint="default"/>
-        <w:sz w:val="20"/>
-      </w:rPr>
-    </w:lvl>
-    <w:lvl w:ilvl="8" w:tentative="1">
-      <w:start w:val="1"/>
-      <w:numFmt w:val="bullet"/>
-      <w:lvlText w:val=""/>
-      <w:lvlJc w:val="left"/>
-      <w:pPr>
-        <w:tabs>
-          <w:tab w:val="num" w:pos="6480"/>
-        </w:tabs>
-        <w:ind w:left="6480" w:hanging="360"/>
-      </w:pPr>
-      <w:rPr>
-        <w:rFonts w:ascii="Wingdings" w:hAnsi="Wingdings" w:hint="default"/>
-        <w:sz w:val="20"/>
-      </w:rPr>
-    </w:lvl>
-  </w:abstractNum>
-  <w:abstractNum w:abstractNumId="9" w15:restartNumberingAfterBreak="0">
-    <w:nsid w:val="70646CBA"/>
-    <w:multiLevelType w:val="hybridMultilevel"/>
-    <w:tmpl w:val="BC9C5C7A"/>
-    <w:lvl w:ilvl="0" w:tplc="400A0001">
-      <w:start w:val="1"/>
-      <w:numFmt w:val="bullet"/>
-      <w:lvlText w:val=""/>
-      <w:lvlJc w:val="left"/>
-      <w:pPr>
-        <w:ind w:left="720" w:hanging="360"/>
-      </w:pPr>
-      <w:rPr>
-        <w:rFonts w:ascii="Symbol" w:hAnsi="Symbol" w:hint="default"/>
-      </w:rPr>
-    </w:lvl>
-    <w:lvl w:ilvl="1" w:tplc="400A0003" w:tentative="1">
-      <w:start w:val="1"/>
-      <w:numFmt w:val="bullet"/>
-      <w:lvlText w:val="o"/>
-      <w:lvlJc w:val="left"/>
-      <w:pPr>
-        <w:ind w:left="1440" w:hanging="360"/>
-      </w:pPr>
-      <w:rPr>
-        <w:rFonts w:ascii="Courier New" w:hAnsi="Courier New" w:cs="Courier New" w:hint="default"/>
-      </w:rPr>
-    </w:lvl>
-    <w:lvl w:ilvl="2" w:tplc="400A0005" w:tentative="1">
-      <w:start w:val="1"/>
-      <w:numFmt w:val="bullet"/>
-      <w:lvlText w:val=""/>
-      <w:lvlJc w:val="left"/>
-      <w:pPr>
-        <w:ind w:left="2160" w:hanging="360"/>
-      </w:pPr>
-      <w:rPr>
-        <w:rFonts w:ascii="Wingdings" w:hAnsi="Wingdings" w:hint="default"/>
-      </w:rPr>
-    </w:lvl>
-    <w:lvl w:ilvl="3" w:tplc="400A0001" w:tentative="1">
-      <w:start w:val="1"/>
-      <w:numFmt w:val="bullet"/>
-      <w:lvlText w:val=""/>
-      <w:lvlJc w:val="left"/>
-      <w:pPr>
-        <w:ind w:left="2880" w:hanging="360"/>
-      </w:pPr>
-      <w:rPr>
-        <w:rFonts w:ascii="Symbol" w:hAnsi="Symbol" w:hint="default"/>
-      </w:rPr>
-    </w:lvl>
-    <w:lvl w:ilvl="4" w:tplc="400A0003" w:tentative="1">
-      <w:start w:val="1"/>
-      <w:numFmt w:val="bullet"/>
-      <w:lvlText w:val="o"/>
-      <w:lvlJc w:val="left"/>
-      <w:pPr>
-        <w:ind w:left="3600" w:hanging="360"/>
-      </w:pPr>
-      <w:rPr>
-        <w:rFonts w:ascii="Courier New" w:hAnsi="Courier New" w:cs="Courier New" w:hint="default"/>
-      </w:rPr>
-    </w:lvl>
-    <w:lvl w:ilvl="5" w:tplc="400A0005" w:tentative="1">
-      <w:start w:val="1"/>
-      <w:numFmt w:val="bullet"/>
-      <w:lvlText w:val=""/>
-      <w:lvlJc w:val="left"/>
-      <w:pPr>
-        <w:ind w:left="4320" w:hanging="360"/>
-      </w:pPr>
-      <w:rPr>
-        <w:rFonts w:ascii="Wingdings" w:hAnsi="Wingdings" w:hint="default"/>
-      </w:rPr>
-    </w:lvl>
-    <w:lvl w:ilvl="6" w:tplc="400A0001" w:tentative="1">
-      <w:start w:val="1"/>
-      <w:numFmt w:val="bullet"/>
-      <w:lvlText w:val=""/>
-      <w:lvlJc w:val="left"/>
-      <w:pPr>
-        <w:ind w:left="5040" w:hanging="360"/>
-      </w:pPr>
-      <w:rPr>
-        <w:rFonts w:ascii="Symbol" w:hAnsi="Symbol" w:hint="default"/>
-      </w:rPr>
-    </w:lvl>
-    <w:lvl w:ilvl="7" w:tplc="400A0003" w:tentative="1">
-      <w:start w:val="1"/>
-      <w:numFmt w:val="bullet"/>
-      <w:lvlText w:val="o"/>
-      <w:lvlJc w:val="left"/>
-      <w:pPr>
-        <w:ind w:left="5760" w:hanging="360"/>
-      </w:pPr>
-      <w:rPr>
-        <w:rFonts w:ascii="Courier New" w:hAnsi="Courier New" w:cs="Courier New" w:hint="default"/>
-      </w:rPr>
-    </w:lvl>
-    <w:lvl w:ilvl="8" w:tplc="400A0005" w:tentative="1">
-      <w:start w:val="1"/>
-      <w:numFmt w:val="bullet"/>
-      <w:lvlText w:val=""/>
-      <w:lvlJc w:val="left"/>
-      <w:pPr>
-        <w:ind w:left="6480" w:hanging="360"/>
-      </w:pPr>
-      <w:rPr>
-        <w:rFonts w:ascii="Wingdings" w:hAnsi="Wingdings" w:hint="default"/>
-      </w:rPr>
-    </w:lvl>
-  </w:abstractNum>
-  <w:abstractNum w:abstractNumId="10" w15:restartNumberingAfterBreak="0">
-    <w:nsid w:val="79586CD1"/>
-    <w:multiLevelType w:val="multilevel"/>
-    <w:tmpl w:val="B99AE416"/>
+    <w:tmpl w:val="C6229DE4"/>
     <w:lvl w:ilvl="0">
       <w:start w:val="1"/>
       <w:numFmt w:val="bullet"/>
@@ -5853,7 +5894,860 @@
       </w:rPr>
     </w:lvl>
   </w:abstractNum>
+  <w:abstractNum w:abstractNumId="8" w15:restartNumberingAfterBreak="0">
+    <w:nsid w:val="42B1333A"/>
+    <w:multiLevelType w:val="multilevel"/>
+    <w:tmpl w:val="F2CC0728"/>
+    <w:lvl w:ilvl="0">
+      <w:start w:val="1"/>
+      <w:numFmt w:val="bullet"/>
+      <w:lvlText w:val=""/>
+      <w:lvlJc w:val="left"/>
+      <w:pPr>
+        <w:tabs>
+          <w:tab w:val="num" w:pos="720"/>
+        </w:tabs>
+        <w:ind w:left="720" w:hanging="360"/>
+      </w:pPr>
+      <w:rPr>
+        <w:rFonts w:ascii="Symbol" w:hAnsi="Symbol" w:hint="default"/>
+        <w:sz w:val="20"/>
+      </w:rPr>
+    </w:lvl>
+    <w:lvl w:ilvl="1" w:tentative="1">
+      <w:start w:val="1"/>
+      <w:numFmt w:val="bullet"/>
+      <w:lvlText w:val="o"/>
+      <w:lvlJc w:val="left"/>
+      <w:pPr>
+        <w:tabs>
+          <w:tab w:val="num" w:pos="1440"/>
+        </w:tabs>
+        <w:ind w:left="1440" w:hanging="360"/>
+      </w:pPr>
+      <w:rPr>
+        <w:rFonts w:ascii="Courier New" w:hAnsi="Courier New" w:hint="default"/>
+        <w:sz w:val="20"/>
+      </w:rPr>
+    </w:lvl>
+    <w:lvl w:ilvl="2" w:tentative="1">
+      <w:start w:val="1"/>
+      <w:numFmt w:val="bullet"/>
+      <w:lvlText w:val=""/>
+      <w:lvlJc w:val="left"/>
+      <w:pPr>
+        <w:tabs>
+          <w:tab w:val="num" w:pos="2160"/>
+        </w:tabs>
+        <w:ind w:left="2160" w:hanging="360"/>
+      </w:pPr>
+      <w:rPr>
+        <w:rFonts w:ascii="Wingdings" w:hAnsi="Wingdings" w:hint="default"/>
+        <w:sz w:val="20"/>
+      </w:rPr>
+    </w:lvl>
+    <w:lvl w:ilvl="3" w:tentative="1">
+      <w:start w:val="1"/>
+      <w:numFmt w:val="bullet"/>
+      <w:lvlText w:val=""/>
+      <w:lvlJc w:val="left"/>
+      <w:pPr>
+        <w:tabs>
+          <w:tab w:val="num" w:pos="2880"/>
+        </w:tabs>
+        <w:ind w:left="2880" w:hanging="360"/>
+      </w:pPr>
+      <w:rPr>
+        <w:rFonts w:ascii="Wingdings" w:hAnsi="Wingdings" w:hint="default"/>
+        <w:sz w:val="20"/>
+      </w:rPr>
+    </w:lvl>
+    <w:lvl w:ilvl="4" w:tentative="1">
+      <w:start w:val="1"/>
+      <w:numFmt w:val="bullet"/>
+      <w:lvlText w:val=""/>
+      <w:lvlJc w:val="left"/>
+      <w:pPr>
+        <w:tabs>
+          <w:tab w:val="num" w:pos="3600"/>
+        </w:tabs>
+        <w:ind w:left="3600" w:hanging="360"/>
+      </w:pPr>
+      <w:rPr>
+        <w:rFonts w:ascii="Wingdings" w:hAnsi="Wingdings" w:hint="default"/>
+        <w:sz w:val="20"/>
+      </w:rPr>
+    </w:lvl>
+    <w:lvl w:ilvl="5" w:tentative="1">
+      <w:start w:val="1"/>
+      <w:numFmt w:val="bullet"/>
+      <w:lvlText w:val=""/>
+      <w:lvlJc w:val="left"/>
+      <w:pPr>
+        <w:tabs>
+          <w:tab w:val="num" w:pos="4320"/>
+        </w:tabs>
+        <w:ind w:left="4320" w:hanging="360"/>
+      </w:pPr>
+      <w:rPr>
+        <w:rFonts w:ascii="Wingdings" w:hAnsi="Wingdings" w:hint="default"/>
+        <w:sz w:val="20"/>
+      </w:rPr>
+    </w:lvl>
+    <w:lvl w:ilvl="6" w:tentative="1">
+      <w:start w:val="1"/>
+      <w:numFmt w:val="bullet"/>
+      <w:lvlText w:val=""/>
+      <w:lvlJc w:val="left"/>
+      <w:pPr>
+        <w:tabs>
+          <w:tab w:val="num" w:pos="5040"/>
+        </w:tabs>
+        <w:ind w:left="5040" w:hanging="360"/>
+      </w:pPr>
+      <w:rPr>
+        <w:rFonts w:ascii="Wingdings" w:hAnsi="Wingdings" w:hint="default"/>
+        <w:sz w:val="20"/>
+      </w:rPr>
+    </w:lvl>
+    <w:lvl w:ilvl="7" w:tentative="1">
+      <w:start w:val="1"/>
+      <w:numFmt w:val="bullet"/>
+      <w:lvlText w:val=""/>
+      <w:lvlJc w:val="left"/>
+      <w:pPr>
+        <w:tabs>
+          <w:tab w:val="num" w:pos="5760"/>
+        </w:tabs>
+        <w:ind w:left="5760" w:hanging="360"/>
+      </w:pPr>
+      <w:rPr>
+        <w:rFonts w:ascii="Wingdings" w:hAnsi="Wingdings" w:hint="default"/>
+        <w:sz w:val="20"/>
+      </w:rPr>
+    </w:lvl>
+    <w:lvl w:ilvl="8" w:tentative="1">
+      <w:start w:val="1"/>
+      <w:numFmt w:val="bullet"/>
+      <w:lvlText w:val=""/>
+      <w:lvlJc w:val="left"/>
+      <w:pPr>
+        <w:tabs>
+          <w:tab w:val="num" w:pos="6480"/>
+        </w:tabs>
+        <w:ind w:left="6480" w:hanging="360"/>
+      </w:pPr>
+      <w:rPr>
+        <w:rFonts w:ascii="Wingdings" w:hAnsi="Wingdings" w:hint="default"/>
+        <w:sz w:val="20"/>
+      </w:rPr>
+    </w:lvl>
+  </w:abstractNum>
+  <w:abstractNum w:abstractNumId="9" w15:restartNumberingAfterBreak="0">
+    <w:nsid w:val="43BF3054"/>
+    <w:multiLevelType w:val="multilevel"/>
+    <w:tmpl w:val="A6BA997A"/>
+    <w:lvl w:ilvl="0">
+      <w:start w:val="1"/>
+      <w:numFmt w:val="bullet"/>
+      <w:lvlText w:val="●"/>
+      <w:lvlJc w:val="left"/>
+      <w:pPr>
+        <w:ind w:left="465" w:hanging="360"/>
+      </w:pPr>
+      <w:rPr>
+        <w:rFonts w:ascii="Arial" w:eastAsia="Arial" w:hAnsi="Arial" w:cs="Arial"/>
+        <w:b w:val="0"/>
+        <w:bCs w:val="0"/>
+        <w:i w:val="0"/>
+        <w:iCs w:val="0"/>
+        <w:smallCaps w:val="0"/>
+        <w:strike w:val="0"/>
+        <w:color w:val="000000"/>
+        <w:sz w:val="22"/>
+        <w:szCs w:val="22"/>
+        <w:u w:val="none"/>
+        <w:shd w:val="clear" w:color="auto" w:fill="auto"/>
+        <w:vertAlign w:val="baseline"/>
+      </w:rPr>
+    </w:lvl>
+    <w:lvl w:ilvl="1">
+      <w:start w:val="1"/>
+      <w:numFmt w:val="bullet"/>
+      <w:lvlText w:val="○"/>
+      <w:lvlJc w:val="left"/>
+      <w:pPr>
+        <w:ind w:left="1440" w:hanging="360"/>
+      </w:pPr>
+      <w:rPr>
+        <w:rFonts w:ascii="Arial" w:eastAsia="Arial" w:hAnsi="Arial" w:cs="Arial"/>
+        <w:b w:val="0"/>
+        <w:bCs w:val="0"/>
+        <w:i w:val="0"/>
+        <w:iCs w:val="0"/>
+        <w:smallCaps w:val="0"/>
+        <w:strike w:val="0"/>
+        <w:color w:val="000000"/>
+        <w:sz w:val="22"/>
+        <w:szCs w:val="22"/>
+        <w:u w:val="none"/>
+        <w:shd w:val="clear" w:color="auto" w:fill="auto"/>
+        <w:vertAlign w:val="baseline"/>
+      </w:rPr>
+    </w:lvl>
+    <w:lvl w:ilvl="2">
+      <w:start w:val="1"/>
+      <w:numFmt w:val="bullet"/>
+      <w:lvlText w:val="■"/>
+      <w:lvlJc w:val="left"/>
+      <w:pPr>
+        <w:ind w:left="2160" w:hanging="360"/>
+      </w:pPr>
+      <w:rPr>
+        <w:rFonts w:ascii="Arial" w:eastAsia="Arial" w:hAnsi="Arial" w:cs="Arial"/>
+        <w:b w:val="0"/>
+        <w:bCs w:val="0"/>
+        <w:i w:val="0"/>
+        <w:iCs w:val="0"/>
+        <w:smallCaps w:val="0"/>
+        <w:strike w:val="0"/>
+        <w:color w:val="000000"/>
+        <w:sz w:val="22"/>
+        <w:szCs w:val="22"/>
+        <w:u w:val="none"/>
+        <w:shd w:val="clear" w:color="auto" w:fill="auto"/>
+        <w:vertAlign w:val="baseline"/>
+      </w:rPr>
+    </w:lvl>
+    <w:lvl w:ilvl="3">
+      <w:start w:val="1"/>
+      <w:numFmt w:val="bullet"/>
+      <w:lvlText w:val="■"/>
+      <w:lvlJc w:val="left"/>
+      <w:pPr>
+        <w:ind w:left="2880" w:hanging="360"/>
+      </w:pPr>
+      <w:rPr>
+        <w:rFonts w:ascii="Arial" w:eastAsia="Arial" w:hAnsi="Arial" w:cs="Arial"/>
+        <w:b w:val="0"/>
+        <w:bCs w:val="0"/>
+        <w:i w:val="0"/>
+        <w:iCs w:val="0"/>
+        <w:smallCaps w:val="0"/>
+        <w:strike w:val="0"/>
+        <w:color w:val="000000"/>
+        <w:sz w:val="22"/>
+        <w:szCs w:val="22"/>
+        <w:u w:val="none"/>
+        <w:shd w:val="clear" w:color="auto" w:fill="auto"/>
+        <w:vertAlign w:val="baseline"/>
+      </w:rPr>
+    </w:lvl>
+    <w:lvl w:ilvl="4">
+      <w:start w:val="1"/>
+      <w:numFmt w:val="bullet"/>
+      <w:lvlText w:val="■"/>
+      <w:lvlJc w:val="left"/>
+      <w:pPr>
+        <w:ind w:left="3600" w:hanging="360"/>
+      </w:pPr>
+      <w:rPr>
+        <w:rFonts w:ascii="Arial" w:eastAsia="Arial" w:hAnsi="Arial" w:cs="Arial"/>
+        <w:b w:val="0"/>
+        <w:bCs w:val="0"/>
+        <w:i w:val="0"/>
+        <w:iCs w:val="0"/>
+        <w:smallCaps w:val="0"/>
+        <w:strike w:val="0"/>
+        <w:color w:val="000000"/>
+        <w:sz w:val="22"/>
+        <w:szCs w:val="22"/>
+        <w:u w:val="none"/>
+        <w:shd w:val="clear" w:color="auto" w:fill="auto"/>
+        <w:vertAlign w:val="baseline"/>
+      </w:rPr>
+    </w:lvl>
+    <w:lvl w:ilvl="5">
+      <w:start w:val="1"/>
+      <w:numFmt w:val="bullet"/>
+      <w:lvlText w:val="■"/>
+      <w:lvlJc w:val="left"/>
+      <w:pPr>
+        <w:ind w:left="4320" w:hanging="360"/>
+      </w:pPr>
+      <w:rPr>
+        <w:rFonts w:ascii="Arial" w:eastAsia="Arial" w:hAnsi="Arial" w:cs="Arial"/>
+        <w:b w:val="0"/>
+        <w:bCs w:val="0"/>
+        <w:i w:val="0"/>
+        <w:iCs w:val="0"/>
+        <w:smallCaps w:val="0"/>
+        <w:strike w:val="0"/>
+        <w:color w:val="000000"/>
+        <w:sz w:val="22"/>
+        <w:szCs w:val="22"/>
+        <w:u w:val="none"/>
+        <w:shd w:val="clear" w:color="auto" w:fill="auto"/>
+        <w:vertAlign w:val="baseline"/>
+      </w:rPr>
+    </w:lvl>
+    <w:lvl w:ilvl="6">
+      <w:start w:val="1"/>
+      <w:numFmt w:val="bullet"/>
+      <w:lvlText w:val="■"/>
+      <w:lvlJc w:val="left"/>
+      <w:pPr>
+        <w:ind w:left="5040" w:hanging="360"/>
+      </w:pPr>
+      <w:rPr>
+        <w:rFonts w:ascii="Arial" w:eastAsia="Arial" w:hAnsi="Arial" w:cs="Arial"/>
+        <w:b w:val="0"/>
+        <w:bCs w:val="0"/>
+        <w:i w:val="0"/>
+        <w:iCs w:val="0"/>
+        <w:smallCaps w:val="0"/>
+        <w:strike w:val="0"/>
+        <w:color w:val="000000"/>
+        <w:sz w:val="22"/>
+        <w:szCs w:val="22"/>
+        <w:u w:val="none"/>
+        <w:shd w:val="clear" w:color="auto" w:fill="auto"/>
+        <w:vertAlign w:val="baseline"/>
+      </w:rPr>
+    </w:lvl>
+    <w:lvl w:ilvl="7">
+      <w:start w:val="1"/>
+      <w:numFmt w:val="bullet"/>
+      <w:lvlText w:val="■"/>
+      <w:lvlJc w:val="left"/>
+      <w:pPr>
+        <w:ind w:left="5760" w:hanging="360"/>
+      </w:pPr>
+      <w:rPr>
+        <w:rFonts w:ascii="Arial" w:eastAsia="Arial" w:hAnsi="Arial" w:cs="Arial"/>
+        <w:b w:val="0"/>
+        <w:bCs w:val="0"/>
+        <w:i w:val="0"/>
+        <w:iCs w:val="0"/>
+        <w:smallCaps w:val="0"/>
+        <w:strike w:val="0"/>
+        <w:color w:val="000000"/>
+        <w:sz w:val="22"/>
+        <w:szCs w:val="22"/>
+        <w:u w:val="none"/>
+        <w:shd w:val="clear" w:color="auto" w:fill="auto"/>
+        <w:vertAlign w:val="baseline"/>
+      </w:rPr>
+    </w:lvl>
+    <w:lvl w:ilvl="8">
+      <w:start w:val="1"/>
+      <w:numFmt w:val="bullet"/>
+      <w:lvlText w:val="■"/>
+      <w:lvlJc w:val="left"/>
+      <w:pPr>
+        <w:ind w:left="6480" w:hanging="360"/>
+      </w:pPr>
+      <w:rPr>
+        <w:rFonts w:ascii="Arial" w:eastAsia="Arial" w:hAnsi="Arial" w:cs="Arial"/>
+        <w:b w:val="0"/>
+        <w:bCs w:val="0"/>
+        <w:i w:val="0"/>
+        <w:iCs w:val="0"/>
+        <w:smallCaps w:val="0"/>
+        <w:strike w:val="0"/>
+        <w:color w:val="000000"/>
+        <w:sz w:val="22"/>
+        <w:szCs w:val="22"/>
+        <w:u w:val="none"/>
+        <w:shd w:val="clear" w:color="auto" w:fill="auto"/>
+        <w:vertAlign w:val="baseline"/>
+      </w:rPr>
+    </w:lvl>
+  </w:abstractNum>
+  <w:abstractNum w:abstractNumId="10" w15:restartNumberingAfterBreak="0">
+    <w:nsid w:val="5933549B"/>
+    <w:multiLevelType w:val="multilevel"/>
+    <w:tmpl w:val="FAF64B00"/>
+    <w:lvl w:ilvl="0">
+      <w:start w:val="1"/>
+      <w:numFmt w:val="bullet"/>
+      <w:lvlText w:val=""/>
+      <w:lvlJc w:val="left"/>
+      <w:pPr>
+        <w:tabs>
+          <w:tab w:val="num" w:pos="720"/>
+        </w:tabs>
+        <w:ind w:left="720" w:hanging="360"/>
+      </w:pPr>
+      <w:rPr>
+        <w:rFonts w:ascii="Symbol" w:hAnsi="Symbol" w:hint="default"/>
+        <w:sz w:val="20"/>
+      </w:rPr>
+    </w:lvl>
+    <w:lvl w:ilvl="1" w:tentative="1">
+      <w:start w:val="1"/>
+      <w:numFmt w:val="bullet"/>
+      <w:lvlText w:val="o"/>
+      <w:lvlJc w:val="left"/>
+      <w:pPr>
+        <w:tabs>
+          <w:tab w:val="num" w:pos="1440"/>
+        </w:tabs>
+        <w:ind w:left="1440" w:hanging="360"/>
+      </w:pPr>
+      <w:rPr>
+        <w:rFonts w:ascii="Courier New" w:hAnsi="Courier New" w:hint="default"/>
+        <w:sz w:val="20"/>
+      </w:rPr>
+    </w:lvl>
+    <w:lvl w:ilvl="2" w:tentative="1">
+      <w:start w:val="1"/>
+      <w:numFmt w:val="bullet"/>
+      <w:lvlText w:val=""/>
+      <w:lvlJc w:val="left"/>
+      <w:pPr>
+        <w:tabs>
+          <w:tab w:val="num" w:pos="2160"/>
+        </w:tabs>
+        <w:ind w:left="2160" w:hanging="360"/>
+      </w:pPr>
+      <w:rPr>
+        <w:rFonts w:ascii="Wingdings" w:hAnsi="Wingdings" w:hint="default"/>
+        <w:sz w:val="20"/>
+      </w:rPr>
+    </w:lvl>
+    <w:lvl w:ilvl="3" w:tentative="1">
+      <w:start w:val="1"/>
+      <w:numFmt w:val="bullet"/>
+      <w:lvlText w:val=""/>
+      <w:lvlJc w:val="left"/>
+      <w:pPr>
+        <w:tabs>
+          <w:tab w:val="num" w:pos="2880"/>
+        </w:tabs>
+        <w:ind w:left="2880" w:hanging="360"/>
+      </w:pPr>
+      <w:rPr>
+        <w:rFonts w:ascii="Wingdings" w:hAnsi="Wingdings" w:hint="default"/>
+        <w:sz w:val="20"/>
+      </w:rPr>
+    </w:lvl>
+    <w:lvl w:ilvl="4" w:tentative="1">
+      <w:start w:val="1"/>
+      <w:numFmt w:val="bullet"/>
+      <w:lvlText w:val=""/>
+      <w:lvlJc w:val="left"/>
+      <w:pPr>
+        <w:tabs>
+          <w:tab w:val="num" w:pos="3600"/>
+        </w:tabs>
+        <w:ind w:left="3600" w:hanging="360"/>
+      </w:pPr>
+      <w:rPr>
+        <w:rFonts w:ascii="Wingdings" w:hAnsi="Wingdings" w:hint="default"/>
+        <w:sz w:val="20"/>
+      </w:rPr>
+    </w:lvl>
+    <w:lvl w:ilvl="5" w:tentative="1">
+      <w:start w:val="1"/>
+      <w:numFmt w:val="bullet"/>
+      <w:lvlText w:val=""/>
+      <w:lvlJc w:val="left"/>
+      <w:pPr>
+        <w:tabs>
+          <w:tab w:val="num" w:pos="4320"/>
+        </w:tabs>
+        <w:ind w:left="4320" w:hanging="360"/>
+      </w:pPr>
+      <w:rPr>
+        <w:rFonts w:ascii="Wingdings" w:hAnsi="Wingdings" w:hint="default"/>
+        <w:sz w:val="20"/>
+      </w:rPr>
+    </w:lvl>
+    <w:lvl w:ilvl="6" w:tentative="1">
+      <w:start w:val="1"/>
+      <w:numFmt w:val="bullet"/>
+      <w:lvlText w:val=""/>
+      <w:lvlJc w:val="left"/>
+      <w:pPr>
+        <w:tabs>
+          <w:tab w:val="num" w:pos="5040"/>
+        </w:tabs>
+        <w:ind w:left="5040" w:hanging="360"/>
+      </w:pPr>
+      <w:rPr>
+        <w:rFonts w:ascii="Wingdings" w:hAnsi="Wingdings" w:hint="default"/>
+        <w:sz w:val="20"/>
+      </w:rPr>
+    </w:lvl>
+    <w:lvl w:ilvl="7" w:tentative="1">
+      <w:start w:val="1"/>
+      <w:numFmt w:val="bullet"/>
+      <w:lvlText w:val=""/>
+      <w:lvlJc w:val="left"/>
+      <w:pPr>
+        <w:tabs>
+          <w:tab w:val="num" w:pos="5760"/>
+        </w:tabs>
+        <w:ind w:left="5760" w:hanging="360"/>
+      </w:pPr>
+      <w:rPr>
+        <w:rFonts w:ascii="Wingdings" w:hAnsi="Wingdings" w:hint="default"/>
+        <w:sz w:val="20"/>
+      </w:rPr>
+    </w:lvl>
+    <w:lvl w:ilvl="8" w:tentative="1">
+      <w:start w:val="1"/>
+      <w:numFmt w:val="bullet"/>
+      <w:lvlText w:val=""/>
+      <w:lvlJc w:val="left"/>
+      <w:pPr>
+        <w:tabs>
+          <w:tab w:val="num" w:pos="6480"/>
+        </w:tabs>
+        <w:ind w:left="6480" w:hanging="360"/>
+      </w:pPr>
+      <w:rPr>
+        <w:rFonts w:ascii="Wingdings" w:hAnsi="Wingdings" w:hint="default"/>
+        <w:sz w:val="20"/>
+      </w:rPr>
+    </w:lvl>
+  </w:abstractNum>
   <w:abstractNum w:abstractNumId="11" w15:restartNumberingAfterBreak="0">
+    <w:nsid w:val="70646CBA"/>
+    <w:multiLevelType w:val="hybridMultilevel"/>
+    <w:tmpl w:val="BC9C5C7A"/>
+    <w:lvl w:ilvl="0" w:tplc="400A0001">
+      <w:start w:val="1"/>
+      <w:numFmt w:val="bullet"/>
+      <w:lvlText w:val=""/>
+      <w:lvlJc w:val="left"/>
+      <w:pPr>
+        <w:ind w:left="720" w:hanging="360"/>
+      </w:pPr>
+      <w:rPr>
+        <w:rFonts w:ascii="Symbol" w:hAnsi="Symbol" w:hint="default"/>
+      </w:rPr>
+    </w:lvl>
+    <w:lvl w:ilvl="1" w:tplc="400A0003" w:tentative="1">
+      <w:start w:val="1"/>
+      <w:numFmt w:val="bullet"/>
+      <w:lvlText w:val="o"/>
+      <w:lvlJc w:val="left"/>
+      <w:pPr>
+        <w:ind w:left="1440" w:hanging="360"/>
+      </w:pPr>
+      <w:rPr>
+        <w:rFonts w:ascii="Courier New" w:hAnsi="Courier New" w:cs="Courier New" w:hint="default"/>
+      </w:rPr>
+    </w:lvl>
+    <w:lvl w:ilvl="2" w:tplc="400A0005" w:tentative="1">
+      <w:start w:val="1"/>
+      <w:numFmt w:val="bullet"/>
+      <w:lvlText w:val=""/>
+      <w:lvlJc w:val="left"/>
+      <w:pPr>
+        <w:ind w:left="2160" w:hanging="360"/>
+      </w:pPr>
+      <w:rPr>
+        <w:rFonts w:ascii="Wingdings" w:hAnsi="Wingdings" w:hint="default"/>
+      </w:rPr>
+    </w:lvl>
+    <w:lvl w:ilvl="3" w:tplc="400A0001" w:tentative="1">
+      <w:start w:val="1"/>
+      <w:numFmt w:val="bullet"/>
+      <w:lvlText w:val=""/>
+      <w:lvlJc w:val="left"/>
+      <w:pPr>
+        <w:ind w:left="2880" w:hanging="360"/>
+      </w:pPr>
+      <w:rPr>
+        <w:rFonts w:ascii="Symbol" w:hAnsi="Symbol" w:hint="default"/>
+      </w:rPr>
+    </w:lvl>
+    <w:lvl w:ilvl="4" w:tplc="400A0003" w:tentative="1">
+      <w:start w:val="1"/>
+      <w:numFmt w:val="bullet"/>
+      <w:lvlText w:val="o"/>
+      <w:lvlJc w:val="left"/>
+      <w:pPr>
+        <w:ind w:left="3600" w:hanging="360"/>
+      </w:pPr>
+      <w:rPr>
+        <w:rFonts w:ascii="Courier New" w:hAnsi="Courier New" w:cs="Courier New" w:hint="default"/>
+      </w:rPr>
+    </w:lvl>
+    <w:lvl w:ilvl="5" w:tplc="400A0005" w:tentative="1">
+      <w:start w:val="1"/>
+      <w:numFmt w:val="bullet"/>
+      <w:lvlText w:val=""/>
+      <w:lvlJc w:val="left"/>
+      <w:pPr>
+        <w:ind w:left="4320" w:hanging="360"/>
+      </w:pPr>
+      <w:rPr>
+        <w:rFonts w:ascii="Wingdings" w:hAnsi="Wingdings" w:hint="default"/>
+      </w:rPr>
+    </w:lvl>
+    <w:lvl w:ilvl="6" w:tplc="400A0001" w:tentative="1">
+      <w:start w:val="1"/>
+      <w:numFmt w:val="bullet"/>
+      <w:lvlText w:val=""/>
+      <w:lvlJc w:val="left"/>
+      <w:pPr>
+        <w:ind w:left="5040" w:hanging="360"/>
+      </w:pPr>
+      <w:rPr>
+        <w:rFonts w:ascii="Symbol" w:hAnsi="Symbol" w:hint="default"/>
+      </w:rPr>
+    </w:lvl>
+    <w:lvl w:ilvl="7" w:tplc="400A0003" w:tentative="1">
+      <w:start w:val="1"/>
+      <w:numFmt w:val="bullet"/>
+      <w:lvlText w:val="o"/>
+      <w:lvlJc w:val="left"/>
+      <w:pPr>
+        <w:ind w:left="5760" w:hanging="360"/>
+      </w:pPr>
+      <w:rPr>
+        <w:rFonts w:ascii="Courier New" w:hAnsi="Courier New" w:cs="Courier New" w:hint="default"/>
+      </w:rPr>
+    </w:lvl>
+    <w:lvl w:ilvl="8" w:tplc="400A0005" w:tentative="1">
+      <w:start w:val="1"/>
+      <w:numFmt w:val="bullet"/>
+      <w:lvlText w:val=""/>
+      <w:lvlJc w:val="left"/>
+      <w:pPr>
+        <w:ind w:left="6480" w:hanging="360"/>
+      </w:pPr>
+      <w:rPr>
+        <w:rFonts w:ascii="Wingdings" w:hAnsi="Wingdings" w:hint="default"/>
+      </w:rPr>
+    </w:lvl>
+  </w:abstractNum>
+  <w:abstractNum w:abstractNumId="12" w15:restartNumberingAfterBreak="0">
+    <w:nsid w:val="79586CD1"/>
+    <w:multiLevelType w:val="multilevel"/>
+    <w:tmpl w:val="B99AE416"/>
+    <w:lvl w:ilvl="0">
+      <w:start w:val="1"/>
+      <w:numFmt w:val="bullet"/>
+      <w:lvlText w:val="●"/>
+      <w:lvlJc w:val="left"/>
+      <w:pPr>
+        <w:ind w:left="465" w:hanging="360"/>
+      </w:pPr>
+      <w:rPr>
+        <w:rFonts w:ascii="Arial" w:eastAsia="Arial" w:hAnsi="Arial" w:cs="Arial"/>
+        <w:b w:val="0"/>
+        <w:bCs w:val="0"/>
+        <w:i w:val="0"/>
+        <w:iCs w:val="0"/>
+        <w:smallCaps w:val="0"/>
+        <w:strike w:val="0"/>
+        <w:color w:val="000000"/>
+        <w:sz w:val="22"/>
+        <w:szCs w:val="22"/>
+        <w:u w:val="none"/>
+        <w:shd w:val="clear" w:color="auto" w:fill="auto"/>
+        <w:vertAlign w:val="baseline"/>
+      </w:rPr>
+    </w:lvl>
+    <w:lvl w:ilvl="1">
+      <w:start w:val="1"/>
+      <w:numFmt w:val="bullet"/>
+      <w:lvlText w:val="○"/>
+      <w:lvlJc w:val="left"/>
+      <w:pPr>
+        <w:ind w:left="1440" w:hanging="360"/>
+      </w:pPr>
+      <w:rPr>
+        <w:rFonts w:ascii="Arial" w:eastAsia="Arial" w:hAnsi="Arial" w:cs="Arial"/>
+        <w:b w:val="0"/>
+        <w:bCs w:val="0"/>
+        <w:i w:val="0"/>
+        <w:iCs w:val="0"/>
+        <w:smallCaps w:val="0"/>
+        <w:strike w:val="0"/>
+        <w:color w:val="000000"/>
+        <w:sz w:val="22"/>
+        <w:szCs w:val="22"/>
+        <w:u w:val="none"/>
+        <w:shd w:val="clear" w:color="auto" w:fill="auto"/>
+        <w:vertAlign w:val="baseline"/>
+      </w:rPr>
+    </w:lvl>
+    <w:lvl w:ilvl="2">
+      <w:start w:val="1"/>
+      <w:numFmt w:val="bullet"/>
+      <w:lvlText w:val="■"/>
+      <w:lvlJc w:val="left"/>
+      <w:pPr>
+        <w:ind w:left="2160" w:hanging="360"/>
+      </w:pPr>
+      <w:rPr>
+        <w:rFonts w:ascii="Arial" w:eastAsia="Arial" w:hAnsi="Arial" w:cs="Arial"/>
+        <w:b w:val="0"/>
+        <w:bCs w:val="0"/>
+        <w:i w:val="0"/>
+        <w:iCs w:val="0"/>
+        <w:smallCaps w:val="0"/>
+        <w:strike w:val="0"/>
+        <w:color w:val="000000"/>
+        <w:sz w:val="22"/>
+        <w:szCs w:val="22"/>
+        <w:u w:val="none"/>
+        <w:shd w:val="clear" w:color="auto" w:fill="auto"/>
+        <w:vertAlign w:val="baseline"/>
+      </w:rPr>
+    </w:lvl>
+    <w:lvl w:ilvl="3">
+      <w:start w:val="1"/>
+      <w:numFmt w:val="bullet"/>
+      <w:lvlText w:val="■"/>
+      <w:lvlJc w:val="left"/>
+      <w:pPr>
+        <w:ind w:left="2880" w:hanging="360"/>
+      </w:pPr>
+      <w:rPr>
+        <w:rFonts w:ascii="Arial" w:eastAsia="Arial" w:hAnsi="Arial" w:cs="Arial"/>
+        <w:b w:val="0"/>
+        <w:bCs w:val="0"/>
+        <w:i w:val="0"/>
+        <w:iCs w:val="0"/>
+        <w:smallCaps w:val="0"/>
+        <w:strike w:val="0"/>
+        <w:color w:val="000000"/>
+        <w:sz w:val="22"/>
+        <w:szCs w:val="22"/>
+        <w:u w:val="none"/>
+        <w:shd w:val="clear" w:color="auto" w:fill="auto"/>
+        <w:vertAlign w:val="baseline"/>
+      </w:rPr>
+    </w:lvl>
+    <w:lvl w:ilvl="4">
+      <w:start w:val="1"/>
+      <w:numFmt w:val="bullet"/>
+      <w:lvlText w:val="■"/>
+      <w:lvlJc w:val="left"/>
+      <w:pPr>
+        <w:ind w:left="3600" w:hanging="360"/>
+      </w:pPr>
+      <w:rPr>
+        <w:rFonts w:ascii="Arial" w:eastAsia="Arial" w:hAnsi="Arial" w:cs="Arial"/>
+        <w:b w:val="0"/>
+        <w:bCs w:val="0"/>
+        <w:i w:val="0"/>
+        <w:iCs w:val="0"/>
+        <w:smallCaps w:val="0"/>
+        <w:strike w:val="0"/>
+        <w:color w:val="000000"/>
+        <w:sz w:val="22"/>
+        <w:szCs w:val="22"/>
+        <w:u w:val="none"/>
+        <w:shd w:val="clear" w:color="auto" w:fill="auto"/>
+        <w:vertAlign w:val="baseline"/>
+      </w:rPr>
+    </w:lvl>
+    <w:lvl w:ilvl="5">
+      <w:start w:val="1"/>
+      <w:numFmt w:val="bullet"/>
+      <w:lvlText w:val="■"/>
+      <w:lvlJc w:val="left"/>
+      <w:pPr>
+        <w:ind w:left="4320" w:hanging="360"/>
+      </w:pPr>
+      <w:rPr>
+        <w:rFonts w:ascii="Arial" w:eastAsia="Arial" w:hAnsi="Arial" w:cs="Arial"/>
+        <w:b w:val="0"/>
+        <w:bCs w:val="0"/>
+        <w:i w:val="0"/>
+        <w:iCs w:val="0"/>
+        <w:smallCaps w:val="0"/>
+        <w:strike w:val="0"/>
+        <w:color w:val="000000"/>
+        <w:sz w:val="22"/>
+        <w:szCs w:val="22"/>
+        <w:u w:val="none"/>
+        <w:shd w:val="clear" w:color="auto" w:fill="auto"/>
+        <w:vertAlign w:val="baseline"/>
+      </w:rPr>
+    </w:lvl>
+    <w:lvl w:ilvl="6">
+      <w:start w:val="1"/>
+      <w:numFmt w:val="bullet"/>
+      <w:lvlText w:val="■"/>
+      <w:lvlJc w:val="left"/>
+      <w:pPr>
+        <w:ind w:left="5040" w:hanging="360"/>
+      </w:pPr>
+      <w:rPr>
+        <w:rFonts w:ascii="Arial" w:eastAsia="Arial" w:hAnsi="Arial" w:cs="Arial"/>
+        <w:b w:val="0"/>
+        <w:bCs w:val="0"/>
+        <w:i w:val="0"/>
+        <w:iCs w:val="0"/>
+        <w:smallCaps w:val="0"/>
+        <w:strike w:val="0"/>
+        <w:color w:val="000000"/>
+        <w:sz w:val="22"/>
+        <w:szCs w:val="22"/>
+        <w:u w:val="none"/>
+        <w:shd w:val="clear" w:color="auto" w:fill="auto"/>
+        <w:vertAlign w:val="baseline"/>
+      </w:rPr>
+    </w:lvl>
+    <w:lvl w:ilvl="7">
+      <w:start w:val="1"/>
+      <w:numFmt w:val="bullet"/>
+      <w:lvlText w:val="■"/>
+      <w:lvlJc w:val="left"/>
+      <w:pPr>
+        <w:ind w:left="5760" w:hanging="360"/>
+      </w:pPr>
+      <w:rPr>
+        <w:rFonts w:ascii="Arial" w:eastAsia="Arial" w:hAnsi="Arial" w:cs="Arial"/>
+        <w:b w:val="0"/>
+        <w:bCs w:val="0"/>
+        <w:i w:val="0"/>
+        <w:iCs w:val="0"/>
+        <w:smallCaps w:val="0"/>
+        <w:strike w:val="0"/>
+        <w:color w:val="000000"/>
+        <w:sz w:val="22"/>
+        <w:szCs w:val="22"/>
+        <w:u w:val="none"/>
+        <w:shd w:val="clear" w:color="auto" w:fill="auto"/>
+        <w:vertAlign w:val="baseline"/>
+      </w:rPr>
+    </w:lvl>
+    <w:lvl w:ilvl="8">
+      <w:start w:val="1"/>
+      <w:numFmt w:val="bullet"/>
+      <w:lvlText w:val="■"/>
+      <w:lvlJc w:val="left"/>
+      <w:pPr>
+        <w:ind w:left="6480" w:hanging="360"/>
+      </w:pPr>
+      <w:rPr>
+        <w:rFonts w:ascii="Arial" w:eastAsia="Arial" w:hAnsi="Arial" w:cs="Arial"/>
+        <w:b w:val="0"/>
+        <w:bCs w:val="0"/>
+        <w:i w:val="0"/>
+        <w:iCs w:val="0"/>
+        <w:smallCaps w:val="0"/>
+        <w:strike w:val="0"/>
+        <w:color w:val="000000"/>
+        <w:sz w:val="22"/>
+        <w:szCs w:val="22"/>
+        <w:u w:val="none"/>
+        <w:shd w:val="clear" w:color="auto" w:fill="auto"/>
+        <w:vertAlign w:val="baseline"/>
+      </w:rPr>
+    </w:lvl>
+  </w:abstractNum>
+  <w:abstractNum w:abstractNumId="13" w15:restartNumberingAfterBreak="0">
     <w:nsid w:val="7BDA2D2F"/>
     <w:multiLevelType w:val="multilevel"/>
     <w:tmpl w:val="54222346"/>
@@ -6003,25 +6897,25 @@
     </w:lvl>
   </w:abstractNum>
   <w:num w:numId="1" w16cid:durableId="1285692316">
-    <w:abstractNumId w:val="9"/>
+    <w:abstractNumId w:val="11"/>
   </w:num>
   <w:num w:numId="2" w16cid:durableId="967052676">
-    <w:abstractNumId w:val="4"/>
+    <w:abstractNumId w:val="6"/>
   </w:num>
   <w:num w:numId="3" w16cid:durableId="1169246334">
-    <w:abstractNumId w:val="11"/>
+    <w:abstractNumId w:val="13"/>
   </w:num>
   <w:num w:numId="4" w16cid:durableId="349989933">
     <w:abstractNumId w:val="1"/>
   </w:num>
   <w:num w:numId="5" w16cid:durableId="2121532888">
-    <w:abstractNumId w:val="6"/>
+    <w:abstractNumId w:val="8"/>
   </w:num>
   <w:num w:numId="6" w16cid:durableId="1175458488">
-    <w:abstractNumId w:val="8"/>
+    <w:abstractNumId w:val="10"/>
   </w:num>
   <w:num w:numId="7" w16cid:durableId="2090927593">
-    <w:abstractNumId w:val="5"/>
+    <w:abstractNumId w:val="7"/>
   </w:num>
   <w:num w:numId="8" w16cid:durableId="1096823365">
     <w:abstractNumId w:val="2"/>
@@ -6030,13 +6924,19 @@
     <w:abstractNumId w:val="3"/>
   </w:num>
   <w:num w:numId="10" w16cid:durableId="1205948725">
-    <w:abstractNumId w:val="10"/>
+    <w:abstractNumId w:val="12"/>
   </w:num>
   <w:num w:numId="11" w16cid:durableId="1179542083">
     <w:abstractNumId w:val="0"/>
   </w:num>
   <w:num w:numId="12" w16cid:durableId="1996449380">
-    <w:abstractNumId w:val="7"/>
+    <w:abstractNumId w:val="9"/>
+  </w:num>
+  <w:num w:numId="13" w16cid:durableId="116220854">
+    <w:abstractNumId w:val="4"/>
+  </w:num>
+  <w:num w:numId="14" w16cid:durableId="1124540011">
+    <w:abstractNumId w:val="5"/>
   </w:num>
 </w:numbering>
 </file>

</xml_diff>

<commit_message>
docs:franz/ "registro de incidencias ,plan de mejora continua ,solicitud de cambios de geolocalizacion y riesgos actualizados"
</commit_message>
<xml_diff>
--- a/documentos/Documentacion_Proyecto.docx
+++ b/documentos/Documentacion_Proyecto.docx
@@ -4294,6 +4294,1911 @@
         <w:t>. Las pruebas de caja negra arrojaron solo 2 errores menores que se subsanaron antes de la entrega final.</w:t>
       </w:r>
     </w:p>
+    <w:p>
+      <w:pPr>
+        <w:pStyle w:val="Ttulo3"/>
+        <w:spacing w:after="120" w:line="275" w:lineRule="auto"/>
+        <w:rPr>
+          <w:b/>
+          <w:bCs/>
+          <w:color w:val="1F1F1F"/>
+          <w:sz w:val="22"/>
+          <w:szCs w:val="22"/>
+        </w:rPr>
+      </w:pPr>
+      <w:r>
+        <w:rPr>
+          <w:b/>
+          <w:bCs/>
+          <w:color w:val="1F1F1F"/>
+          <w:sz w:val="22"/>
+          <w:szCs w:val="22"/>
+        </w:rPr>
+        <w:t>Registro de Incidencias</w:t>
+      </w:r>
+    </w:p>
+    <w:p>
+      <w:pPr>
+        <w:pBdr>
+          <w:top w:val="nil"/>
+          <w:left w:val="nil"/>
+          <w:bottom w:val="nil"/>
+          <w:right w:val="nil"/>
+          <w:between w:val="nil"/>
+        </w:pBdr>
+        <w:spacing w:before="240" w:after="187" w:line="275" w:lineRule="auto"/>
+        <w:rPr>
+          <w:color w:val="1F1F1F"/>
+        </w:rPr>
+      </w:pPr>
+      <w:r>
+        <w:rPr>
+          <w:color w:val="1F1F1F"/>
+        </w:rPr>
+        <w:t>Este registro cronológico detalla los problemas imprevistos que afectaron directamente la marcha del proyecto, sus consecuencias y las soluciones que implementó el equipo para corregirlos de manera oportuna:</w:t>
+      </w:r>
+    </w:p>
+    <w:tbl>
+      <w:tblPr>
+        <w:tblStyle w:val="Tablaconcuadrcula"/>
+        <w:tblW w:w="9360" w:type="dxa"/>
+        <w:tblLayout w:type="fixed"/>
+        <w:tblLook w:val="0600" w:firstRow="0" w:lastRow="0" w:firstColumn="0" w:lastColumn="0" w:noHBand="1" w:noVBand="1"/>
+      </w:tblPr>
+      <w:tblGrid>
+        <w:gridCol w:w="1872"/>
+        <w:gridCol w:w="1872"/>
+        <w:gridCol w:w="1872"/>
+        <w:gridCol w:w="1872"/>
+        <w:gridCol w:w="1872"/>
+      </w:tblGrid>
+      <w:tr>
+        <w:tc>
+          <w:tcPr>
+            <w:tcW w:w="1872" w:type="dxa"/>
+          </w:tcPr>
+          <w:p>
+            <w:pPr>
+              <w:pBdr>
+                <w:top w:val="nil"/>
+                <w:left w:val="nil"/>
+                <w:bottom w:val="nil"/>
+                <w:right w:val="nil"/>
+                <w:between w:val="nil"/>
+              </w:pBdr>
+              <w:spacing w:before="240" w:line="275" w:lineRule="auto"/>
+              <w:rPr>
+                <w:b/>
+                <w:bCs/>
+                <w:color w:val="1F1F1F"/>
+              </w:rPr>
+            </w:pPr>
+            <w:r>
+              <w:rPr>
+                <w:b/>
+                <w:bCs/>
+                <w:color w:val="1F1F1F"/>
+              </w:rPr>
+              <w:t>ID de Incidencia</w:t>
+            </w:r>
+          </w:p>
+        </w:tc>
+        <w:tc>
+          <w:tcPr>
+            <w:tcW w:w="1872" w:type="dxa"/>
+          </w:tcPr>
+          <w:p>
+            <w:pPr>
+              <w:pBdr>
+                <w:top w:val="nil"/>
+                <w:left w:val="nil"/>
+                <w:bottom w:val="nil"/>
+                <w:right w:val="nil"/>
+                <w:between w:val="nil"/>
+              </w:pBdr>
+              <w:spacing w:before="240" w:line="275" w:lineRule="auto"/>
+              <w:rPr>
+                <w:b/>
+                <w:bCs/>
+                <w:color w:val="1F1F1F"/>
+              </w:rPr>
+            </w:pPr>
+            <w:r>
+              <w:rPr>
+                <w:b/>
+                <w:bCs/>
+                <w:color w:val="1F1F1F"/>
+              </w:rPr>
+              <w:t>Fecha de Ocurrencia</w:t>
+            </w:r>
+          </w:p>
+        </w:tc>
+        <w:tc>
+          <w:tcPr>
+            <w:tcW w:w="1872" w:type="dxa"/>
+          </w:tcPr>
+          <w:p>
+            <w:pPr>
+              <w:pBdr>
+                <w:top w:val="nil"/>
+                <w:left w:val="nil"/>
+                <w:bottom w:val="nil"/>
+                <w:right w:val="nil"/>
+                <w:between w:val="nil"/>
+              </w:pBdr>
+              <w:spacing w:before="240" w:line="275" w:lineRule="auto"/>
+              <w:rPr>
+                <w:b/>
+                <w:bCs/>
+                <w:color w:val="1F1F1F"/>
+              </w:rPr>
+            </w:pPr>
+            <w:r>
+              <w:rPr>
+                <w:b/>
+                <w:bCs/>
+                <w:color w:val="1F1F1F"/>
+              </w:rPr>
+              <w:t>Descripción del Problema</w:t>
+            </w:r>
+          </w:p>
+        </w:tc>
+        <w:tc>
+          <w:tcPr>
+            <w:tcW w:w="1872" w:type="dxa"/>
+          </w:tcPr>
+          <w:p>
+            <w:pPr>
+              <w:pBdr>
+                <w:top w:val="nil"/>
+                <w:left w:val="nil"/>
+                <w:bottom w:val="nil"/>
+                <w:right w:val="nil"/>
+                <w:between w:val="nil"/>
+              </w:pBdr>
+              <w:spacing w:before="240" w:line="275" w:lineRule="auto"/>
+              <w:rPr>
+                <w:b/>
+                <w:bCs/>
+                <w:color w:val="1F1F1F"/>
+              </w:rPr>
+            </w:pPr>
+            <w:r>
+              <w:rPr>
+                <w:b/>
+                <w:bCs/>
+                <w:color w:val="1F1F1F"/>
+              </w:rPr>
+              <w:t>Impacto en el Proyecto</w:t>
+            </w:r>
+          </w:p>
+        </w:tc>
+        <w:tc>
+          <w:tcPr>
+            <w:tcW w:w="1872" w:type="dxa"/>
+          </w:tcPr>
+          <w:p>
+            <w:pPr>
+              <w:pBdr>
+                <w:top w:val="nil"/>
+                <w:left w:val="nil"/>
+                <w:bottom w:val="nil"/>
+                <w:right w:val="nil"/>
+                <w:between w:val="nil"/>
+              </w:pBdr>
+              <w:spacing w:before="240" w:line="275" w:lineRule="auto"/>
+              <w:rPr>
+                <w:b/>
+                <w:bCs/>
+                <w:color w:val="1F1F1F"/>
+              </w:rPr>
+            </w:pPr>
+            <w:r>
+              <w:rPr>
+                <w:b/>
+                <w:bCs/>
+                <w:color w:val="1F1F1F"/>
+              </w:rPr>
+              <w:t>Resolución Formal Aplicada</w:t>
+            </w:r>
+          </w:p>
+        </w:tc>
+      </w:tr>
+      <w:tr>
+        <w:tc>
+          <w:tcPr>
+            <w:tcW w:w="1872" w:type="dxa"/>
+          </w:tcPr>
+          <w:p>
+            <w:pPr>
+              <w:pBdr>
+                <w:top w:val="nil"/>
+                <w:left w:val="nil"/>
+                <w:bottom w:val="nil"/>
+                <w:right w:val="nil"/>
+                <w:between w:val="nil"/>
+              </w:pBdr>
+              <w:spacing w:before="240" w:line="275" w:lineRule="auto"/>
+              <w:rPr>
+                <w:b/>
+                <w:bCs/>
+                <w:color w:val="1F1F1F"/>
+              </w:rPr>
+            </w:pPr>
+            <w:r>
+              <w:rPr>
+                <w:b/>
+                <w:bCs/>
+                <w:color w:val="1F1F1F"/>
+              </w:rPr>
+              <w:t>INC-001</w:t>
+            </w:r>
+          </w:p>
+        </w:tc>
+        <w:tc>
+          <w:tcPr>
+            <w:tcW w:w="1872" w:type="dxa"/>
+          </w:tcPr>
+          <w:p>
+            <w:pPr>
+              <w:pBdr>
+                <w:top w:val="nil"/>
+                <w:left w:val="nil"/>
+                <w:bottom w:val="nil"/>
+                <w:right w:val="nil"/>
+                <w:between w:val="nil"/>
+              </w:pBdr>
+              <w:spacing w:before="240" w:line="275" w:lineRule="auto"/>
+              <w:rPr>
+                <w:color w:val="1F1F1F"/>
+              </w:rPr>
+            </w:pPr>
+            <w:r>
+              <w:rPr>
+                <w:color w:val="1F1F1F"/>
+              </w:rPr>
+              <w:t>Mes 3 (Semana 12)</w:t>
+            </w:r>
+          </w:p>
+        </w:tc>
+        <w:tc>
+          <w:tcPr>
+            <w:tcW w:w="1872" w:type="dxa"/>
+          </w:tcPr>
+          <w:p>
+            <w:pPr>
+              <w:pBdr>
+                <w:top w:val="nil"/>
+                <w:left w:val="nil"/>
+                <w:bottom w:val="nil"/>
+                <w:right w:val="nil"/>
+                <w:between w:val="nil"/>
+              </w:pBdr>
+              <w:spacing w:before="240" w:line="275" w:lineRule="auto"/>
+              <w:rPr>
+                <w:color w:val="1F1F1F"/>
+              </w:rPr>
+            </w:pPr>
+            <w:r>
+              <w:rPr>
+                <w:b/>
+                <w:bCs/>
+                <w:color w:val="1F1F1F"/>
+              </w:rPr>
+              <w:t>Renuncia inesperada de 2 desarrolladores clave</w:t>
+            </w:r>
+            <w:r>
+              <w:rPr>
+                <w:color w:val="1F1F1F"/>
+              </w:rPr>
+              <w:t xml:space="preserve"> debido a ofertas externas de trabajo.</w:t>
+            </w:r>
+          </w:p>
+        </w:tc>
+        <w:tc>
+          <w:tcPr>
+            <w:tcW w:w="1872" w:type="dxa"/>
+          </w:tcPr>
+          <w:p>
+            <w:pPr>
+              <w:pBdr>
+                <w:top w:val="nil"/>
+                <w:left w:val="nil"/>
+                <w:bottom w:val="nil"/>
+                <w:right w:val="nil"/>
+                <w:between w:val="nil"/>
+              </w:pBdr>
+              <w:spacing w:before="240" w:line="275" w:lineRule="auto"/>
+              <w:rPr>
+                <w:color w:val="1F1F1F"/>
+              </w:rPr>
+            </w:pPr>
+            <w:r>
+              <w:rPr>
+                <w:b/>
+                <w:bCs/>
+                <w:color w:val="1F1F1F"/>
+              </w:rPr>
+              <w:t>Alto:</w:t>
+            </w:r>
+            <w:r>
+              <w:rPr>
+                <w:color w:val="1F1F1F"/>
+              </w:rPr>
+              <w:t xml:space="preserve"> Pérdida del 50% de la capacidad de programación, generando un retraso inmediato en el módulo de cobro de tarifas.</w:t>
+            </w:r>
+          </w:p>
+        </w:tc>
+        <w:tc>
+          <w:tcPr>
+            <w:tcW w:w="1872" w:type="dxa"/>
+          </w:tcPr>
+          <w:p>
+            <w:pPr>
+              <w:pBdr>
+                <w:top w:val="nil"/>
+                <w:left w:val="nil"/>
+                <w:bottom w:val="nil"/>
+                <w:right w:val="nil"/>
+                <w:between w:val="nil"/>
+              </w:pBdr>
+              <w:spacing w:before="240" w:line="275" w:lineRule="auto"/>
+              <w:rPr>
+                <w:color w:val="1F1F1F"/>
+              </w:rPr>
+            </w:pPr>
+            <w:r>
+              <w:rPr>
+                <w:color w:val="1F1F1F"/>
+              </w:rPr>
+              <w:t xml:space="preserve">El </w:t>
+            </w:r>
+            <w:proofErr w:type="gramStart"/>
+            <w:r>
+              <w:rPr>
+                <w:color w:val="1F1F1F"/>
+              </w:rPr>
+              <w:t>Jefe</w:t>
+            </w:r>
+            <w:proofErr w:type="gramEnd"/>
+            <w:r>
+              <w:rPr>
+                <w:color w:val="1F1F1F"/>
+              </w:rPr>
+              <w:t xml:space="preserve"> de Proyecto reasignó las tareas entre los 2 programadores restantes. Se autorizó un bono económico por </w:t>
+            </w:r>
+            <w:r>
+              <w:rPr>
+                <w:color w:val="1F1F1F"/>
+              </w:rPr>
+              <w:lastRenderedPageBreak/>
+              <w:t>horas extra financiado con los sueldos vacantes de los renunciantes.</w:t>
+            </w:r>
+          </w:p>
+        </w:tc>
+      </w:tr>
+      <w:tr>
+        <w:tc>
+          <w:tcPr>
+            <w:tcW w:w="1872" w:type="dxa"/>
+          </w:tcPr>
+          <w:p>
+            <w:pPr>
+              <w:pBdr>
+                <w:top w:val="nil"/>
+                <w:left w:val="nil"/>
+                <w:bottom w:val="nil"/>
+                <w:right w:val="nil"/>
+                <w:between w:val="nil"/>
+              </w:pBdr>
+              <w:spacing w:before="240" w:line="275" w:lineRule="auto"/>
+              <w:rPr>
+                <w:b/>
+                <w:bCs/>
+                <w:color w:val="1F1F1F"/>
+              </w:rPr>
+            </w:pPr>
+            <w:r>
+              <w:rPr>
+                <w:b/>
+                <w:bCs/>
+                <w:color w:val="1F1F1F"/>
+              </w:rPr>
+              <w:lastRenderedPageBreak/>
+              <w:t>INC-002</w:t>
+            </w:r>
+          </w:p>
+        </w:tc>
+        <w:tc>
+          <w:tcPr>
+            <w:tcW w:w="1872" w:type="dxa"/>
+          </w:tcPr>
+          <w:p>
+            <w:pPr>
+              <w:pBdr>
+                <w:top w:val="nil"/>
+                <w:left w:val="nil"/>
+                <w:bottom w:val="nil"/>
+                <w:right w:val="nil"/>
+                <w:between w:val="nil"/>
+              </w:pBdr>
+              <w:spacing w:before="240" w:line="275" w:lineRule="auto"/>
+              <w:rPr>
+                <w:color w:val="1F1F1F"/>
+              </w:rPr>
+            </w:pPr>
+            <w:r>
+              <w:rPr>
+                <w:color w:val="1F1F1F"/>
+              </w:rPr>
+              <w:t>Mes 4 (Semana 15)</w:t>
+            </w:r>
+          </w:p>
+        </w:tc>
+        <w:tc>
+          <w:tcPr>
+            <w:tcW w:w="1872" w:type="dxa"/>
+          </w:tcPr>
+          <w:p>
+            <w:pPr>
+              <w:pBdr>
+                <w:top w:val="nil"/>
+                <w:left w:val="nil"/>
+                <w:bottom w:val="nil"/>
+                <w:right w:val="nil"/>
+                <w:between w:val="nil"/>
+              </w:pBdr>
+              <w:spacing w:before="240" w:line="275" w:lineRule="auto"/>
+              <w:rPr>
+                <w:color w:val="1F1F1F"/>
+              </w:rPr>
+            </w:pPr>
+            <w:r>
+              <w:rPr>
+                <w:b/>
+                <w:bCs/>
+                <w:color w:val="1F1F1F"/>
+              </w:rPr>
+              <w:t>Modificación de la normativa municipal</w:t>
+            </w:r>
+            <w:r>
+              <w:rPr>
+                <w:color w:val="1F1F1F"/>
+              </w:rPr>
+              <w:t xml:space="preserve"> sobre los requisitos de licencias sanitarias de los comerciantes.</w:t>
+            </w:r>
+          </w:p>
+        </w:tc>
+        <w:tc>
+          <w:tcPr>
+            <w:tcW w:w="1872" w:type="dxa"/>
+          </w:tcPr>
+          <w:p>
+            <w:pPr>
+              <w:pBdr>
+                <w:top w:val="nil"/>
+                <w:left w:val="nil"/>
+                <w:bottom w:val="nil"/>
+                <w:right w:val="nil"/>
+                <w:between w:val="nil"/>
+              </w:pBdr>
+              <w:spacing w:before="240" w:line="275" w:lineRule="auto"/>
+              <w:rPr>
+                <w:color w:val="1F1F1F"/>
+              </w:rPr>
+            </w:pPr>
+            <w:r>
+              <w:rPr>
+                <w:b/>
+                <w:bCs/>
+                <w:color w:val="1F1F1F"/>
+              </w:rPr>
+              <w:t>Medio:</w:t>
+            </w:r>
+            <w:r>
+              <w:rPr>
+                <w:color w:val="1F1F1F"/>
+              </w:rPr>
+              <w:t xml:space="preserve"> El código que validaba los permisos sanitarios quedó obsoleto, obligando a rehacer la lógica de las alertas de sanidad.</w:t>
+            </w:r>
+          </w:p>
+        </w:tc>
+        <w:tc>
+          <w:tcPr>
+            <w:tcW w:w="1872" w:type="dxa"/>
+          </w:tcPr>
+          <w:p>
+            <w:pPr>
+              <w:pBdr>
+                <w:top w:val="nil"/>
+                <w:left w:val="nil"/>
+                <w:bottom w:val="nil"/>
+                <w:right w:val="nil"/>
+                <w:between w:val="nil"/>
+              </w:pBdr>
+              <w:spacing w:before="240" w:line="275" w:lineRule="auto"/>
+              <w:rPr>
+                <w:color w:val="1F1F1F"/>
+              </w:rPr>
+            </w:pPr>
+            <w:r>
+              <w:rPr>
+                <w:color w:val="1F1F1F"/>
+              </w:rPr>
+              <w:t>Se detuvo el Sprint de reportes por 4 días. Los programadores modificaron el módulo de validación para acoplarlo a la nueva ley de la Alcaldía de forma flexible.</w:t>
+            </w:r>
+          </w:p>
+        </w:tc>
+      </w:tr>
+      <w:tr>
+        <w:tc>
+          <w:tcPr>
+            <w:tcW w:w="1872" w:type="dxa"/>
+          </w:tcPr>
+          <w:p>
+            <w:pPr>
+              <w:pBdr>
+                <w:top w:val="nil"/>
+                <w:left w:val="nil"/>
+                <w:bottom w:val="nil"/>
+                <w:right w:val="nil"/>
+                <w:between w:val="nil"/>
+              </w:pBdr>
+              <w:spacing w:before="240" w:line="275" w:lineRule="auto"/>
+              <w:rPr>
+                <w:b/>
+                <w:bCs/>
+                <w:color w:val="1F1F1F"/>
+              </w:rPr>
+            </w:pPr>
+            <w:r>
+              <w:rPr>
+                <w:b/>
+                <w:bCs/>
+                <w:color w:val="1F1F1F"/>
+              </w:rPr>
+              <w:t>INC-003</w:t>
+            </w:r>
+          </w:p>
+        </w:tc>
+        <w:tc>
+          <w:tcPr>
+            <w:tcW w:w="1872" w:type="dxa"/>
+          </w:tcPr>
+          <w:p>
+            <w:pPr>
+              <w:pBdr>
+                <w:top w:val="nil"/>
+                <w:left w:val="nil"/>
+                <w:bottom w:val="nil"/>
+                <w:right w:val="nil"/>
+                <w:between w:val="nil"/>
+              </w:pBdr>
+              <w:spacing w:before="240" w:line="275" w:lineRule="auto"/>
+              <w:rPr>
+                <w:color w:val="1F1F1F"/>
+              </w:rPr>
+            </w:pPr>
+            <w:r>
+              <w:rPr>
+                <w:color w:val="1F1F1F"/>
+              </w:rPr>
+              <w:t>Mes 5 (Semana 19)</w:t>
+            </w:r>
+          </w:p>
+        </w:tc>
+        <w:tc>
+          <w:tcPr>
+            <w:tcW w:w="1872" w:type="dxa"/>
+          </w:tcPr>
+          <w:p>
+            <w:pPr>
+              <w:pBdr>
+                <w:top w:val="nil"/>
+                <w:left w:val="nil"/>
+                <w:bottom w:val="nil"/>
+                <w:right w:val="nil"/>
+                <w:between w:val="nil"/>
+              </w:pBdr>
+              <w:spacing w:before="240" w:line="275" w:lineRule="auto"/>
+              <w:rPr>
+                <w:color w:val="1F1F1F"/>
+              </w:rPr>
+            </w:pPr>
+            <w:r>
+              <w:rPr>
+                <w:b/>
+                <w:bCs/>
+                <w:color w:val="1F1F1F"/>
+              </w:rPr>
+              <w:t>Retraso técnico en el módulo de geolocalización</w:t>
+            </w:r>
+            <w:r>
+              <w:rPr>
+                <w:color w:val="1F1F1F"/>
+              </w:rPr>
+              <w:t xml:space="preserve"> por problemas de conexión con la API de mapas.</w:t>
+            </w:r>
+          </w:p>
+        </w:tc>
+        <w:tc>
+          <w:tcPr>
+            <w:tcW w:w="1872" w:type="dxa"/>
+          </w:tcPr>
+          <w:p>
+            <w:pPr>
+              <w:pBdr>
+                <w:top w:val="nil"/>
+                <w:left w:val="nil"/>
+                <w:bottom w:val="nil"/>
+                <w:right w:val="nil"/>
+                <w:between w:val="nil"/>
+              </w:pBdr>
+              <w:spacing w:before="240" w:line="275" w:lineRule="auto"/>
+              <w:rPr>
+                <w:color w:val="1F1F1F"/>
+              </w:rPr>
+            </w:pPr>
+            <w:r>
+              <w:rPr>
+                <w:b/>
+                <w:bCs/>
+                <w:color w:val="1F1F1F"/>
+              </w:rPr>
+              <w:t>Medio:</w:t>
+            </w:r>
+            <w:r>
+              <w:rPr>
+                <w:color w:val="1F1F1F"/>
+              </w:rPr>
+              <w:t xml:space="preserve"> Riesgo directo de no poder entregar el proyecto completo al finalizar el sexto mes de trabajo.</w:t>
+            </w:r>
+          </w:p>
+        </w:tc>
+        <w:tc>
+          <w:tcPr>
+            <w:tcW w:w="1872" w:type="dxa"/>
+          </w:tcPr>
+          <w:p>
+            <w:pPr>
+              <w:pBdr>
+                <w:top w:val="nil"/>
+                <w:left w:val="nil"/>
+                <w:bottom w:val="nil"/>
+                <w:right w:val="nil"/>
+                <w:between w:val="nil"/>
+              </w:pBdr>
+              <w:spacing w:before="240" w:line="275" w:lineRule="auto"/>
+              <w:rPr>
+                <w:color w:val="1F1F1F"/>
+              </w:rPr>
+            </w:pPr>
+            <w:r>
+              <w:rPr>
+                <w:color w:val="1F1F1F"/>
+              </w:rPr>
+              <w:t>Se utilizó el fondo de contingencia para adquirir una licencia premium de mapas y se extendieron las jornadas de pruebas en el último mes para asegurar la estabilidad.</w:t>
+            </w:r>
+          </w:p>
+        </w:tc>
+      </w:tr>
+    </w:tbl>
+    <w:p>
+      <w:pPr>
+        <w:pStyle w:val="Ttulo3"/>
+        <w:spacing w:after="120" w:line="275" w:lineRule="auto"/>
+        <w:rPr>
+          <w:b/>
+          <w:bCs/>
+          <w:color w:val="1F1F1F"/>
+          <w:sz w:val="22"/>
+          <w:szCs w:val="22"/>
+        </w:rPr>
+      </w:pPr>
+      <w:r>
+        <w:rPr>
+          <w:b/>
+          <w:bCs/>
+          <w:color w:val="1F1F1F"/>
+          <w:sz w:val="22"/>
+          <w:szCs w:val="22"/>
+        </w:rPr>
+        <w:t>Plan de Mejora Continua</w:t>
+      </w:r>
+    </w:p>
+    <w:p>
+      <w:pPr>
+        <w:pBdr>
+          <w:top w:val="nil"/>
+          <w:left w:val="nil"/>
+          <w:bottom w:val="nil"/>
+          <w:right w:val="nil"/>
+          <w:between w:val="nil"/>
+        </w:pBdr>
+        <w:spacing w:before="240" w:after="120" w:line="275" w:lineRule="auto"/>
+        <w:rPr>
+          <w:color w:val="1F1F1F"/>
+        </w:rPr>
+      </w:pPr>
+      <w:r>
+        <w:rPr>
+          <w:color w:val="1F1F1F"/>
+        </w:rPr>
+        <w:t>El equipo implementó un ciclo de mejora basado en retrospectivas semanales. Todos los viernes por la tarde, se llevaron a cabo reuniones de dos horas para analizar tres pilares esenciales de trabajo:</w:t>
+      </w:r>
+    </w:p>
+    <w:p>
+      <w:pPr>
+        <w:widowControl w:val="0"/>
+        <w:numPr>
+          <w:ilvl w:val="0"/>
+          <w:numId w:val="15"/>
+        </w:numPr>
+        <w:pBdr>
+          <w:top w:val="nil"/>
+          <w:left w:val="nil"/>
+          <w:bottom w:val="nil"/>
+          <w:right w:val="nil"/>
+          <w:between w:val="nil"/>
+        </w:pBdr>
+        <w:spacing w:before="240" w:after="0" w:line="275" w:lineRule="auto"/>
+      </w:pPr>
+      <w:r>
+        <w:rPr>
+          <w:b/>
+          <w:bCs/>
+          <w:color w:val="1F1F1F"/>
+        </w:rPr>
+        <w:t>Velocidad:</w:t>
+      </w:r>
+      <w:r>
+        <w:rPr>
+          <w:color w:val="1F1F1F"/>
+        </w:rPr>
+        <w:t xml:space="preserve"> Tras la pérdida de los dos desarrolladores clave, el equipo analizó el ritmo de trabajo. Se determinó que los programadores perdían tiempo configurando servidores locales, por lo que se automatizó el proceso de subida de código mediante una plataforma de integración continua, </w:t>
+      </w:r>
+      <w:r>
+        <w:rPr>
+          <w:color w:val="1F1F1F"/>
+        </w:rPr>
+        <w:lastRenderedPageBreak/>
+        <w:t>permitiendo que los dos desarrolladores restantes rindieran al máximo.</w:t>
+      </w:r>
+    </w:p>
+    <w:p>
+      <w:pPr>
+        <w:widowControl w:val="0"/>
+        <w:numPr>
+          <w:ilvl w:val="0"/>
+          <w:numId w:val="15"/>
+        </w:numPr>
+        <w:pBdr>
+          <w:top w:val="nil"/>
+          <w:left w:val="nil"/>
+          <w:bottom w:val="nil"/>
+          <w:right w:val="nil"/>
+          <w:between w:val="nil"/>
+        </w:pBdr>
+        <w:spacing w:before="240" w:after="0" w:line="275" w:lineRule="auto"/>
+      </w:pPr>
+      <w:r>
+        <w:rPr>
+          <w:b/>
+          <w:bCs/>
+          <w:color w:val="1F1F1F"/>
+        </w:rPr>
+        <w:t>Calidad:</w:t>
+      </w:r>
+      <w:r>
+        <w:rPr>
+          <w:color w:val="1F1F1F"/>
+        </w:rPr>
+        <w:t xml:space="preserve"> Se revisaron los errores (bugs) encontrados. Se estableció </w:t>
+      </w:r>
+      <w:proofErr w:type="gramStart"/>
+      <w:r>
+        <w:rPr>
+          <w:color w:val="1F1F1F"/>
+        </w:rPr>
+        <w:t>que</w:t>
+      </w:r>
+      <w:proofErr w:type="gramEnd"/>
+      <w:r>
+        <w:rPr>
+          <w:color w:val="1F1F1F"/>
+        </w:rPr>
+        <w:t xml:space="preserve"> por cada error crítico detectado en las alertas de licencias sanitarias o cobros, se debía escribir una prueba automática para garantizar que el fallo no volviera a ocurrir tras modificar el código por nuevas normativas.</w:t>
+      </w:r>
+    </w:p>
+    <w:p>
+      <w:pPr>
+        <w:widowControl w:val="0"/>
+        <w:numPr>
+          <w:ilvl w:val="0"/>
+          <w:numId w:val="15"/>
+        </w:numPr>
+        <w:pBdr>
+          <w:top w:val="nil"/>
+          <w:left w:val="nil"/>
+          <w:bottom w:val="nil"/>
+          <w:right w:val="nil"/>
+          <w:between w:val="nil"/>
+        </w:pBdr>
+        <w:spacing w:before="240" w:after="120" w:line="275" w:lineRule="auto"/>
+      </w:pPr>
+      <w:r>
+        <w:rPr>
+          <w:b/>
+          <w:bCs/>
+          <w:color w:val="1F1F1F"/>
+        </w:rPr>
+        <w:t>Comunicación:</w:t>
+      </w:r>
+      <w:r>
+        <w:rPr>
+          <w:color w:val="1F1F1F"/>
+        </w:rPr>
+        <w:t xml:space="preserve"> Se evaluó si el flujo de información con la Dirección de Ingresos era fluido. Para mitigar el impacto de futuras salidas de personal, se implementó una </w:t>
+      </w:r>
+      <w:r>
+        <w:rPr>
+          <w:b/>
+          <w:bCs/>
+          <w:color w:val="1F1F1F"/>
+        </w:rPr>
+        <w:t>Wiki interna (Documentación Compartida)</w:t>
+      </w:r>
+      <w:r>
+        <w:rPr>
+          <w:color w:val="1F1F1F"/>
+        </w:rPr>
+        <w:t>. Cada desarrollador debió dejar registrado detalladamente el código nuevo en esta Wiki antes de terminar su jornada semanal, garantizando el aprendizaje en equipo en tiempo real.</w:t>
+      </w:r>
+    </w:p>
+    <w:p>
+      <w:pPr>
+        <w:pStyle w:val="Ttulo3"/>
+        <w:spacing w:after="120" w:line="275" w:lineRule="auto"/>
+        <w:rPr>
+          <w:b/>
+          <w:bCs/>
+          <w:color w:val="1F1F1F"/>
+          <w:sz w:val="22"/>
+          <w:szCs w:val="22"/>
+        </w:rPr>
+      </w:pPr>
+      <w:r>
+        <w:rPr>
+          <w:b/>
+          <w:bCs/>
+          <w:color w:val="1F1F1F"/>
+          <w:sz w:val="22"/>
+          <w:szCs w:val="22"/>
+        </w:rPr>
+        <w:t>Solicitud de Cambios</w:t>
+      </w:r>
+    </w:p>
+    <w:p>
+      <w:pPr>
+        <w:pBdr>
+          <w:top w:val="nil"/>
+          <w:left w:val="nil"/>
+          <w:bottom w:val="nil"/>
+          <w:right w:val="nil"/>
+          <w:between w:val="nil"/>
+        </w:pBdr>
+        <w:spacing w:before="240" w:after="120" w:line="275" w:lineRule="auto"/>
+        <w:rPr>
+          <w:color w:val="1F1F1F"/>
+        </w:rPr>
+      </w:pPr>
+      <w:r>
+        <w:rPr>
+          <w:color w:val="1F1F1F"/>
+        </w:rPr>
+        <w:t>A las 10 semanas de haber iniciado el proyecto, la Alcaldía de Sucre solicitó de forma escrita e institucional la incorporación de un módulo de geolocalización de puestos que no se encontraba contemplado en el alcance del contrato original. El proceso formal de gestión del cambio implementado por el equipo fue el siguiente:</w:t>
+      </w:r>
+    </w:p>
+    <w:p>
+      <w:pPr>
+        <w:widowControl w:val="0"/>
+        <w:numPr>
+          <w:ilvl w:val="0"/>
+          <w:numId w:val="16"/>
+        </w:numPr>
+        <w:pBdr>
+          <w:top w:val="nil"/>
+          <w:left w:val="nil"/>
+          <w:bottom w:val="nil"/>
+          <w:right w:val="nil"/>
+          <w:between w:val="nil"/>
+        </w:pBdr>
+        <w:spacing w:before="240" w:after="0" w:line="275" w:lineRule="auto"/>
+      </w:pPr>
+      <w:r>
+        <w:rPr>
+          <w:b/>
+          <w:bCs/>
+          <w:color w:val="1F1F1F"/>
+        </w:rPr>
+        <w:t>Petición Formal:</w:t>
+      </w:r>
+      <w:r>
+        <w:rPr>
+          <w:color w:val="1F1F1F"/>
+        </w:rPr>
+        <w:t xml:space="preserve"> El cliente envió el requerimiento por escrito firmado por el </w:t>
+      </w:r>
+      <w:proofErr w:type="gramStart"/>
+      <w:r>
+        <w:rPr>
+          <w:color w:val="1F1F1F"/>
+        </w:rPr>
+        <w:t>Director</w:t>
+      </w:r>
+      <w:proofErr w:type="gramEnd"/>
+      <w:r>
+        <w:rPr>
+          <w:color w:val="1F1F1F"/>
+        </w:rPr>
+        <w:t xml:space="preserve"> de Ingresos.</w:t>
+      </w:r>
+    </w:p>
+    <w:p>
+      <w:pPr>
+        <w:widowControl w:val="0"/>
+        <w:numPr>
+          <w:ilvl w:val="0"/>
+          <w:numId w:val="16"/>
+        </w:numPr>
+        <w:pBdr>
+          <w:top w:val="nil"/>
+          <w:left w:val="nil"/>
+          <w:bottom w:val="nil"/>
+          <w:right w:val="nil"/>
+          <w:between w:val="nil"/>
+        </w:pBdr>
+        <w:spacing w:before="240" w:after="0" w:line="275" w:lineRule="auto"/>
+      </w:pPr>
+      <w:r>
+        <w:rPr>
+          <w:b/>
+          <w:bCs/>
+          <w:color w:val="1F1F1F"/>
+        </w:rPr>
+        <w:t>Análisis de Impacto Técnico-Económico:</w:t>
+      </w:r>
+      <w:r>
+        <w:rPr>
+          <w:color w:val="1F1F1F"/>
+        </w:rPr>
+        <w:t xml:space="preserve"> El </w:t>
+      </w:r>
+      <w:proofErr w:type="gramStart"/>
+      <w:r>
+        <w:rPr>
+          <w:color w:val="1F1F1F"/>
+        </w:rPr>
+        <w:t>Jefe</w:t>
+      </w:r>
+      <w:proofErr w:type="gramEnd"/>
+      <w:r>
+        <w:rPr>
+          <w:color w:val="1F1F1F"/>
+        </w:rPr>
+        <w:t xml:space="preserve"> de Proyecto evaluó el requerimiento y determinó que añadir el mapa implicaba 3 semanas adicionales de trabajo técnico, una reconfiguración de la base de datos existente y un costo por licencias de mapas que se cubriría con el fondo de contingencias (6,000 Bs).</w:t>
+      </w:r>
+    </w:p>
+    <w:p>
+      <w:pPr>
+        <w:widowControl w:val="0"/>
+        <w:numPr>
+          <w:ilvl w:val="0"/>
+          <w:numId w:val="16"/>
+        </w:numPr>
+        <w:pBdr>
+          <w:top w:val="nil"/>
+          <w:left w:val="nil"/>
+          <w:bottom w:val="nil"/>
+          <w:right w:val="nil"/>
+          <w:between w:val="nil"/>
+        </w:pBdr>
+        <w:spacing w:before="240" w:after="0" w:line="275" w:lineRule="auto"/>
+      </w:pPr>
+      <w:r>
+        <w:rPr>
+          <w:b/>
+          <w:bCs/>
+          <w:color w:val="1F1F1F"/>
+        </w:rPr>
+        <w:t>Elaboración de Documentación:</w:t>
+      </w:r>
+      <w:r>
+        <w:rPr>
+          <w:color w:val="1F1F1F"/>
+        </w:rPr>
+        <w:t xml:space="preserve"> Se generó el "Formulario de Cambio #01", detallando el esfuerzo extra, los riesgos asociados y el nuevo cronograma ajustado.</w:t>
+      </w:r>
+    </w:p>
+    <w:p>
+      <w:pPr>
+        <w:widowControl w:val="0"/>
+        <w:numPr>
+          <w:ilvl w:val="0"/>
+          <w:numId w:val="16"/>
+        </w:numPr>
+        <w:pBdr>
+          <w:top w:val="nil"/>
+          <w:left w:val="nil"/>
+          <w:bottom w:val="nil"/>
+          <w:right w:val="nil"/>
+          <w:between w:val="nil"/>
+        </w:pBdr>
+        <w:spacing w:before="240" w:after="0" w:line="275" w:lineRule="auto"/>
+      </w:pPr>
+      <w:r>
+        <w:rPr>
+          <w:b/>
+          <w:bCs/>
+          <w:color w:val="1F1F1F"/>
+        </w:rPr>
+        <w:t>Aprobación por el Comité de Cambios:</w:t>
+      </w:r>
+      <w:r>
+        <w:rPr>
+          <w:color w:val="1F1F1F"/>
+        </w:rPr>
+        <w:t xml:space="preserve"> El Comité de Cambios (formado por la Dirección de Ingresos de la Alcaldía y el </w:t>
+      </w:r>
+      <w:proofErr w:type="gramStart"/>
+      <w:r>
+        <w:rPr>
+          <w:color w:val="1F1F1F"/>
+        </w:rPr>
+        <w:t>Jefe</w:t>
+      </w:r>
+      <w:proofErr w:type="gramEnd"/>
+      <w:r>
+        <w:rPr>
+          <w:color w:val="1F1F1F"/>
+        </w:rPr>
+        <w:t xml:space="preserve"> de Proyecto) revisó la documentación y firmó el acta de aprobación de la orden de cambio, ampliando oficialmente el alcance del MVP.</w:t>
+      </w:r>
+    </w:p>
+    <w:p>
+      <w:pPr>
+        <w:widowControl w:val="0"/>
+        <w:numPr>
+          <w:ilvl w:val="0"/>
+          <w:numId w:val="16"/>
+        </w:numPr>
+        <w:pBdr>
+          <w:top w:val="nil"/>
+          <w:left w:val="nil"/>
+          <w:bottom w:val="nil"/>
+          <w:right w:val="nil"/>
+          <w:between w:val="nil"/>
+        </w:pBdr>
+        <w:spacing w:before="240" w:after="120" w:line="275" w:lineRule="auto"/>
+      </w:pPr>
+      <w:r>
+        <w:rPr>
+          <w:b/>
+          <w:bCs/>
+          <w:color w:val="1F1F1F"/>
+        </w:rPr>
+        <w:t>Ajuste del Cronograma e Implementación:</w:t>
+      </w:r>
+      <w:r>
+        <w:rPr>
+          <w:color w:val="1F1F1F"/>
+        </w:rPr>
+        <w:t xml:space="preserve"> Se reprogramaron las tareas del Mes 5 para incorporar el módulo de mapas digitales y se inició el desarrollo de forma prioritario.</w:t>
+      </w:r>
+    </w:p>
+    <w:p>
+      <w:pPr>
+        <w:pStyle w:val="Ttulo3"/>
+        <w:spacing w:after="120" w:line="275" w:lineRule="auto"/>
+        <w:rPr>
+          <w:b/>
+          <w:bCs/>
+          <w:color w:val="1F1F1F"/>
+          <w:sz w:val="22"/>
+          <w:szCs w:val="22"/>
+        </w:rPr>
+      </w:pPr>
+      <w:r>
+        <w:rPr>
+          <w:b/>
+          <w:bCs/>
+          <w:color w:val="1F1F1F"/>
+          <w:sz w:val="22"/>
+          <w:szCs w:val="22"/>
+        </w:rPr>
+        <w:lastRenderedPageBreak/>
+        <w:t>Registro de Riesgos Actualizado</w:t>
+      </w:r>
+    </w:p>
+    <w:p>
+      <w:pPr>
+        <w:pBdr>
+          <w:top w:val="nil"/>
+          <w:left w:val="nil"/>
+          <w:bottom w:val="nil"/>
+          <w:right w:val="nil"/>
+          <w:between w:val="nil"/>
+        </w:pBdr>
+        <w:spacing w:before="240" w:after="187" w:line="275" w:lineRule="auto"/>
+        <w:rPr>
+          <w:color w:val="1F1F1F"/>
+        </w:rPr>
+      </w:pPr>
+      <w:r>
+        <w:rPr>
+          <w:color w:val="1F1F1F"/>
+        </w:rPr>
+        <w:t>La matriz de riesgos se actualizó constantemente a medida que las amenazas iniciales se transformaron en realidades dentro de la ejecución del proyecto:</w:t>
+      </w:r>
+    </w:p>
+    <w:tbl>
+      <w:tblPr>
+        <w:tblStyle w:val="Tablaconcuadrcula"/>
+        <w:tblW w:w="9360" w:type="dxa"/>
+        <w:tblLayout w:type="fixed"/>
+        <w:tblLook w:val="0600" w:firstRow="0" w:lastRow="0" w:firstColumn="0" w:lastColumn="0" w:noHBand="1" w:noVBand="1"/>
+      </w:tblPr>
+      <w:tblGrid>
+        <w:gridCol w:w="1560"/>
+        <w:gridCol w:w="1560"/>
+        <w:gridCol w:w="1560"/>
+        <w:gridCol w:w="1560"/>
+        <w:gridCol w:w="1560"/>
+        <w:gridCol w:w="1560"/>
+      </w:tblGrid>
+      <w:tr>
+        <w:tc>
+          <w:tcPr>
+            <w:tcW w:w="1560" w:type="dxa"/>
+          </w:tcPr>
+          <w:p>
+            <w:pPr>
+              <w:pBdr>
+                <w:top w:val="nil"/>
+                <w:left w:val="nil"/>
+                <w:bottom w:val="nil"/>
+                <w:right w:val="nil"/>
+                <w:between w:val="nil"/>
+              </w:pBdr>
+              <w:spacing w:before="240" w:line="275" w:lineRule="auto"/>
+              <w:rPr>
+                <w:b/>
+                <w:bCs/>
+                <w:color w:val="1F1F1F"/>
+              </w:rPr>
+            </w:pPr>
+            <w:r>
+              <w:rPr>
+                <w:b/>
+                <w:bCs/>
+                <w:color w:val="1F1F1F"/>
+              </w:rPr>
+              <w:t>Riesgo Detectado</w:t>
+            </w:r>
+          </w:p>
+        </w:tc>
+        <w:tc>
+          <w:tcPr>
+            <w:tcW w:w="1560" w:type="dxa"/>
+          </w:tcPr>
+          <w:p>
+            <w:pPr>
+              <w:pBdr>
+                <w:top w:val="nil"/>
+                <w:left w:val="nil"/>
+                <w:bottom w:val="nil"/>
+                <w:right w:val="nil"/>
+                <w:between w:val="nil"/>
+              </w:pBdr>
+              <w:spacing w:before="240" w:line="275" w:lineRule="auto"/>
+              <w:rPr>
+                <w:b/>
+                <w:bCs/>
+                <w:color w:val="1F1F1F"/>
+              </w:rPr>
+            </w:pPr>
+            <w:r>
+              <w:rPr>
+                <w:b/>
+                <w:bCs/>
+                <w:color w:val="1F1F1F"/>
+              </w:rPr>
+              <w:t>Probabilidad</w:t>
+            </w:r>
+          </w:p>
+        </w:tc>
+        <w:tc>
+          <w:tcPr>
+            <w:tcW w:w="1560" w:type="dxa"/>
+          </w:tcPr>
+          <w:p>
+            <w:pPr>
+              <w:pBdr>
+                <w:top w:val="nil"/>
+                <w:left w:val="nil"/>
+                <w:bottom w:val="nil"/>
+                <w:right w:val="nil"/>
+                <w:between w:val="nil"/>
+              </w:pBdr>
+              <w:spacing w:before="240" w:line="275" w:lineRule="auto"/>
+              <w:rPr>
+                <w:b/>
+                <w:bCs/>
+                <w:color w:val="1F1F1F"/>
+              </w:rPr>
+            </w:pPr>
+            <w:r>
+              <w:rPr>
+                <w:b/>
+                <w:bCs/>
+                <w:color w:val="1F1F1F"/>
+              </w:rPr>
+              <w:t>Impacto</w:t>
+            </w:r>
+          </w:p>
+        </w:tc>
+        <w:tc>
+          <w:tcPr>
+            <w:tcW w:w="1560" w:type="dxa"/>
+          </w:tcPr>
+          <w:p>
+            <w:pPr>
+              <w:pBdr>
+                <w:top w:val="nil"/>
+                <w:left w:val="nil"/>
+                <w:bottom w:val="nil"/>
+                <w:right w:val="nil"/>
+                <w:between w:val="nil"/>
+              </w:pBdr>
+              <w:spacing w:before="240" w:line="275" w:lineRule="auto"/>
+              <w:rPr>
+                <w:b/>
+                <w:bCs/>
+                <w:color w:val="1F1F1F"/>
+              </w:rPr>
+            </w:pPr>
+            <w:r>
+              <w:rPr>
+                <w:b/>
+                <w:bCs/>
+                <w:color w:val="1F1F1F"/>
+              </w:rPr>
+              <w:t>Estrategia de Mitigación y Contingencia Aplicada</w:t>
+            </w:r>
+          </w:p>
+        </w:tc>
+        <w:tc>
+          <w:tcPr>
+            <w:tcW w:w="1560" w:type="dxa"/>
+          </w:tcPr>
+          <w:p>
+            <w:pPr>
+              <w:pBdr>
+                <w:top w:val="nil"/>
+                <w:left w:val="nil"/>
+                <w:bottom w:val="nil"/>
+                <w:right w:val="nil"/>
+                <w:between w:val="nil"/>
+              </w:pBdr>
+              <w:spacing w:before="240" w:line="275" w:lineRule="auto"/>
+              <w:rPr>
+                <w:b/>
+                <w:bCs/>
+                <w:color w:val="1F1F1F"/>
+              </w:rPr>
+            </w:pPr>
+            <w:r>
+              <w:rPr>
+                <w:b/>
+                <w:bCs/>
+                <w:color w:val="1F1F1F"/>
+              </w:rPr>
+              <w:t>Estado del Riesgo</w:t>
+            </w:r>
+          </w:p>
+        </w:tc>
+        <w:tc>
+          <w:tcPr>
+            <w:tcW w:w="1560" w:type="dxa"/>
+          </w:tcPr>
+          <w:p>
+            <w:pPr>
+              <w:pBdr>
+                <w:top w:val="nil"/>
+                <w:left w:val="nil"/>
+                <w:bottom w:val="nil"/>
+                <w:right w:val="nil"/>
+                <w:between w:val="nil"/>
+              </w:pBdr>
+              <w:spacing w:before="240" w:line="275" w:lineRule="auto"/>
+              <w:rPr>
+                <w:b/>
+                <w:bCs/>
+                <w:color w:val="1F1F1F"/>
+              </w:rPr>
+            </w:pPr>
+            <w:r>
+              <w:rPr>
+                <w:b/>
+                <w:bCs/>
+                <w:color w:val="1F1F1F"/>
+              </w:rPr>
+              <w:t>Responsable</w:t>
+            </w:r>
+          </w:p>
+        </w:tc>
+      </w:tr>
+      <w:tr>
+        <w:tc>
+          <w:tcPr>
+            <w:tcW w:w="1560" w:type="dxa"/>
+          </w:tcPr>
+          <w:p>
+            <w:pPr>
+              <w:pBdr>
+                <w:top w:val="nil"/>
+                <w:left w:val="nil"/>
+                <w:bottom w:val="nil"/>
+                <w:right w:val="nil"/>
+                <w:between w:val="nil"/>
+              </w:pBdr>
+              <w:spacing w:before="240" w:line="275" w:lineRule="auto"/>
+              <w:rPr>
+                <w:b/>
+                <w:bCs/>
+                <w:color w:val="1F1F1F"/>
+              </w:rPr>
+            </w:pPr>
+            <w:r>
+              <w:rPr>
+                <w:b/>
+                <w:bCs/>
+                <w:color w:val="1F1F1F"/>
+              </w:rPr>
+              <w:t>Rotación de personal clave</w:t>
+            </w:r>
+          </w:p>
+        </w:tc>
+        <w:tc>
+          <w:tcPr>
+            <w:tcW w:w="1560" w:type="dxa"/>
+          </w:tcPr>
+          <w:p>
+            <w:pPr>
+              <w:pBdr>
+                <w:top w:val="nil"/>
+                <w:left w:val="nil"/>
+                <w:bottom w:val="nil"/>
+                <w:right w:val="nil"/>
+                <w:between w:val="nil"/>
+              </w:pBdr>
+              <w:spacing w:before="240" w:line="275" w:lineRule="auto"/>
+              <w:rPr>
+                <w:color w:val="1F1F1F"/>
+              </w:rPr>
+            </w:pPr>
+            <w:r>
+              <w:rPr>
+                <w:color w:val="1F1F1F"/>
+              </w:rPr>
+              <w:t>Alta</w:t>
+            </w:r>
+          </w:p>
+        </w:tc>
+        <w:tc>
+          <w:tcPr>
+            <w:tcW w:w="1560" w:type="dxa"/>
+          </w:tcPr>
+          <w:p>
+            <w:pPr>
+              <w:pBdr>
+                <w:top w:val="nil"/>
+                <w:left w:val="nil"/>
+                <w:bottom w:val="nil"/>
+                <w:right w:val="nil"/>
+                <w:between w:val="nil"/>
+              </w:pBdr>
+              <w:spacing w:before="240" w:line="275" w:lineRule="auto"/>
+              <w:rPr>
+                <w:color w:val="1F1F1F"/>
+              </w:rPr>
+            </w:pPr>
+            <w:r>
+              <w:rPr>
+                <w:color w:val="1F1F1F"/>
+              </w:rPr>
+              <w:t>Alto</w:t>
+            </w:r>
+          </w:p>
+        </w:tc>
+        <w:tc>
+          <w:tcPr>
+            <w:tcW w:w="1560" w:type="dxa"/>
+          </w:tcPr>
+          <w:p>
+            <w:pPr>
+              <w:pBdr>
+                <w:top w:val="nil"/>
+                <w:left w:val="nil"/>
+                <w:bottom w:val="nil"/>
+                <w:right w:val="nil"/>
+                <w:between w:val="nil"/>
+              </w:pBdr>
+              <w:spacing w:before="240" w:line="275" w:lineRule="auto"/>
+              <w:rPr>
+                <w:color w:val="1F1F1F"/>
+              </w:rPr>
+            </w:pPr>
+            <w:r>
+              <w:rPr>
+                <w:i/>
+                <w:iCs/>
+                <w:color w:val="1F1F1F"/>
+              </w:rPr>
+              <w:t>Contingencia:</w:t>
+            </w:r>
+            <w:r>
+              <w:rPr>
+                <w:color w:val="1F1F1F"/>
+              </w:rPr>
+              <w:t xml:space="preserve"> Reasignación inmediata de código, documentación cruzada obligatoria en la Wiki y pago de horas extra.</w:t>
+            </w:r>
+          </w:p>
+        </w:tc>
+        <w:tc>
+          <w:tcPr>
+            <w:tcW w:w="1560" w:type="dxa"/>
+          </w:tcPr>
+          <w:p>
+            <w:pPr>
+              <w:pBdr>
+                <w:top w:val="nil"/>
+                <w:left w:val="nil"/>
+                <w:bottom w:val="nil"/>
+                <w:right w:val="nil"/>
+                <w:between w:val="nil"/>
+              </w:pBdr>
+              <w:spacing w:before="240" w:line="275" w:lineRule="auto"/>
+              <w:rPr>
+                <w:b/>
+                <w:bCs/>
+                <w:color w:val="1F1F1F"/>
+              </w:rPr>
+            </w:pPr>
+            <w:r>
+              <w:rPr>
+                <w:b/>
+                <w:bCs/>
+                <w:color w:val="1F1F1F"/>
+              </w:rPr>
+              <w:t>Ocurrido</w:t>
+            </w:r>
+          </w:p>
+        </w:tc>
+        <w:tc>
+          <w:tcPr>
+            <w:tcW w:w="1560" w:type="dxa"/>
+          </w:tcPr>
+          <w:p>
+            <w:pPr>
+              <w:pBdr>
+                <w:top w:val="nil"/>
+                <w:left w:val="nil"/>
+                <w:bottom w:val="nil"/>
+                <w:right w:val="nil"/>
+                <w:between w:val="nil"/>
+              </w:pBdr>
+              <w:spacing w:before="240" w:line="275" w:lineRule="auto"/>
+              <w:rPr>
+                <w:color w:val="1F1F1F"/>
+              </w:rPr>
+            </w:pPr>
+            <w:r>
+              <w:rPr>
+                <w:color w:val="1F1F1F"/>
+              </w:rPr>
+              <w:t>Jefe de Proyecto</w:t>
+            </w:r>
+          </w:p>
+        </w:tc>
+      </w:tr>
+      <w:tr>
+        <w:tc>
+          <w:tcPr>
+            <w:tcW w:w="1560" w:type="dxa"/>
+          </w:tcPr>
+          <w:p>
+            <w:pPr>
+              <w:pBdr>
+                <w:top w:val="nil"/>
+                <w:left w:val="nil"/>
+                <w:bottom w:val="nil"/>
+                <w:right w:val="nil"/>
+                <w:between w:val="nil"/>
+              </w:pBdr>
+              <w:spacing w:before="240" w:line="275" w:lineRule="auto"/>
+              <w:rPr>
+                <w:b/>
+                <w:bCs/>
+                <w:color w:val="1F1F1F"/>
+              </w:rPr>
+            </w:pPr>
+            <w:r>
+              <w:rPr>
+                <w:b/>
+                <w:bCs/>
+                <w:color w:val="1F1F1F"/>
+              </w:rPr>
+              <w:t>Cambios normativos sanitarios</w:t>
+            </w:r>
+          </w:p>
+        </w:tc>
+        <w:tc>
+          <w:tcPr>
+            <w:tcW w:w="1560" w:type="dxa"/>
+          </w:tcPr>
+          <w:p>
+            <w:pPr>
+              <w:pBdr>
+                <w:top w:val="nil"/>
+                <w:left w:val="nil"/>
+                <w:bottom w:val="nil"/>
+                <w:right w:val="nil"/>
+                <w:between w:val="nil"/>
+              </w:pBdr>
+              <w:spacing w:before="240" w:line="275" w:lineRule="auto"/>
+              <w:rPr>
+                <w:color w:val="1F1F1F"/>
+              </w:rPr>
+            </w:pPr>
+            <w:r>
+              <w:rPr>
+                <w:color w:val="1F1F1F"/>
+              </w:rPr>
+              <w:t>Media</w:t>
+            </w:r>
+          </w:p>
+        </w:tc>
+        <w:tc>
+          <w:tcPr>
+            <w:tcW w:w="1560" w:type="dxa"/>
+          </w:tcPr>
+          <w:p>
+            <w:pPr>
+              <w:pBdr>
+                <w:top w:val="nil"/>
+                <w:left w:val="nil"/>
+                <w:bottom w:val="nil"/>
+                <w:right w:val="nil"/>
+                <w:between w:val="nil"/>
+              </w:pBdr>
+              <w:spacing w:before="240" w:line="275" w:lineRule="auto"/>
+              <w:rPr>
+                <w:color w:val="1F1F1F"/>
+              </w:rPr>
+            </w:pPr>
+            <w:r>
+              <w:rPr>
+                <w:color w:val="1F1F1F"/>
+              </w:rPr>
+              <w:t>Medio</w:t>
+            </w:r>
+          </w:p>
+        </w:tc>
+        <w:tc>
+          <w:tcPr>
+            <w:tcW w:w="1560" w:type="dxa"/>
+          </w:tcPr>
+          <w:p>
+            <w:pPr>
+              <w:pBdr>
+                <w:top w:val="nil"/>
+                <w:left w:val="nil"/>
+                <w:bottom w:val="nil"/>
+                <w:right w:val="nil"/>
+                <w:between w:val="nil"/>
+              </w:pBdr>
+              <w:spacing w:before="240" w:line="275" w:lineRule="auto"/>
+              <w:rPr>
+                <w:color w:val="1F1F1F"/>
+              </w:rPr>
+            </w:pPr>
+            <w:r>
+              <w:rPr>
+                <w:i/>
+                <w:iCs/>
+                <w:color w:val="1F1F1F"/>
+              </w:rPr>
+              <w:t>Contingencia:</w:t>
+            </w:r>
+            <w:r>
+              <w:rPr>
+                <w:color w:val="1F1F1F"/>
+              </w:rPr>
+              <w:t xml:space="preserve"> Creación de módulos de validación independientes para cambiar reglas de negocio sin romper la base de datos.</w:t>
+            </w:r>
+          </w:p>
+        </w:tc>
+        <w:tc>
+          <w:tcPr>
+            <w:tcW w:w="1560" w:type="dxa"/>
+          </w:tcPr>
+          <w:p>
+            <w:pPr>
+              <w:pBdr>
+                <w:top w:val="nil"/>
+                <w:left w:val="nil"/>
+                <w:bottom w:val="nil"/>
+                <w:right w:val="nil"/>
+                <w:between w:val="nil"/>
+              </w:pBdr>
+              <w:spacing w:before="240" w:line="275" w:lineRule="auto"/>
+              <w:rPr>
+                <w:b/>
+                <w:bCs/>
+                <w:color w:val="1F1F1F"/>
+              </w:rPr>
+            </w:pPr>
+            <w:r>
+              <w:rPr>
+                <w:b/>
+                <w:bCs/>
+                <w:color w:val="1F1F1F"/>
+              </w:rPr>
+              <w:t>Ocurrido</w:t>
+            </w:r>
+          </w:p>
+        </w:tc>
+        <w:tc>
+          <w:tcPr>
+            <w:tcW w:w="1560" w:type="dxa"/>
+          </w:tcPr>
+          <w:p>
+            <w:pPr>
+              <w:pBdr>
+                <w:top w:val="nil"/>
+                <w:left w:val="nil"/>
+                <w:bottom w:val="nil"/>
+                <w:right w:val="nil"/>
+                <w:between w:val="nil"/>
+              </w:pBdr>
+              <w:spacing w:before="240" w:line="275" w:lineRule="auto"/>
+              <w:rPr>
+                <w:color w:val="1F1F1F"/>
+              </w:rPr>
+            </w:pPr>
+            <w:r>
+              <w:rPr>
+                <w:color w:val="1F1F1F"/>
+              </w:rPr>
+              <w:t>Desarrolladores</w:t>
+            </w:r>
+          </w:p>
+        </w:tc>
+      </w:tr>
+      <w:tr>
+        <w:tc>
+          <w:tcPr>
+            <w:tcW w:w="1560" w:type="dxa"/>
+          </w:tcPr>
+          <w:p>
+            <w:pPr>
+              <w:pBdr>
+                <w:top w:val="nil"/>
+                <w:left w:val="nil"/>
+                <w:bottom w:val="nil"/>
+                <w:right w:val="nil"/>
+                <w:between w:val="nil"/>
+              </w:pBdr>
+              <w:spacing w:before="240" w:line="275" w:lineRule="auto"/>
+              <w:rPr>
+                <w:b/>
+                <w:bCs/>
+                <w:color w:val="1F1F1F"/>
+              </w:rPr>
+            </w:pPr>
+            <w:r>
+              <w:rPr>
+                <w:b/>
+                <w:bCs/>
+                <w:color w:val="1F1F1F"/>
+              </w:rPr>
+              <w:t>Retraso en entrega por geolocalización</w:t>
+            </w:r>
+          </w:p>
+        </w:tc>
+        <w:tc>
+          <w:tcPr>
+            <w:tcW w:w="1560" w:type="dxa"/>
+          </w:tcPr>
+          <w:p>
+            <w:pPr>
+              <w:pBdr>
+                <w:top w:val="nil"/>
+                <w:left w:val="nil"/>
+                <w:bottom w:val="nil"/>
+                <w:right w:val="nil"/>
+                <w:between w:val="nil"/>
+              </w:pBdr>
+              <w:spacing w:before="240" w:line="275" w:lineRule="auto"/>
+              <w:rPr>
+                <w:color w:val="1F1F1F"/>
+              </w:rPr>
+            </w:pPr>
+            <w:r>
+              <w:rPr>
+                <w:color w:val="1F1F1F"/>
+              </w:rPr>
+              <w:t>Media</w:t>
+            </w:r>
+          </w:p>
+        </w:tc>
+        <w:tc>
+          <w:tcPr>
+            <w:tcW w:w="1560" w:type="dxa"/>
+          </w:tcPr>
+          <w:p>
+            <w:pPr>
+              <w:pBdr>
+                <w:top w:val="nil"/>
+                <w:left w:val="nil"/>
+                <w:bottom w:val="nil"/>
+                <w:right w:val="nil"/>
+                <w:between w:val="nil"/>
+              </w:pBdr>
+              <w:spacing w:before="240" w:line="275" w:lineRule="auto"/>
+              <w:rPr>
+                <w:color w:val="1F1F1F"/>
+              </w:rPr>
+            </w:pPr>
+            <w:r>
+              <w:rPr>
+                <w:color w:val="1F1F1F"/>
+              </w:rPr>
+              <w:t>Alto</w:t>
+            </w:r>
+          </w:p>
+        </w:tc>
+        <w:tc>
+          <w:tcPr>
+            <w:tcW w:w="1560" w:type="dxa"/>
+          </w:tcPr>
+          <w:p>
+            <w:pPr>
+              <w:pBdr>
+                <w:top w:val="nil"/>
+                <w:left w:val="nil"/>
+                <w:bottom w:val="nil"/>
+                <w:right w:val="nil"/>
+                <w:between w:val="nil"/>
+              </w:pBdr>
+              <w:spacing w:before="240" w:line="275" w:lineRule="auto"/>
+              <w:rPr>
+                <w:color w:val="1F1F1F"/>
+              </w:rPr>
+            </w:pPr>
+            <w:r>
+              <w:rPr>
+                <w:i/>
+                <w:iCs/>
+                <w:color w:val="1F1F1F"/>
+              </w:rPr>
+              <w:t>Contingencia:</w:t>
+            </w:r>
+            <w:r>
+              <w:rPr>
+                <w:color w:val="1F1F1F"/>
+              </w:rPr>
+              <w:t xml:space="preserve"> Uso del fondo de contingencias para </w:t>
+            </w:r>
+            <w:proofErr w:type="spellStart"/>
+            <w:r>
+              <w:rPr>
+                <w:color w:val="1F1F1F"/>
+              </w:rPr>
+              <w:t>APIs</w:t>
+            </w:r>
+            <w:proofErr w:type="spellEnd"/>
+            <w:r>
+              <w:rPr>
+                <w:color w:val="1F1F1F"/>
+              </w:rPr>
+              <w:t xml:space="preserve"> </w:t>
+            </w:r>
+            <w:r>
+              <w:rPr>
+                <w:color w:val="1F1F1F"/>
+              </w:rPr>
+              <w:lastRenderedPageBreak/>
+              <w:t xml:space="preserve">premium de mapas rápidos y priorización absoluta del MVP </w:t>
+            </w:r>
+            <w:proofErr w:type="spellStart"/>
+            <w:r>
+              <w:rPr>
+                <w:color w:val="1F1F1F"/>
+              </w:rPr>
+              <w:t>core</w:t>
+            </w:r>
+            <w:proofErr w:type="spellEnd"/>
+            <w:r>
+              <w:rPr>
+                <w:color w:val="1F1F1F"/>
+              </w:rPr>
+              <w:t xml:space="preserve"> antes del mapa.</w:t>
+            </w:r>
+          </w:p>
+        </w:tc>
+        <w:tc>
+          <w:tcPr>
+            <w:tcW w:w="1560" w:type="dxa"/>
+          </w:tcPr>
+          <w:p>
+            <w:pPr>
+              <w:pBdr>
+                <w:top w:val="nil"/>
+                <w:left w:val="nil"/>
+                <w:bottom w:val="nil"/>
+                <w:right w:val="nil"/>
+                <w:between w:val="nil"/>
+              </w:pBdr>
+              <w:spacing w:before="240" w:line="275" w:lineRule="auto"/>
+              <w:rPr>
+                <w:b/>
+                <w:bCs/>
+                <w:color w:val="1F1F1F"/>
+              </w:rPr>
+            </w:pPr>
+            <w:r>
+              <w:rPr>
+                <w:b/>
+                <w:bCs/>
+                <w:color w:val="1F1F1F"/>
+              </w:rPr>
+              <w:lastRenderedPageBreak/>
+              <w:t>Mitigado</w:t>
+            </w:r>
+          </w:p>
+        </w:tc>
+        <w:tc>
+          <w:tcPr>
+            <w:tcW w:w="1560" w:type="dxa"/>
+          </w:tcPr>
+          <w:p>
+            <w:pPr>
+              <w:pBdr>
+                <w:top w:val="nil"/>
+                <w:left w:val="nil"/>
+                <w:bottom w:val="nil"/>
+                <w:right w:val="nil"/>
+                <w:between w:val="nil"/>
+              </w:pBdr>
+              <w:spacing w:before="240" w:line="275" w:lineRule="auto"/>
+              <w:rPr>
+                <w:color w:val="1F1F1F"/>
+              </w:rPr>
+            </w:pPr>
+            <w:r>
+              <w:rPr>
+                <w:color w:val="1F1F1F"/>
+              </w:rPr>
+              <w:t>Todo el equipo</w:t>
+            </w:r>
+          </w:p>
+        </w:tc>
+      </w:tr>
+    </w:tbl>
+    <w:p/>
+    <w:p/>
     <w:p/>
     <w:sectPr>
       <w:pgSz w:w="11906" w:h="16838"/>
@@ -5341,16 +7246,16 @@
     </w:lvl>
   </w:abstractNum>
   <w:abstractNum w:abstractNumId="5" w15:restartNumberingAfterBreak="0">
-    <w:nsid w:val="308F252C"/>
+    <w:nsid w:val="271F0711"/>
     <w:multiLevelType w:val="multilevel"/>
-    <w:tmpl w:val="61766410"/>
+    <w:tmpl w:val="943C6860"/>
     <w:lvl w:ilvl="0">
       <w:start w:val="1"/>
-      <w:numFmt w:val="bullet"/>
-      <w:lvlText w:val="●"/>
-      <w:lvlJc w:val="left"/>
-      <w:pPr>
-        <w:ind w:left="465" w:hanging="360"/>
+      <w:numFmt w:val="decimal"/>
+      <w:lvlText w:val="%1."/>
+      <w:lvlJc w:val="left"/>
+      <w:pPr>
+        <w:ind w:left="480" w:hanging="360"/>
       </w:pPr>
       <w:rPr>
         <w:rFonts w:ascii="Arial" w:eastAsia="Arial" w:hAnsi="Arial" w:cs="Arial"/>
@@ -5562,121 +7467,9 @@
     </w:lvl>
   </w:abstractNum>
   <w:abstractNum w:abstractNumId="6" w15:restartNumberingAfterBreak="0">
-    <w:nsid w:val="3AAE717A"/>
-    <w:multiLevelType w:val="hybridMultilevel"/>
-    <w:tmpl w:val="7CCAD1B8"/>
-    <w:lvl w:ilvl="0" w:tplc="400A0001">
-      <w:numFmt w:val="bullet"/>
-      <w:lvlText w:val=""/>
-      <w:lvlJc w:val="left"/>
-      <w:pPr>
-        <w:ind w:left="720" w:hanging="360"/>
-      </w:pPr>
-      <w:rPr>
-        <w:rFonts w:ascii="Symbol" w:eastAsia="Times New Roman" w:hAnsi="Symbol" w:cs="Times New Roman" w:hint="default"/>
-      </w:rPr>
-    </w:lvl>
-    <w:lvl w:ilvl="1" w:tplc="400A0003" w:tentative="1">
-      <w:start w:val="1"/>
-      <w:numFmt w:val="bullet"/>
-      <w:lvlText w:val="o"/>
-      <w:lvlJc w:val="left"/>
-      <w:pPr>
-        <w:ind w:left="1440" w:hanging="360"/>
-      </w:pPr>
-      <w:rPr>
-        <w:rFonts w:ascii="Courier New" w:hAnsi="Courier New" w:cs="Courier New" w:hint="default"/>
-      </w:rPr>
-    </w:lvl>
-    <w:lvl w:ilvl="2" w:tplc="400A0005" w:tentative="1">
-      <w:start w:val="1"/>
-      <w:numFmt w:val="bullet"/>
-      <w:lvlText w:val=""/>
-      <w:lvlJc w:val="left"/>
-      <w:pPr>
-        <w:ind w:left="2160" w:hanging="360"/>
-      </w:pPr>
-      <w:rPr>
-        <w:rFonts w:ascii="Wingdings" w:hAnsi="Wingdings" w:hint="default"/>
-      </w:rPr>
-    </w:lvl>
-    <w:lvl w:ilvl="3" w:tplc="400A0001" w:tentative="1">
-      <w:start w:val="1"/>
-      <w:numFmt w:val="bullet"/>
-      <w:lvlText w:val=""/>
-      <w:lvlJc w:val="left"/>
-      <w:pPr>
-        <w:ind w:left="2880" w:hanging="360"/>
-      </w:pPr>
-      <w:rPr>
-        <w:rFonts w:ascii="Symbol" w:hAnsi="Symbol" w:hint="default"/>
-      </w:rPr>
-    </w:lvl>
-    <w:lvl w:ilvl="4" w:tplc="400A0003" w:tentative="1">
-      <w:start w:val="1"/>
-      <w:numFmt w:val="bullet"/>
-      <w:lvlText w:val="o"/>
-      <w:lvlJc w:val="left"/>
-      <w:pPr>
-        <w:ind w:left="3600" w:hanging="360"/>
-      </w:pPr>
-      <w:rPr>
-        <w:rFonts w:ascii="Courier New" w:hAnsi="Courier New" w:cs="Courier New" w:hint="default"/>
-      </w:rPr>
-    </w:lvl>
-    <w:lvl w:ilvl="5" w:tplc="400A0005" w:tentative="1">
-      <w:start w:val="1"/>
-      <w:numFmt w:val="bullet"/>
-      <w:lvlText w:val=""/>
-      <w:lvlJc w:val="left"/>
-      <w:pPr>
-        <w:ind w:left="4320" w:hanging="360"/>
-      </w:pPr>
-      <w:rPr>
-        <w:rFonts w:ascii="Wingdings" w:hAnsi="Wingdings" w:hint="default"/>
-      </w:rPr>
-    </w:lvl>
-    <w:lvl w:ilvl="6" w:tplc="400A0001" w:tentative="1">
-      <w:start w:val="1"/>
-      <w:numFmt w:val="bullet"/>
-      <w:lvlText w:val=""/>
-      <w:lvlJc w:val="left"/>
-      <w:pPr>
-        <w:ind w:left="5040" w:hanging="360"/>
-      </w:pPr>
-      <w:rPr>
-        <w:rFonts w:ascii="Symbol" w:hAnsi="Symbol" w:hint="default"/>
-      </w:rPr>
-    </w:lvl>
-    <w:lvl w:ilvl="7" w:tplc="400A0003" w:tentative="1">
-      <w:start w:val="1"/>
-      <w:numFmt w:val="bullet"/>
-      <w:lvlText w:val="o"/>
-      <w:lvlJc w:val="left"/>
-      <w:pPr>
-        <w:ind w:left="5760" w:hanging="360"/>
-      </w:pPr>
-      <w:rPr>
-        <w:rFonts w:ascii="Courier New" w:hAnsi="Courier New" w:cs="Courier New" w:hint="default"/>
-      </w:rPr>
-    </w:lvl>
-    <w:lvl w:ilvl="8" w:tplc="400A0005" w:tentative="1">
-      <w:start w:val="1"/>
-      <w:numFmt w:val="bullet"/>
-      <w:lvlText w:val=""/>
-      <w:lvlJc w:val="left"/>
-      <w:pPr>
-        <w:ind w:left="6480" w:hanging="360"/>
-      </w:pPr>
-      <w:rPr>
-        <w:rFonts w:ascii="Wingdings" w:hAnsi="Wingdings" w:hint="default"/>
-      </w:rPr>
-    </w:lvl>
-  </w:abstractNum>
-  <w:abstractNum w:abstractNumId="7" w15:restartNumberingAfterBreak="0">
-    <w:nsid w:val="3D7858A5"/>
+    <w:nsid w:val="308F252C"/>
     <w:multiLevelType w:val="multilevel"/>
-    <w:tmpl w:val="C6229DE4"/>
+    <w:tmpl w:val="61766410"/>
     <w:lvl w:ilvl="0">
       <w:start w:val="1"/>
       <w:numFmt w:val="bullet"/>
@@ -5894,159 +7687,122 @@
       </w:rPr>
     </w:lvl>
   </w:abstractNum>
+  <w:abstractNum w:abstractNumId="7" w15:restartNumberingAfterBreak="0">
+    <w:nsid w:val="3AAE717A"/>
+    <w:multiLevelType w:val="hybridMultilevel"/>
+    <w:tmpl w:val="7CCAD1B8"/>
+    <w:lvl w:ilvl="0" w:tplc="400A0001">
+      <w:numFmt w:val="bullet"/>
+      <w:lvlText w:val=""/>
+      <w:lvlJc w:val="left"/>
+      <w:pPr>
+        <w:ind w:left="720" w:hanging="360"/>
+      </w:pPr>
+      <w:rPr>
+        <w:rFonts w:ascii="Symbol" w:eastAsia="Times New Roman" w:hAnsi="Symbol" w:cs="Times New Roman" w:hint="default"/>
+      </w:rPr>
+    </w:lvl>
+    <w:lvl w:ilvl="1" w:tplc="400A0003" w:tentative="1">
+      <w:start w:val="1"/>
+      <w:numFmt w:val="bullet"/>
+      <w:lvlText w:val="o"/>
+      <w:lvlJc w:val="left"/>
+      <w:pPr>
+        <w:ind w:left="1440" w:hanging="360"/>
+      </w:pPr>
+      <w:rPr>
+        <w:rFonts w:ascii="Courier New" w:hAnsi="Courier New" w:cs="Courier New" w:hint="default"/>
+      </w:rPr>
+    </w:lvl>
+    <w:lvl w:ilvl="2" w:tplc="400A0005" w:tentative="1">
+      <w:start w:val="1"/>
+      <w:numFmt w:val="bullet"/>
+      <w:lvlText w:val=""/>
+      <w:lvlJc w:val="left"/>
+      <w:pPr>
+        <w:ind w:left="2160" w:hanging="360"/>
+      </w:pPr>
+      <w:rPr>
+        <w:rFonts w:ascii="Wingdings" w:hAnsi="Wingdings" w:hint="default"/>
+      </w:rPr>
+    </w:lvl>
+    <w:lvl w:ilvl="3" w:tplc="400A0001" w:tentative="1">
+      <w:start w:val="1"/>
+      <w:numFmt w:val="bullet"/>
+      <w:lvlText w:val=""/>
+      <w:lvlJc w:val="left"/>
+      <w:pPr>
+        <w:ind w:left="2880" w:hanging="360"/>
+      </w:pPr>
+      <w:rPr>
+        <w:rFonts w:ascii="Symbol" w:hAnsi="Symbol" w:hint="default"/>
+      </w:rPr>
+    </w:lvl>
+    <w:lvl w:ilvl="4" w:tplc="400A0003" w:tentative="1">
+      <w:start w:val="1"/>
+      <w:numFmt w:val="bullet"/>
+      <w:lvlText w:val="o"/>
+      <w:lvlJc w:val="left"/>
+      <w:pPr>
+        <w:ind w:left="3600" w:hanging="360"/>
+      </w:pPr>
+      <w:rPr>
+        <w:rFonts w:ascii="Courier New" w:hAnsi="Courier New" w:cs="Courier New" w:hint="default"/>
+      </w:rPr>
+    </w:lvl>
+    <w:lvl w:ilvl="5" w:tplc="400A0005" w:tentative="1">
+      <w:start w:val="1"/>
+      <w:numFmt w:val="bullet"/>
+      <w:lvlText w:val=""/>
+      <w:lvlJc w:val="left"/>
+      <w:pPr>
+        <w:ind w:left="4320" w:hanging="360"/>
+      </w:pPr>
+      <w:rPr>
+        <w:rFonts w:ascii="Wingdings" w:hAnsi="Wingdings" w:hint="default"/>
+      </w:rPr>
+    </w:lvl>
+    <w:lvl w:ilvl="6" w:tplc="400A0001" w:tentative="1">
+      <w:start w:val="1"/>
+      <w:numFmt w:val="bullet"/>
+      <w:lvlText w:val=""/>
+      <w:lvlJc w:val="left"/>
+      <w:pPr>
+        <w:ind w:left="5040" w:hanging="360"/>
+      </w:pPr>
+      <w:rPr>
+        <w:rFonts w:ascii="Symbol" w:hAnsi="Symbol" w:hint="default"/>
+      </w:rPr>
+    </w:lvl>
+    <w:lvl w:ilvl="7" w:tplc="400A0003" w:tentative="1">
+      <w:start w:val="1"/>
+      <w:numFmt w:val="bullet"/>
+      <w:lvlText w:val="o"/>
+      <w:lvlJc w:val="left"/>
+      <w:pPr>
+        <w:ind w:left="5760" w:hanging="360"/>
+      </w:pPr>
+      <w:rPr>
+        <w:rFonts w:ascii="Courier New" w:hAnsi="Courier New" w:cs="Courier New" w:hint="default"/>
+      </w:rPr>
+    </w:lvl>
+    <w:lvl w:ilvl="8" w:tplc="400A0005" w:tentative="1">
+      <w:start w:val="1"/>
+      <w:numFmt w:val="bullet"/>
+      <w:lvlText w:val=""/>
+      <w:lvlJc w:val="left"/>
+      <w:pPr>
+        <w:ind w:left="6480" w:hanging="360"/>
+      </w:pPr>
+      <w:rPr>
+        <w:rFonts w:ascii="Wingdings" w:hAnsi="Wingdings" w:hint="default"/>
+      </w:rPr>
+    </w:lvl>
+  </w:abstractNum>
   <w:abstractNum w:abstractNumId="8" w15:restartNumberingAfterBreak="0">
-    <w:nsid w:val="42B1333A"/>
+    <w:nsid w:val="3D7858A5"/>
     <w:multiLevelType w:val="multilevel"/>
-    <w:tmpl w:val="F2CC0728"/>
-    <w:lvl w:ilvl="0">
-      <w:start w:val="1"/>
-      <w:numFmt w:val="bullet"/>
-      <w:lvlText w:val=""/>
-      <w:lvlJc w:val="left"/>
-      <w:pPr>
-        <w:tabs>
-          <w:tab w:val="num" w:pos="720"/>
-        </w:tabs>
-        <w:ind w:left="720" w:hanging="360"/>
-      </w:pPr>
-      <w:rPr>
-        <w:rFonts w:ascii="Symbol" w:hAnsi="Symbol" w:hint="default"/>
-        <w:sz w:val="20"/>
-      </w:rPr>
-    </w:lvl>
-    <w:lvl w:ilvl="1" w:tentative="1">
-      <w:start w:val="1"/>
-      <w:numFmt w:val="bullet"/>
-      <w:lvlText w:val="o"/>
-      <w:lvlJc w:val="left"/>
-      <w:pPr>
-        <w:tabs>
-          <w:tab w:val="num" w:pos="1440"/>
-        </w:tabs>
-        <w:ind w:left="1440" w:hanging="360"/>
-      </w:pPr>
-      <w:rPr>
-        <w:rFonts w:ascii="Courier New" w:hAnsi="Courier New" w:hint="default"/>
-        <w:sz w:val="20"/>
-      </w:rPr>
-    </w:lvl>
-    <w:lvl w:ilvl="2" w:tentative="1">
-      <w:start w:val="1"/>
-      <w:numFmt w:val="bullet"/>
-      <w:lvlText w:val=""/>
-      <w:lvlJc w:val="left"/>
-      <w:pPr>
-        <w:tabs>
-          <w:tab w:val="num" w:pos="2160"/>
-        </w:tabs>
-        <w:ind w:left="2160" w:hanging="360"/>
-      </w:pPr>
-      <w:rPr>
-        <w:rFonts w:ascii="Wingdings" w:hAnsi="Wingdings" w:hint="default"/>
-        <w:sz w:val="20"/>
-      </w:rPr>
-    </w:lvl>
-    <w:lvl w:ilvl="3" w:tentative="1">
-      <w:start w:val="1"/>
-      <w:numFmt w:val="bullet"/>
-      <w:lvlText w:val=""/>
-      <w:lvlJc w:val="left"/>
-      <w:pPr>
-        <w:tabs>
-          <w:tab w:val="num" w:pos="2880"/>
-        </w:tabs>
-        <w:ind w:left="2880" w:hanging="360"/>
-      </w:pPr>
-      <w:rPr>
-        <w:rFonts w:ascii="Wingdings" w:hAnsi="Wingdings" w:hint="default"/>
-        <w:sz w:val="20"/>
-      </w:rPr>
-    </w:lvl>
-    <w:lvl w:ilvl="4" w:tentative="1">
-      <w:start w:val="1"/>
-      <w:numFmt w:val="bullet"/>
-      <w:lvlText w:val=""/>
-      <w:lvlJc w:val="left"/>
-      <w:pPr>
-        <w:tabs>
-          <w:tab w:val="num" w:pos="3600"/>
-        </w:tabs>
-        <w:ind w:left="3600" w:hanging="360"/>
-      </w:pPr>
-      <w:rPr>
-        <w:rFonts w:ascii="Wingdings" w:hAnsi="Wingdings" w:hint="default"/>
-        <w:sz w:val="20"/>
-      </w:rPr>
-    </w:lvl>
-    <w:lvl w:ilvl="5" w:tentative="1">
-      <w:start w:val="1"/>
-      <w:numFmt w:val="bullet"/>
-      <w:lvlText w:val=""/>
-      <w:lvlJc w:val="left"/>
-      <w:pPr>
-        <w:tabs>
-          <w:tab w:val="num" w:pos="4320"/>
-        </w:tabs>
-        <w:ind w:left="4320" w:hanging="360"/>
-      </w:pPr>
-      <w:rPr>
-        <w:rFonts w:ascii="Wingdings" w:hAnsi="Wingdings" w:hint="default"/>
-        <w:sz w:val="20"/>
-      </w:rPr>
-    </w:lvl>
-    <w:lvl w:ilvl="6" w:tentative="1">
-      <w:start w:val="1"/>
-      <w:numFmt w:val="bullet"/>
-      <w:lvlText w:val=""/>
-      <w:lvlJc w:val="left"/>
-      <w:pPr>
-        <w:tabs>
-          <w:tab w:val="num" w:pos="5040"/>
-        </w:tabs>
-        <w:ind w:left="5040" w:hanging="360"/>
-      </w:pPr>
-      <w:rPr>
-        <w:rFonts w:ascii="Wingdings" w:hAnsi="Wingdings" w:hint="default"/>
-        <w:sz w:val="20"/>
-      </w:rPr>
-    </w:lvl>
-    <w:lvl w:ilvl="7" w:tentative="1">
-      <w:start w:val="1"/>
-      <w:numFmt w:val="bullet"/>
-      <w:lvlText w:val=""/>
-      <w:lvlJc w:val="left"/>
-      <w:pPr>
-        <w:tabs>
-          <w:tab w:val="num" w:pos="5760"/>
-        </w:tabs>
-        <w:ind w:left="5760" w:hanging="360"/>
-      </w:pPr>
-      <w:rPr>
-        <w:rFonts w:ascii="Wingdings" w:hAnsi="Wingdings" w:hint="default"/>
-        <w:sz w:val="20"/>
-      </w:rPr>
-    </w:lvl>
-    <w:lvl w:ilvl="8" w:tentative="1">
-      <w:start w:val="1"/>
-      <w:numFmt w:val="bullet"/>
-      <w:lvlText w:val=""/>
-      <w:lvlJc w:val="left"/>
-      <w:pPr>
-        <w:tabs>
-          <w:tab w:val="num" w:pos="6480"/>
-        </w:tabs>
-        <w:ind w:left="6480" w:hanging="360"/>
-      </w:pPr>
-      <w:rPr>
-        <w:rFonts w:ascii="Wingdings" w:hAnsi="Wingdings" w:hint="default"/>
-        <w:sz w:val="20"/>
-      </w:rPr>
-    </w:lvl>
-  </w:abstractNum>
-  <w:abstractNum w:abstractNumId="9" w15:restartNumberingAfterBreak="0">
-    <w:nsid w:val="43BF3054"/>
-    <w:multiLevelType w:val="multilevel"/>
-    <w:tmpl w:val="A6BA997A"/>
+    <w:tmpl w:val="C6229DE4"/>
     <w:lvl w:ilvl="0">
       <w:start w:val="1"/>
       <w:numFmt w:val="bullet"/>
@@ -6264,10 +8020,10 @@
       </w:rPr>
     </w:lvl>
   </w:abstractNum>
-  <w:abstractNum w:abstractNumId="10" w15:restartNumberingAfterBreak="0">
-    <w:nsid w:val="5933549B"/>
+  <w:abstractNum w:abstractNumId="9" w15:restartNumberingAfterBreak="0">
+    <w:nsid w:val="42B1333A"/>
     <w:multiLevelType w:val="multilevel"/>
-    <w:tmpl w:val="FAF64B00"/>
+    <w:tmpl w:val="F2CC0728"/>
     <w:lvl w:ilvl="0">
       <w:start w:val="1"/>
       <w:numFmt w:val="bullet"/>
@@ -6413,123 +8169,10 @@
       </w:rPr>
     </w:lvl>
   </w:abstractNum>
-  <w:abstractNum w:abstractNumId="11" w15:restartNumberingAfterBreak="0">
-    <w:nsid w:val="70646CBA"/>
-    <w:multiLevelType w:val="hybridMultilevel"/>
-    <w:tmpl w:val="BC9C5C7A"/>
-    <w:lvl w:ilvl="0" w:tplc="400A0001">
-      <w:start w:val="1"/>
-      <w:numFmt w:val="bullet"/>
-      <w:lvlText w:val=""/>
-      <w:lvlJc w:val="left"/>
-      <w:pPr>
-        <w:ind w:left="720" w:hanging="360"/>
-      </w:pPr>
-      <w:rPr>
-        <w:rFonts w:ascii="Symbol" w:hAnsi="Symbol" w:hint="default"/>
-      </w:rPr>
-    </w:lvl>
-    <w:lvl w:ilvl="1" w:tplc="400A0003" w:tentative="1">
-      <w:start w:val="1"/>
-      <w:numFmt w:val="bullet"/>
-      <w:lvlText w:val="o"/>
-      <w:lvlJc w:val="left"/>
-      <w:pPr>
-        <w:ind w:left="1440" w:hanging="360"/>
-      </w:pPr>
-      <w:rPr>
-        <w:rFonts w:ascii="Courier New" w:hAnsi="Courier New" w:cs="Courier New" w:hint="default"/>
-      </w:rPr>
-    </w:lvl>
-    <w:lvl w:ilvl="2" w:tplc="400A0005" w:tentative="1">
-      <w:start w:val="1"/>
-      <w:numFmt w:val="bullet"/>
-      <w:lvlText w:val=""/>
-      <w:lvlJc w:val="left"/>
-      <w:pPr>
-        <w:ind w:left="2160" w:hanging="360"/>
-      </w:pPr>
-      <w:rPr>
-        <w:rFonts w:ascii="Wingdings" w:hAnsi="Wingdings" w:hint="default"/>
-      </w:rPr>
-    </w:lvl>
-    <w:lvl w:ilvl="3" w:tplc="400A0001" w:tentative="1">
-      <w:start w:val="1"/>
-      <w:numFmt w:val="bullet"/>
-      <w:lvlText w:val=""/>
-      <w:lvlJc w:val="left"/>
-      <w:pPr>
-        <w:ind w:left="2880" w:hanging="360"/>
-      </w:pPr>
-      <w:rPr>
-        <w:rFonts w:ascii="Symbol" w:hAnsi="Symbol" w:hint="default"/>
-      </w:rPr>
-    </w:lvl>
-    <w:lvl w:ilvl="4" w:tplc="400A0003" w:tentative="1">
-      <w:start w:val="1"/>
-      <w:numFmt w:val="bullet"/>
-      <w:lvlText w:val="o"/>
-      <w:lvlJc w:val="left"/>
-      <w:pPr>
-        <w:ind w:left="3600" w:hanging="360"/>
-      </w:pPr>
-      <w:rPr>
-        <w:rFonts w:ascii="Courier New" w:hAnsi="Courier New" w:cs="Courier New" w:hint="default"/>
-      </w:rPr>
-    </w:lvl>
-    <w:lvl w:ilvl="5" w:tplc="400A0005" w:tentative="1">
-      <w:start w:val="1"/>
-      <w:numFmt w:val="bullet"/>
-      <w:lvlText w:val=""/>
-      <w:lvlJc w:val="left"/>
-      <w:pPr>
-        <w:ind w:left="4320" w:hanging="360"/>
-      </w:pPr>
-      <w:rPr>
-        <w:rFonts w:ascii="Wingdings" w:hAnsi="Wingdings" w:hint="default"/>
-      </w:rPr>
-    </w:lvl>
-    <w:lvl w:ilvl="6" w:tplc="400A0001" w:tentative="1">
-      <w:start w:val="1"/>
-      <w:numFmt w:val="bullet"/>
-      <w:lvlText w:val=""/>
-      <w:lvlJc w:val="left"/>
-      <w:pPr>
-        <w:ind w:left="5040" w:hanging="360"/>
-      </w:pPr>
-      <w:rPr>
-        <w:rFonts w:ascii="Symbol" w:hAnsi="Symbol" w:hint="default"/>
-      </w:rPr>
-    </w:lvl>
-    <w:lvl w:ilvl="7" w:tplc="400A0003" w:tentative="1">
-      <w:start w:val="1"/>
-      <w:numFmt w:val="bullet"/>
-      <w:lvlText w:val="o"/>
-      <w:lvlJc w:val="left"/>
-      <w:pPr>
-        <w:ind w:left="5760" w:hanging="360"/>
-      </w:pPr>
-      <w:rPr>
-        <w:rFonts w:ascii="Courier New" w:hAnsi="Courier New" w:cs="Courier New" w:hint="default"/>
-      </w:rPr>
-    </w:lvl>
-    <w:lvl w:ilvl="8" w:tplc="400A0005" w:tentative="1">
-      <w:start w:val="1"/>
-      <w:numFmt w:val="bullet"/>
-      <w:lvlText w:val=""/>
-      <w:lvlJc w:val="left"/>
-      <w:pPr>
-        <w:ind w:left="6480" w:hanging="360"/>
-      </w:pPr>
-      <w:rPr>
-        <w:rFonts w:ascii="Wingdings" w:hAnsi="Wingdings" w:hint="default"/>
-      </w:rPr>
-    </w:lvl>
-  </w:abstractNum>
-  <w:abstractNum w:abstractNumId="12" w15:restartNumberingAfterBreak="0">
-    <w:nsid w:val="79586CD1"/>
+  <w:abstractNum w:abstractNumId="10" w15:restartNumberingAfterBreak="0">
+    <w:nsid w:val="43BF3054"/>
     <w:multiLevelType w:val="multilevel"/>
-    <w:tmpl w:val="B99AE416"/>
+    <w:tmpl w:val="A6BA997A"/>
     <w:lvl w:ilvl="0">
       <w:start w:val="1"/>
       <w:numFmt w:val="bullet"/>
@@ -6747,7 +8390,711 @@
       </w:rPr>
     </w:lvl>
   </w:abstractNum>
+  <w:abstractNum w:abstractNumId="11" w15:restartNumberingAfterBreak="0">
+    <w:nsid w:val="5933549B"/>
+    <w:multiLevelType w:val="multilevel"/>
+    <w:tmpl w:val="FAF64B00"/>
+    <w:lvl w:ilvl="0">
+      <w:start w:val="1"/>
+      <w:numFmt w:val="bullet"/>
+      <w:lvlText w:val=""/>
+      <w:lvlJc w:val="left"/>
+      <w:pPr>
+        <w:tabs>
+          <w:tab w:val="num" w:pos="720"/>
+        </w:tabs>
+        <w:ind w:left="720" w:hanging="360"/>
+      </w:pPr>
+      <w:rPr>
+        <w:rFonts w:ascii="Symbol" w:hAnsi="Symbol" w:hint="default"/>
+        <w:sz w:val="20"/>
+      </w:rPr>
+    </w:lvl>
+    <w:lvl w:ilvl="1" w:tentative="1">
+      <w:start w:val="1"/>
+      <w:numFmt w:val="bullet"/>
+      <w:lvlText w:val="o"/>
+      <w:lvlJc w:val="left"/>
+      <w:pPr>
+        <w:tabs>
+          <w:tab w:val="num" w:pos="1440"/>
+        </w:tabs>
+        <w:ind w:left="1440" w:hanging="360"/>
+      </w:pPr>
+      <w:rPr>
+        <w:rFonts w:ascii="Courier New" w:hAnsi="Courier New" w:hint="default"/>
+        <w:sz w:val="20"/>
+      </w:rPr>
+    </w:lvl>
+    <w:lvl w:ilvl="2" w:tentative="1">
+      <w:start w:val="1"/>
+      <w:numFmt w:val="bullet"/>
+      <w:lvlText w:val=""/>
+      <w:lvlJc w:val="left"/>
+      <w:pPr>
+        <w:tabs>
+          <w:tab w:val="num" w:pos="2160"/>
+        </w:tabs>
+        <w:ind w:left="2160" w:hanging="360"/>
+      </w:pPr>
+      <w:rPr>
+        <w:rFonts w:ascii="Wingdings" w:hAnsi="Wingdings" w:hint="default"/>
+        <w:sz w:val="20"/>
+      </w:rPr>
+    </w:lvl>
+    <w:lvl w:ilvl="3" w:tentative="1">
+      <w:start w:val="1"/>
+      <w:numFmt w:val="bullet"/>
+      <w:lvlText w:val=""/>
+      <w:lvlJc w:val="left"/>
+      <w:pPr>
+        <w:tabs>
+          <w:tab w:val="num" w:pos="2880"/>
+        </w:tabs>
+        <w:ind w:left="2880" w:hanging="360"/>
+      </w:pPr>
+      <w:rPr>
+        <w:rFonts w:ascii="Wingdings" w:hAnsi="Wingdings" w:hint="default"/>
+        <w:sz w:val="20"/>
+      </w:rPr>
+    </w:lvl>
+    <w:lvl w:ilvl="4" w:tentative="1">
+      <w:start w:val="1"/>
+      <w:numFmt w:val="bullet"/>
+      <w:lvlText w:val=""/>
+      <w:lvlJc w:val="left"/>
+      <w:pPr>
+        <w:tabs>
+          <w:tab w:val="num" w:pos="3600"/>
+        </w:tabs>
+        <w:ind w:left="3600" w:hanging="360"/>
+      </w:pPr>
+      <w:rPr>
+        <w:rFonts w:ascii="Wingdings" w:hAnsi="Wingdings" w:hint="default"/>
+        <w:sz w:val="20"/>
+      </w:rPr>
+    </w:lvl>
+    <w:lvl w:ilvl="5" w:tentative="1">
+      <w:start w:val="1"/>
+      <w:numFmt w:val="bullet"/>
+      <w:lvlText w:val=""/>
+      <w:lvlJc w:val="left"/>
+      <w:pPr>
+        <w:tabs>
+          <w:tab w:val="num" w:pos="4320"/>
+        </w:tabs>
+        <w:ind w:left="4320" w:hanging="360"/>
+      </w:pPr>
+      <w:rPr>
+        <w:rFonts w:ascii="Wingdings" w:hAnsi="Wingdings" w:hint="default"/>
+        <w:sz w:val="20"/>
+      </w:rPr>
+    </w:lvl>
+    <w:lvl w:ilvl="6" w:tentative="1">
+      <w:start w:val="1"/>
+      <w:numFmt w:val="bullet"/>
+      <w:lvlText w:val=""/>
+      <w:lvlJc w:val="left"/>
+      <w:pPr>
+        <w:tabs>
+          <w:tab w:val="num" w:pos="5040"/>
+        </w:tabs>
+        <w:ind w:left="5040" w:hanging="360"/>
+      </w:pPr>
+      <w:rPr>
+        <w:rFonts w:ascii="Wingdings" w:hAnsi="Wingdings" w:hint="default"/>
+        <w:sz w:val="20"/>
+      </w:rPr>
+    </w:lvl>
+    <w:lvl w:ilvl="7" w:tentative="1">
+      <w:start w:val="1"/>
+      <w:numFmt w:val="bullet"/>
+      <w:lvlText w:val=""/>
+      <w:lvlJc w:val="left"/>
+      <w:pPr>
+        <w:tabs>
+          <w:tab w:val="num" w:pos="5760"/>
+        </w:tabs>
+        <w:ind w:left="5760" w:hanging="360"/>
+      </w:pPr>
+      <w:rPr>
+        <w:rFonts w:ascii="Wingdings" w:hAnsi="Wingdings" w:hint="default"/>
+        <w:sz w:val="20"/>
+      </w:rPr>
+    </w:lvl>
+    <w:lvl w:ilvl="8" w:tentative="1">
+      <w:start w:val="1"/>
+      <w:numFmt w:val="bullet"/>
+      <w:lvlText w:val=""/>
+      <w:lvlJc w:val="left"/>
+      <w:pPr>
+        <w:tabs>
+          <w:tab w:val="num" w:pos="6480"/>
+        </w:tabs>
+        <w:ind w:left="6480" w:hanging="360"/>
+      </w:pPr>
+      <w:rPr>
+        <w:rFonts w:ascii="Wingdings" w:hAnsi="Wingdings" w:hint="default"/>
+        <w:sz w:val="20"/>
+      </w:rPr>
+    </w:lvl>
+  </w:abstractNum>
+  <w:abstractNum w:abstractNumId="12" w15:restartNumberingAfterBreak="0">
+    <w:nsid w:val="70646CBA"/>
+    <w:multiLevelType w:val="hybridMultilevel"/>
+    <w:tmpl w:val="BC9C5C7A"/>
+    <w:lvl w:ilvl="0" w:tplc="400A0001">
+      <w:start w:val="1"/>
+      <w:numFmt w:val="bullet"/>
+      <w:lvlText w:val=""/>
+      <w:lvlJc w:val="left"/>
+      <w:pPr>
+        <w:ind w:left="720" w:hanging="360"/>
+      </w:pPr>
+      <w:rPr>
+        <w:rFonts w:ascii="Symbol" w:hAnsi="Symbol" w:hint="default"/>
+      </w:rPr>
+    </w:lvl>
+    <w:lvl w:ilvl="1" w:tplc="400A0003" w:tentative="1">
+      <w:start w:val="1"/>
+      <w:numFmt w:val="bullet"/>
+      <w:lvlText w:val="o"/>
+      <w:lvlJc w:val="left"/>
+      <w:pPr>
+        <w:ind w:left="1440" w:hanging="360"/>
+      </w:pPr>
+      <w:rPr>
+        <w:rFonts w:ascii="Courier New" w:hAnsi="Courier New" w:cs="Courier New" w:hint="default"/>
+      </w:rPr>
+    </w:lvl>
+    <w:lvl w:ilvl="2" w:tplc="400A0005" w:tentative="1">
+      <w:start w:val="1"/>
+      <w:numFmt w:val="bullet"/>
+      <w:lvlText w:val=""/>
+      <w:lvlJc w:val="left"/>
+      <w:pPr>
+        <w:ind w:left="2160" w:hanging="360"/>
+      </w:pPr>
+      <w:rPr>
+        <w:rFonts w:ascii="Wingdings" w:hAnsi="Wingdings" w:hint="default"/>
+      </w:rPr>
+    </w:lvl>
+    <w:lvl w:ilvl="3" w:tplc="400A0001" w:tentative="1">
+      <w:start w:val="1"/>
+      <w:numFmt w:val="bullet"/>
+      <w:lvlText w:val=""/>
+      <w:lvlJc w:val="left"/>
+      <w:pPr>
+        <w:ind w:left="2880" w:hanging="360"/>
+      </w:pPr>
+      <w:rPr>
+        <w:rFonts w:ascii="Symbol" w:hAnsi="Symbol" w:hint="default"/>
+      </w:rPr>
+    </w:lvl>
+    <w:lvl w:ilvl="4" w:tplc="400A0003" w:tentative="1">
+      <w:start w:val="1"/>
+      <w:numFmt w:val="bullet"/>
+      <w:lvlText w:val="o"/>
+      <w:lvlJc w:val="left"/>
+      <w:pPr>
+        <w:ind w:left="3600" w:hanging="360"/>
+      </w:pPr>
+      <w:rPr>
+        <w:rFonts w:ascii="Courier New" w:hAnsi="Courier New" w:cs="Courier New" w:hint="default"/>
+      </w:rPr>
+    </w:lvl>
+    <w:lvl w:ilvl="5" w:tplc="400A0005" w:tentative="1">
+      <w:start w:val="1"/>
+      <w:numFmt w:val="bullet"/>
+      <w:lvlText w:val=""/>
+      <w:lvlJc w:val="left"/>
+      <w:pPr>
+        <w:ind w:left="4320" w:hanging="360"/>
+      </w:pPr>
+      <w:rPr>
+        <w:rFonts w:ascii="Wingdings" w:hAnsi="Wingdings" w:hint="default"/>
+      </w:rPr>
+    </w:lvl>
+    <w:lvl w:ilvl="6" w:tplc="400A0001" w:tentative="1">
+      <w:start w:val="1"/>
+      <w:numFmt w:val="bullet"/>
+      <w:lvlText w:val=""/>
+      <w:lvlJc w:val="left"/>
+      <w:pPr>
+        <w:ind w:left="5040" w:hanging="360"/>
+      </w:pPr>
+      <w:rPr>
+        <w:rFonts w:ascii="Symbol" w:hAnsi="Symbol" w:hint="default"/>
+      </w:rPr>
+    </w:lvl>
+    <w:lvl w:ilvl="7" w:tplc="400A0003" w:tentative="1">
+      <w:start w:val="1"/>
+      <w:numFmt w:val="bullet"/>
+      <w:lvlText w:val="o"/>
+      <w:lvlJc w:val="left"/>
+      <w:pPr>
+        <w:ind w:left="5760" w:hanging="360"/>
+      </w:pPr>
+      <w:rPr>
+        <w:rFonts w:ascii="Courier New" w:hAnsi="Courier New" w:cs="Courier New" w:hint="default"/>
+      </w:rPr>
+    </w:lvl>
+    <w:lvl w:ilvl="8" w:tplc="400A0005" w:tentative="1">
+      <w:start w:val="1"/>
+      <w:numFmt w:val="bullet"/>
+      <w:lvlText w:val=""/>
+      <w:lvlJc w:val="left"/>
+      <w:pPr>
+        <w:ind w:left="6480" w:hanging="360"/>
+      </w:pPr>
+      <w:rPr>
+        <w:rFonts w:ascii="Wingdings" w:hAnsi="Wingdings" w:hint="default"/>
+      </w:rPr>
+    </w:lvl>
+  </w:abstractNum>
   <w:abstractNum w:abstractNumId="13" w15:restartNumberingAfterBreak="0">
+    <w:nsid w:val="7700129D"/>
+    <w:multiLevelType w:val="multilevel"/>
+    <w:tmpl w:val="A774B62C"/>
+    <w:lvl w:ilvl="0">
+      <w:start w:val="1"/>
+      <w:numFmt w:val="bullet"/>
+      <w:lvlText w:val="●"/>
+      <w:lvlJc w:val="left"/>
+      <w:pPr>
+        <w:ind w:left="465" w:hanging="360"/>
+      </w:pPr>
+      <w:rPr>
+        <w:rFonts w:ascii="Arial" w:eastAsia="Arial" w:hAnsi="Arial" w:cs="Arial"/>
+        <w:b w:val="0"/>
+        <w:bCs w:val="0"/>
+        <w:i w:val="0"/>
+        <w:iCs w:val="0"/>
+        <w:smallCaps w:val="0"/>
+        <w:strike w:val="0"/>
+        <w:color w:val="000000"/>
+        <w:sz w:val="22"/>
+        <w:szCs w:val="22"/>
+        <w:u w:val="none"/>
+        <w:shd w:val="clear" w:color="auto" w:fill="auto"/>
+        <w:vertAlign w:val="baseline"/>
+      </w:rPr>
+    </w:lvl>
+    <w:lvl w:ilvl="1">
+      <w:start w:val="1"/>
+      <w:numFmt w:val="bullet"/>
+      <w:lvlText w:val="○"/>
+      <w:lvlJc w:val="left"/>
+      <w:pPr>
+        <w:ind w:left="1440" w:hanging="360"/>
+      </w:pPr>
+      <w:rPr>
+        <w:rFonts w:ascii="Arial" w:eastAsia="Arial" w:hAnsi="Arial" w:cs="Arial"/>
+        <w:b w:val="0"/>
+        <w:bCs w:val="0"/>
+        <w:i w:val="0"/>
+        <w:iCs w:val="0"/>
+        <w:smallCaps w:val="0"/>
+        <w:strike w:val="0"/>
+        <w:color w:val="000000"/>
+        <w:sz w:val="22"/>
+        <w:szCs w:val="22"/>
+        <w:u w:val="none"/>
+        <w:shd w:val="clear" w:color="auto" w:fill="auto"/>
+        <w:vertAlign w:val="baseline"/>
+      </w:rPr>
+    </w:lvl>
+    <w:lvl w:ilvl="2">
+      <w:start w:val="1"/>
+      <w:numFmt w:val="bullet"/>
+      <w:lvlText w:val="■"/>
+      <w:lvlJc w:val="left"/>
+      <w:pPr>
+        <w:ind w:left="2160" w:hanging="360"/>
+      </w:pPr>
+      <w:rPr>
+        <w:rFonts w:ascii="Arial" w:eastAsia="Arial" w:hAnsi="Arial" w:cs="Arial"/>
+        <w:b w:val="0"/>
+        <w:bCs w:val="0"/>
+        <w:i w:val="0"/>
+        <w:iCs w:val="0"/>
+        <w:smallCaps w:val="0"/>
+        <w:strike w:val="0"/>
+        <w:color w:val="000000"/>
+        <w:sz w:val="22"/>
+        <w:szCs w:val="22"/>
+        <w:u w:val="none"/>
+        <w:shd w:val="clear" w:color="auto" w:fill="auto"/>
+        <w:vertAlign w:val="baseline"/>
+      </w:rPr>
+    </w:lvl>
+    <w:lvl w:ilvl="3">
+      <w:start w:val="1"/>
+      <w:numFmt w:val="bullet"/>
+      <w:lvlText w:val="■"/>
+      <w:lvlJc w:val="left"/>
+      <w:pPr>
+        <w:ind w:left="2880" w:hanging="360"/>
+      </w:pPr>
+      <w:rPr>
+        <w:rFonts w:ascii="Arial" w:eastAsia="Arial" w:hAnsi="Arial" w:cs="Arial"/>
+        <w:b w:val="0"/>
+        <w:bCs w:val="0"/>
+        <w:i w:val="0"/>
+        <w:iCs w:val="0"/>
+        <w:smallCaps w:val="0"/>
+        <w:strike w:val="0"/>
+        <w:color w:val="000000"/>
+        <w:sz w:val="22"/>
+        <w:szCs w:val="22"/>
+        <w:u w:val="none"/>
+        <w:shd w:val="clear" w:color="auto" w:fill="auto"/>
+        <w:vertAlign w:val="baseline"/>
+      </w:rPr>
+    </w:lvl>
+    <w:lvl w:ilvl="4">
+      <w:start w:val="1"/>
+      <w:numFmt w:val="bullet"/>
+      <w:lvlText w:val="■"/>
+      <w:lvlJc w:val="left"/>
+      <w:pPr>
+        <w:ind w:left="3600" w:hanging="360"/>
+      </w:pPr>
+      <w:rPr>
+        <w:rFonts w:ascii="Arial" w:eastAsia="Arial" w:hAnsi="Arial" w:cs="Arial"/>
+        <w:b w:val="0"/>
+        <w:bCs w:val="0"/>
+        <w:i w:val="0"/>
+        <w:iCs w:val="0"/>
+        <w:smallCaps w:val="0"/>
+        <w:strike w:val="0"/>
+        <w:color w:val="000000"/>
+        <w:sz w:val="22"/>
+        <w:szCs w:val="22"/>
+        <w:u w:val="none"/>
+        <w:shd w:val="clear" w:color="auto" w:fill="auto"/>
+        <w:vertAlign w:val="baseline"/>
+      </w:rPr>
+    </w:lvl>
+    <w:lvl w:ilvl="5">
+      <w:start w:val="1"/>
+      <w:numFmt w:val="bullet"/>
+      <w:lvlText w:val="■"/>
+      <w:lvlJc w:val="left"/>
+      <w:pPr>
+        <w:ind w:left="4320" w:hanging="360"/>
+      </w:pPr>
+      <w:rPr>
+        <w:rFonts w:ascii="Arial" w:eastAsia="Arial" w:hAnsi="Arial" w:cs="Arial"/>
+        <w:b w:val="0"/>
+        <w:bCs w:val="0"/>
+        <w:i w:val="0"/>
+        <w:iCs w:val="0"/>
+        <w:smallCaps w:val="0"/>
+        <w:strike w:val="0"/>
+        <w:color w:val="000000"/>
+        <w:sz w:val="22"/>
+        <w:szCs w:val="22"/>
+        <w:u w:val="none"/>
+        <w:shd w:val="clear" w:color="auto" w:fill="auto"/>
+        <w:vertAlign w:val="baseline"/>
+      </w:rPr>
+    </w:lvl>
+    <w:lvl w:ilvl="6">
+      <w:start w:val="1"/>
+      <w:numFmt w:val="bullet"/>
+      <w:lvlText w:val="■"/>
+      <w:lvlJc w:val="left"/>
+      <w:pPr>
+        <w:ind w:left="5040" w:hanging="360"/>
+      </w:pPr>
+      <w:rPr>
+        <w:rFonts w:ascii="Arial" w:eastAsia="Arial" w:hAnsi="Arial" w:cs="Arial"/>
+        <w:b w:val="0"/>
+        <w:bCs w:val="0"/>
+        <w:i w:val="0"/>
+        <w:iCs w:val="0"/>
+        <w:smallCaps w:val="0"/>
+        <w:strike w:val="0"/>
+        <w:color w:val="000000"/>
+        <w:sz w:val="22"/>
+        <w:szCs w:val="22"/>
+        <w:u w:val="none"/>
+        <w:shd w:val="clear" w:color="auto" w:fill="auto"/>
+        <w:vertAlign w:val="baseline"/>
+      </w:rPr>
+    </w:lvl>
+    <w:lvl w:ilvl="7">
+      <w:start w:val="1"/>
+      <w:numFmt w:val="bullet"/>
+      <w:lvlText w:val="■"/>
+      <w:lvlJc w:val="left"/>
+      <w:pPr>
+        <w:ind w:left="5760" w:hanging="360"/>
+      </w:pPr>
+      <w:rPr>
+        <w:rFonts w:ascii="Arial" w:eastAsia="Arial" w:hAnsi="Arial" w:cs="Arial"/>
+        <w:b w:val="0"/>
+        <w:bCs w:val="0"/>
+        <w:i w:val="0"/>
+        <w:iCs w:val="0"/>
+        <w:smallCaps w:val="0"/>
+        <w:strike w:val="0"/>
+        <w:color w:val="000000"/>
+        <w:sz w:val="22"/>
+        <w:szCs w:val="22"/>
+        <w:u w:val="none"/>
+        <w:shd w:val="clear" w:color="auto" w:fill="auto"/>
+        <w:vertAlign w:val="baseline"/>
+      </w:rPr>
+    </w:lvl>
+    <w:lvl w:ilvl="8">
+      <w:start w:val="1"/>
+      <w:numFmt w:val="bullet"/>
+      <w:lvlText w:val="■"/>
+      <w:lvlJc w:val="left"/>
+      <w:pPr>
+        <w:ind w:left="6480" w:hanging="360"/>
+      </w:pPr>
+      <w:rPr>
+        <w:rFonts w:ascii="Arial" w:eastAsia="Arial" w:hAnsi="Arial" w:cs="Arial"/>
+        <w:b w:val="0"/>
+        <w:bCs w:val="0"/>
+        <w:i w:val="0"/>
+        <w:iCs w:val="0"/>
+        <w:smallCaps w:val="0"/>
+        <w:strike w:val="0"/>
+        <w:color w:val="000000"/>
+        <w:sz w:val="22"/>
+        <w:szCs w:val="22"/>
+        <w:u w:val="none"/>
+        <w:shd w:val="clear" w:color="auto" w:fill="auto"/>
+        <w:vertAlign w:val="baseline"/>
+      </w:rPr>
+    </w:lvl>
+  </w:abstractNum>
+  <w:abstractNum w:abstractNumId="14" w15:restartNumberingAfterBreak="0">
+    <w:nsid w:val="79586CD1"/>
+    <w:multiLevelType w:val="multilevel"/>
+    <w:tmpl w:val="B99AE416"/>
+    <w:lvl w:ilvl="0">
+      <w:start w:val="1"/>
+      <w:numFmt w:val="bullet"/>
+      <w:lvlText w:val="●"/>
+      <w:lvlJc w:val="left"/>
+      <w:pPr>
+        <w:ind w:left="465" w:hanging="360"/>
+      </w:pPr>
+      <w:rPr>
+        <w:rFonts w:ascii="Arial" w:eastAsia="Arial" w:hAnsi="Arial" w:cs="Arial"/>
+        <w:b w:val="0"/>
+        <w:bCs w:val="0"/>
+        <w:i w:val="0"/>
+        <w:iCs w:val="0"/>
+        <w:smallCaps w:val="0"/>
+        <w:strike w:val="0"/>
+        <w:color w:val="000000"/>
+        <w:sz w:val="22"/>
+        <w:szCs w:val="22"/>
+        <w:u w:val="none"/>
+        <w:shd w:val="clear" w:color="auto" w:fill="auto"/>
+        <w:vertAlign w:val="baseline"/>
+      </w:rPr>
+    </w:lvl>
+    <w:lvl w:ilvl="1">
+      <w:start w:val="1"/>
+      <w:numFmt w:val="bullet"/>
+      <w:lvlText w:val="○"/>
+      <w:lvlJc w:val="left"/>
+      <w:pPr>
+        <w:ind w:left="1440" w:hanging="360"/>
+      </w:pPr>
+      <w:rPr>
+        <w:rFonts w:ascii="Arial" w:eastAsia="Arial" w:hAnsi="Arial" w:cs="Arial"/>
+        <w:b w:val="0"/>
+        <w:bCs w:val="0"/>
+        <w:i w:val="0"/>
+        <w:iCs w:val="0"/>
+        <w:smallCaps w:val="0"/>
+        <w:strike w:val="0"/>
+        <w:color w:val="000000"/>
+        <w:sz w:val="22"/>
+        <w:szCs w:val="22"/>
+        <w:u w:val="none"/>
+        <w:shd w:val="clear" w:color="auto" w:fill="auto"/>
+        <w:vertAlign w:val="baseline"/>
+      </w:rPr>
+    </w:lvl>
+    <w:lvl w:ilvl="2">
+      <w:start w:val="1"/>
+      <w:numFmt w:val="bullet"/>
+      <w:lvlText w:val="■"/>
+      <w:lvlJc w:val="left"/>
+      <w:pPr>
+        <w:ind w:left="2160" w:hanging="360"/>
+      </w:pPr>
+      <w:rPr>
+        <w:rFonts w:ascii="Arial" w:eastAsia="Arial" w:hAnsi="Arial" w:cs="Arial"/>
+        <w:b w:val="0"/>
+        <w:bCs w:val="0"/>
+        <w:i w:val="0"/>
+        <w:iCs w:val="0"/>
+        <w:smallCaps w:val="0"/>
+        <w:strike w:val="0"/>
+        <w:color w:val="000000"/>
+        <w:sz w:val="22"/>
+        <w:szCs w:val="22"/>
+        <w:u w:val="none"/>
+        <w:shd w:val="clear" w:color="auto" w:fill="auto"/>
+        <w:vertAlign w:val="baseline"/>
+      </w:rPr>
+    </w:lvl>
+    <w:lvl w:ilvl="3">
+      <w:start w:val="1"/>
+      <w:numFmt w:val="bullet"/>
+      <w:lvlText w:val="■"/>
+      <w:lvlJc w:val="left"/>
+      <w:pPr>
+        <w:ind w:left="2880" w:hanging="360"/>
+      </w:pPr>
+      <w:rPr>
+        <w:rFonts w:ascii="Arial" w:eastAsia="Arial" w:hAnsi="Arial" w:cs="Arial"/>
+        <w:b w:val="0"/>
+        <w:bCs w:val="0"/>
+        <w:i w:val="0"/>
+        <w:iCs w:val="0"/>
+        <w:smallCaps w:val="0"/>
+        <w:strike w:val="0"/>
+        <w:color w:val="000000"/>
+        <w:sz w:val="22"/>
+        <w:szCs w:val="22"/>
+        <w:u w:val="none"/>
+        <w:shd w:val="clear" w:color="auto" w:fill="auto"/>
+        <w:vertAlign w:val="baseline"/>
+      </w:rPr>
+    </w:lvl>
+    <w:lvl w:ilvl="4">
+      <w:start w:val="1"/>
+      <w:numFmt w:val="bullet"/>
+      <w:lvlText w:val="■"/>
+      <w:lvlJc w:val="left"/>
+      <w:pPr>
+        <w:ind w:left="3600" w:hanging="360"/>
+      </w:pPr>
+      <w:rPr>
+        <w:rFonts w:ascii="Arial" w:eastAsia="Arial" w:hAnsi="Arial" w:cs="Arial"/>
+        <w:b w:val="0"/>
+        <w:bCs w:val="0"/>
+        <w:i w:val="0"/>
+        <w:iCs w:val="0"/>
+        <w:smallCaps w:val="0"/>
+        <w:strike w:val="0"/>
+        <w:color w:val="000000"/>
+        <w:sz w:val="22"/>
+        <w:szCs w:val="22"/>
+        <w:u w:val="none"/>
+        <w:shd w:val="clear" w:color="auto" w:fill="auto"/>
+        <w:vertAlign w:val="baseline"/>
+      </w:rPr>
+    </w:lvl>
+    <w:lvl w:ilvl="5">
+      <w:start w:val="1"/>
+      <w:numFmt w:val="bullet"/>
+      <w:lvlText w:val="■"/>
+      <w:lvlJc w:val="left"/>
+      <w:pPr>
+        <w:ind w:left="4320" w:hanging="360"/>
+      </w:pPr>
+      <w:rPr>
+        <w:rFonts w:ascii="Arial" w:eastAsia="Arial" w:hAnsi="Arial" w:cs="Arial"/>
+        <w:b w:val="0"/>
+        <w:bCs w:val="0"/>
+        <w:i w:val="0"/>
+        <w:iCs w:val="0"/>
+        <w:smallCaps w:val="0"/>
+        <w:strike w:val="0"/>
+        <w:color w:val="000000"/>
+        <w:sz w:val="22"/>
+        <w:szCs w:val="22"/>
+        <w:u w:val="none"/>
+        <w:shd w:val="clear" w:color="auto" w:fill="auto"/>
+        <w:vertAlign w:val="baseline"/>
+      </w:rPr>
+    </w:lvl>
+    <w:lvl w:ilvl="6">
+      <w:start w:val="1"/>
+      <w:numFmt w:val="bullet"/>
+      <w:lvlText w:val="■"/>
+      <w:lvlJc w:val="left"/>
+      <w:pPr>
+        <w:ind w:left="5040" w:hanging="360"/>
+      </w:pPr>
+      <w:rPr>
+        <w:rFonts w:ascii="Arial" w:eastAsia="Arial" w:hAnsi="Arial" w:cs="Arial"/>
+        <w:b w:val="0"/>
+        <w:bCs w:val="0"/>
+        <w:i w:val="0"/>
+        <w:iCs w:val="0"/>
+        <w:smallCaps w:val="0"/>
+        <w:strike w:val="0"/>
+        <w:color w:val="000000"/>
+        <w:sz w:val="22"/>
+        <w:szCs w:val="22"/>
+        <w:u w:val="none"/>
+        <w:shd w:val="clear" w:color="auto" w:fill="auto"/>
+        <w:vertAlign w:val="baseline"/>
+      </w:rPr>
+    </w:lvl>
+    <w:lvl w:ilvl="7">
+      <w:start w:val="1"/>
+      <w:numFmt w:val="bullet"/>
+      <w:lvlText w:val="■"/>
+      <w:lvlJc w:val="left"/>
+      <w:pPr>
+        <w:ind w:left="5760" w:hanging="360"/>
+      </w:pPr>
+      <w:rPr>
+        <w:rFonts w:ascii="Arial" w:eastAsia="Arial" w:hAnsi="Arial" w:cs="Arial"/>
+        <w:b w:val="0"/>
+        <w:bCs w:val="0"/>
+        <w:i w:val="0"/>
+        <w:iCs w:val="0"/>
+        <w:smallCaps w:val="0"/>
+        <w:strike w:val="0"/>
+        <w:color w:val="000000"/>
+        <w:sz w:val="22"/>
+        <w:szCs w:val="22"/>
+        <w:u w:val="none"/>
+        <w:shd w:val="clear" w:color="auto" w:fill="auto"/>
+        <w:vertAlign w:val="baseline"/>
+      </w:rPr>
+    </w:lvl>
+    <w:lvl w:ilvl="8">
+      <w:start w:val="1"/>
+      <w:numFmt w:val="bullet"/>
+      <w:lvlText w:val="■"/>
+      <w:lvlJc w:val="left"/>
+      <w:pPr>
+        <w:ind w:left="6480" w:hanging="360"/>
+      </w:pPr>
+      <w:rPr>
+        <w:rFonts w:ascii="Arial" w:eastAsia="Arial" w:hAnsi="Arial" w:cs="Arial"/>
+        <w:b w:val="0"/>
+        <w:bCs w:val="0"/>
+        <w:i w:val="0"/>
+        <w:iCs w:val="0"/>
+        <w:smallCaps w:val="0"/>
+        <w:strike w:val="0"/>
+        <w:color w:val="000000"/>
+        <w:sz w:val="22"/>
+        <w:szCs w:val="22"/>
+        <w:u w:val="none"/>
+        <w:shd w:val="clear" w:color="auto" w:fill="auto"/>
+        <w:vertAlign w:val="baseline"/>
+      </w:rPr>
+    </w:lvl>
+  </w:abstractNum>
+  <w:abstractNum w:abstractNumId="15" w15:restartNumberingAfterBreak="0">
     <w:nsid w:val="7BDA2D2F"/>
     <w:multiLevelType w:val="multilevel"/>
     <w:tmpl w:val="54222346"/>
@@ -6897,25 +9244,25 @@
     </w:lvl>
   </w:abstractNum>
   <w:num w:numId="1" w16cid:durableId="1285692316">
-    <w:abstractNumId w:val="11"/>
+    <w:abstractNumId w:val="12"/>
   </w:num>
   <w:num w:numId="2" w16cid:durableId="967052676">
-    <w:abstractNumId w:val="6"/>
+    <w:abstractNumId w:val="7"/>
   </w:num>
   <w:num w:numId="3" w16cid:durableId="1169246334">
-    <w:abstractNumId w:val="13"/>
+    <w:abstractNumId w:val="15"/>
   </w:num>
   <w:num w:numId="4" w16cid:durableId="349989933">
     <w:abstractNumId w:val="1"/>
   </w:num>
   <w:num w:numId="5" w16cid:durableId="2121532888">
-    <w:abstractNumId w:val="8"/>
+    <w:abstractNumId w:val="9"/>
   </w:num>
   <w:num w:numId="6" w16cid:durableId="1175458488">
-    <w:abstractNumId w:val="10"/>
+    <w:abstractNumId w:val="11"/>
   </w:num>
   <w:num w:numId="7" w16cid:durableId="2090927593">
-    <w:abstractNumId w:val="7"/>
+    <w:abstractNumId w:val="8"/>
   </w:num>
   <w:num w:numId="8" w16cid:durableId="1096823365">
     <w:abstractNumId w:val="2"/>
@@ -6924,18 +9271,24 @@
     <w:abstractNumId w:val="3"/>
   </w:num>
   <w:num w:numId="10" w16cid:durableId="1205948725">
-    <w:abstractNumId w:val="12"/>
+    <w:abstractNumId w:val="14"/>
   </w:num>
   <w:num w:numId="11" w16cid:durableId="1179542083">
     <w:abstractNumId w:val="0"/>
   </w:num>
   <w:num w:numId="12" w16cid:durableId="1996449380">
-    <w:abstractNumId w:val="9"/>
+    <w:abstractNumId w:val="10"/>
   </w:num>
   <w:num w:numId="13" w16cid:durableId="116220854">
     <w:abstractNumId w:val="4"/>
   </w:num>
   <w:num w:numId="14" w16cid:durableId="1124540011">
+    <w:abstractNumId w:val="6"/>
+  </w:num>
+  <w:num w:numId="15" w16cid:durableId="1861581687">
+    <w:abstractNumId w:val="13"/>
+  </w:num>
+  <w:num w:numId="16" w16cid:durableId="1701858196">
     <w:abstractNumId w:val="5"/>
   </w:num>
 </w:numbering>

</xml_diff>

<commit_message>
docs:franz/ "acta de cierre formal ,lecciones aprendidas ,informe de validacion de producto ,evaluacion de las 4p y value stream mapping y plan de escalado final""
</commit_message>
<xml_diff>
--- a/documentos/Documentacion_Proyecto.docx
+++ b/documentos/Documentacion_Proyecto.docx
@@ -6199,6 +6199,1513 @@
     </w:tbl>
     <w:p/>
     <w:p/>
+    <w:p>
+      <w:pPr>
+        <w:widowControl w:val="0"/>
+        <w:pBdr>
+          <w:top w:val="nil"/>
+          <w:left w:val="nil"/>
+          <w:bottom w:val="nil"/>
+          <w:right w:val="nil"/>
+          <w:between w:val="nil"/>
+        </w:pBdr>
+        <w:spacing w:before="240" w:after="120" w:line="275" w:lineRule="auto"/>
+        <w:outlineLvl w:val="2"/>
+        <w:rPr>
+          <w:rFonts w:ascii="Arial" w:eastAsia="Arial" w:hAnsi="Arial" w:cs="Arial"/>
+          <w:b/>
+          <w:bCs/>
+          <w:color w:val="1F1F1F"/>
+          <w:kern w:val="0"/>
+          <w:sz w:val="22"/>
+          <w:szCs w:val="22"/>
+          <w:lang w:eastAsia="es-BO"/>
+          <w14:ligatures w14:val="none"/>
+        </w:rPr>
+      </w:pPr>
+      <w:r>
+        <w:rPr>
+          <w:rFonts w:ascii="Arial" w:eastAsia="Arial" w:hAnsi="Arial" w:cs="Arial"/>
+          <w:b/>
+          <w:bCs/>
+          <w:color w:val="1F1F1F"/>
+          <w:kern w:val="0"/>
+          <w:sz w:val="22"/>
+          <w:szCs w:val="22"/>
+          <w:lang w:eastAsia="es-BO"/>
+          <w14:ligatures w14:val="none"/>
+        </w:rPr>
+        <w:t>Acta de Cierre</w:t>
+      </w:r>
+    </w:p>
+    <w:p>
+      <w:pPr>
+        <w:widowControl w:val="0"/>
+        <w:pBdr>
+          <w:top w:val="nil"/>
+          <w:left w:val="nil"/>
+          <w:bottom w:val="nil"/>
+          <w:right w:val="nil"/>
+          <w:between w:val="nil"/>
+        </w:pBdr>
+        <w:spacing w:before="240" w:after="120" w:line="275" w:lineRule="auto"/>
+        <w:rPr>
+          <w:rFonts w:ascii="Arial" w:eastAsia="Arial" w:hAnsi="Arial" w:cs="Arial"/>
+          <w:color w:val="1F1F1F"/>
+          <w:kern w:val="0"/>
+          <w:sz w:val="22"/>
+          <w:szCs w:val="22"/>
+          <w:lang w:eastAsia="es-BO"/>
+          <w14:ligatures w14:val="none"/>
+        </w:rPr>
+      </w:pPr>
+      <w:r>
+        <w:rPr>
+          <w:rFonts w:ascii="Arial" w:eastAsia="Arial" w:hAnsi="Arial" w:cs="Arial"/>
+          <w:color w:val="1F1F1F"/>
+          <w:kern w:val="0"/>
+          <w:sz w:val="22"/>
+          <w:szCs w:val="22"/>
+          <w:lang w:eastAsia="es-BO"/>
+          <w14:ligatures w14:val="none"/>
+        </w:rPr>
+        <w:t>El proyecto concluye con la entrega formal del MVP funcional tras los 6 meses de ejecución acordados. Este documento formal de conformidad certifica que:</w:t>
+      </w:r>
+    </w:p>
+    <w:p>
+      <w:pPr>
+        <w:widowControl w:val="0"/>
+        <w:numPr>
+          <w:ilvl w:val="0"/>
+          <w:numId w:val="17"/>
+        </w:numPr>
+        <w:pBdr>
+          <w:top w:val="nil"/>
+          <w:left w:val="nil"/>
+          <w:bottom w:val="nil"/>
+          <w:right w:val="nil"/>
+          <w:between w:val="nil"/>
+        </w:pBdr>
+        <w:spacing w:before="240" w:after="0" w:line="275" w:lineRule="auto"/>
+        <w:rPr>
+          <w:rFonts w:ascii="Arial" w:eastAsia="Arial" w:hAnsi="Arial" w:cs="Arial"/>
+          <w:kern w:val="0"/>
+          <w:sz w:val="22"/>
+          <w:szCs w:val="22"/>
+          <w:lang w:eastAsia="es-BO"/>
+          <w14:ligatures w14:val="none"/>
+        </w:rPr>
+      </w:pPr>
+      <w:r>
+        <w:rPr>
+          <w:rFonts w:ascii="Arial" w:eastAsia="Arial" w:hAnsi="Arial" w:cs="Arial"/>
+          <w:color w:val="1F1F1F"/>
+          <w:kern w:val="0"/>
+          <w:sz w:val="22"/>
+          <w:szCs w:val="22"/>
+          <w:lang w:eastAsia="es-BO"/>
+          <w14:ligatures w14:val="none"/>
+        </w:rPr>
+        <w:t>El software ha sido instalado con éxito en los servidores asignados por el área de sistemas de la Alcaldía de Sucre.</w:t>
+      </w:r>
+    </w:p>
+    <w:p>
+      <w:pPr>
+        <w:widowControl w:val="0"/>
+        <w:numPr>
+          <w:ilvl w:val="0"/>
+          <w:numId w:val="17"/>
+        </w:numPr>
+        <w:pBdr>
+          <w:top w:val="nil"/>
+          <w:left w:val="nil"/>
+          <w:bottom w:val="nil"/>
+          <w:right w:val="nil"/>
+          <w:between w:val="nil"/>
+        </w:pBdr>
+        <w:spacing w:before="240" w:after="0" w:line="275" w:lineRule="auto"/>
+        <w:rPr>
+          <w:rFonts w:ascii="Arial" w:eastAsia="Arial" w:hAnsi="Arial" w:cs="Arial"/>
+          <w:kern w:val="0"/>
+          <w:sz w:val="22"/>
+          <w:szCs w:val="22"/>
+          <w:lang w:eastAsia="es-BO"/>
+          <w14:ligatures w14:val="none"/>
+        </w:rPr>
+      </w:pPr>
+      <w:r>
+        <w:rPr>
+          <w:rFonts w:ascii="Arial" w:eastAsia="Arial" w:hAnsi="Arial" w:cs="Arial"/>
+          <w:color w:val="1F1F1F"/>
+          <w:kern w:val="0"/>
+          <w:sz w:val="22"/>
+          <w:szCs w:val="22"/>
+          <w:lang w:eastAsia="es-BO"/>
+          <w14:ligatures w14:val="none"/>
+        </w:rPr>
+        <w:t>Se ha realizado la transferencia de conocimientos técnica y operativa mediante 3 sesiones presenciales de capacitación al personal de la Dirección de Ingresos y los supervisores de campo.</w:t>
+      </w:r>
+    </w:p>
+    <w:p>
+      <w:pPr>
+        <w:widowControl w:val="0"/>
+        <w:numPr>
+          <w:ilvl w:val="0"/>
+          <w:numId w:val="17"/>
+        </w:numPr>
+        <w:pBdr>
+          <w:top w:val="nil"/>
+          <w:left w:val="nil"/>
+          <w:bottom w:val="nil"/>
+          <w:right w:val="nil"/>
+          <w:between w:val="nil"/>
+        </w:pBdr>
+        <w:spacing w:before="240" w:after="0" w:line="275" w:lineRule="auto"/>
+        <w:rPr>
+          <w:rFonts w:ascii="Arial" w:eastAsia="Arial" w:hAnsi="Arial" w:cs="Arial"/>
+          <w:kern w:val="0"/>
+          <w:sz w:val="22"/>
+          <w:szCs w:val="22"/>
+          <w:lang w:eastAsia="es-BO"/>
+          <w14:ligatures w14:val="none"/>
+        </w:rPr>
+      </w:pPr>
+      <w:r>
+        <w:rPr>
+          <w:rFonts w:ascii="Arial" w:eastAsia="Arial" w:hAnsi="Arial" w:cs="Arial"/>
+          <w:color w:val="1F1F1F"/>
+          <w:kern w:val="0"/>
+          <w:sz w:val="22"/>
+          <w:szCs w:val="22"/>
+          <w:lang w:eastAsia="es-BO"/>
+          <w14:ligatures w14:val="none"/>
+        </w:rPr>
+        <w:t>El sistema cumple de manera satisfactoria con el 100% de las funciones administrativas de registro de comerciantes, asignación de puestos, control de cobros, alertas sanitarias y mapas de geolocalización.</w:t>
+      </w:r>
+    </w:p>
+    <w:p>
+      <w:pPr>
+        <w:widowControl w:val="0"/>
+        <w:numPr>
+          <w:ilvl w:val="0"/>
+          <w:numId w:val="17"/>
+        </w:numPr>
+        <w:pBdr>
+          <w:top w:val="nil"/>
+          <w:left w:val="nil"/>
+          <w:bottom w:val="nil"/>
+          <w:right w:val="nil"/>
+          <w:between w:val="nil"/>
+        </w:pBdr>
+        <w:spacing w:before="240" w:after="120" w:line="275" w:lineRule="auto"/>
+        <w:rPr>
+          <w:rFonts w:ascii="Arial" w:eastAsia="Arial" w:hAnsi="Arial" w:cs="Arial"/>
+          <w:kern w:val="0"/>
+          <w:sz w:val="22"/>
+          <w:szCs w:val="22"/>
+          <w:lang w:eastAsia="es-BO"/>
+          <w14:ligatures w14:val="none"/>
+        </w:rPr>
+      </w:pPr>
+      <w:r>
+        <w:rPr>
+          <w:rFonts w:ascii="Arial" w:eastAsia="Arial" w:hAnsi="Arial" w:cs="Arial"/>
+          <w:color w:val="1F1F1F"/>
+          <w:kern w:val="0"/>
+          <w:sz w:val="22"/>
+          <w:szCs w:val="22"/>
+          <w:lang w:eastAsia="es-BO"/>
+          <w14:ligatures w14:val="none"/>
+        </w:rPr>
+        <w:t>La Alcaldía de Sucre acepta formalmente el producto de software, firmando la recepción definitiva y dando el proyecto como cerrado y finalizado con éxito a partir de la fecha.</w:t>
+      </w:r>
+    </w:p>
+    <w:p>
+      <w:pPr>
+        <w:widowControl w:val="0"/>
+        <w:pBdr>
+          <w:top w:val="nil"/>
+          <w:left w:val="nil"/>
+          <w:bottom w:val="nil"/>
+          <w:right w:val="nil"/>
+          <w:between w:val="nil"/>
+        </w:pBdr>
+        <w:spacing w:before="240" w:after="120" w:line="275" w:lineRule="auto"/>
+        <w:outlineLvl w:val="2"/>
+        <w:rPr>
+          <w:rFonts w:ascii="Arial" w:eastAsia="Arial" w:hAnsi="Arial" w:cs="Arial"/>
+          <w:b/>
+          <w:bCs/>
+          <w:color w:val="1F1F1F"/>
+          <w:kern w:val="0"/>
+          <w:sz w:val="22"/>
+          <w:szCs w:val="22"/>
+          <w:lang w:eastAsia="es-BO"/>
+          <w14:ligatures w14:val="none"/>
+        </w:rPr>
+      </w:pPr>
+      <w:r>
+        <w:rPr>
+          <w:rFonts w:ascii="Arial" w:eastAsia="Arial" w:hAnsi="Arial" w:cs="Arial"/>
+          <w:b/>
+          <w:bCs/>
+          <w:color w:val="1F1F1F"/>
+          <w:kern w:val="0"/>
+          <w:sz w:val="22"/>
+          <w:szCs w:val="22"/>
+          <w:lang w:eastAsia="es-BO"/>
+          <w14:ligatures w14:val="none"/>
+        </w:rPr>
+        <w:t>Lecciones Aprendidas</w:t>
+      </w:r>
+    </w:p>
+    <w:p>
+      <w:pPr>
+        <w:widowControl w:val="0"/>
+        <w:pBdr>
+          <w:top w:val="nil"/>
+          <w:left w:val="nil"/>
+          <w:bottom w:val="nil"/>
+          <w:right w:val="nil"/>
+          <w:between w:val="nil"/>
+        </w:pBdr>
+        <w:spacing w:before="240" w:after="120" w:line="275" w:lineRule="auto"/>
+        <w:rPr>
+          <w:rFonts w:ascii="Arial" w:eastAsia="Arial" w:hAnsi="Arial" w:cs="Arial"/>
+          <w:color w:val="1F1F1F"/>
+          <w:kern w:val="0"/>
+          <w:sz w:val="22"/>
+          <w:szCs w:val="22"/>
+          <w:lang w:eastAsia="es-BO"/>
+          <w14:ligatures w14:val="none"/>
+        </w:rPr>
+      </w:pPr>
+      <w:r>
+        <w:rPr>
+          <w:rFonts w:ascii="Arial" w:eastAsia="Arial" w:hAnsi="Arial" w:cs="Arial"/>
+          <w:color w:val="1F1F1F"/>
+          <w:kern w:val="0"/>
+          <w:sz w:val="22"/>
+          <w:szCs w:val="22"/>
+          <w:lang w:eastAsia="es-BO"/>
+          <w14:ligatures w14:val="none"/>
+        </w:rPr>
+        <w:t>Se extrajeron conclusiones fundamentales para guiar futuros proyectos de desarrollo de software para el sector público:</w:t>
+      </w:r>
+    </w:p>
+    <w:p>
+      <w:pPr>
+        <w:widowControl w:val="0"/>
+        <w:numPr>
+          <w:ilvl w:val="0"/>
+          <w:numId w:val="18"/>
+        </w:numPr>
+        <w:pBdr>
+          <w:top w:val="nil"/>
+          <w:left w:val="nil"/>
+          <w:bottom w:val="nil"/>
+          <w:right w:val="nil"/>
+          <w:between w:val="nil"/>
+        </w:pBdr>
+        <w:spacing w:before="240" w:after="0" w:line="275" w:lineRule="auto"/>
+        <w:rPr>
+          <w:rFonts w:ascii="Arial" w:eastAsia="Arial" w:hAnsi="Arial" w:cs="Arial"/>
+          <w:kern w:val="0"/>
+          <w:sz w:val="22"/>
+          <w:szCs w:val="22"/>
+          <w:lang w:eastAsia="es-BO"/>
+          <w14:ligatures w14:val="none"/>
+        </w:rPr>
+      </w:pPr>
+      <w:r>
+        <w:rPr>
+          <w:rFonts w:ascii="Arial" w:eastAsia="Arial" w:hAnsi="Arial" w:cs="Arial"/>
+          <w:b/>
+          <w:bCs/>
+          <w:color w:val="1F1F1F"/>
+          <w:kern w:val="0"/>
+          <w:sz w:val="22"/>
+          <w:szCs w:val="22"/>
+          <w:lang w:eastAsia="es-BO"/>
+          <w14:ligatures w14:val="none"/>
+        </w:rPr>
+        <w:t>Evitar la dependencia de personal:</w:t>
+      </w:r>
+      <w:r>
+        <w:rPr>
+          <w:rFonts w:ascii="Arial" w:eastAsia="Arial" w:hAnsi="Arial" w:cs="Arial"/>
+          <w:color w:val="1F1F1F"/>
+          <w:kern w:val="0"/>
+          <w:sz w:val="22"/>
+          <w:szCs w:val="22"/>
+          <w:lang w:eastAsia="es-BO"/>
+          <w14:ligatures w14:val="none"/>
+        </w:rPr>
+        <w:t xml:space="preserve"> Se confirmó que, sin documentación técnica compartida en tiempo real (Wiki), la rotación de personal paraliza el avance del proyecto. A futuro, se establecerá la documentación obligatoria diaria en los contratos.</w:t>
+      </w:r>
+    </w:p>
+    <w:p>
+      <w:pPr>
+        <w:widowControl w:val="0"/>
+        <w:numPr>
+          <w:ilvl w:val="0"/>
+          <w:numId w:val="18"/>
+        </w:numPr>
+        <w:pBdr>
+          <w:top w:val="nil"/>
+          <w:left w:val="nil"/>
+          <w:bottom w:val="nil"/>
+          <w:right w:val="nil"/>
+          <w:between w:val="nil"/>
+        </w:pBdr>
+        <w:spacing w:before="240" w:after="120" w:line="275" w:lineRule="auto"/>
+        <w:rPr>
+          <w:rFonts w:ascii="Arial" w:eastAsia="Arial" w:hAnsi="Arial" w:cs="Arial"/>
+          <w:kern w:val="0"/>
+          <w:sz w:val="22"/>
+          <w:szCs w:val="22"/>
+          <w:lang w:eastAsia="es-BO"/>
+          <w14:ligatures w14:val="none"/>
+        </w:rPr>
+      </w:pPr>
+      <w:r>
+        <w:rPr>
+          <w:rFonts w:ascii="Arial" w:eastAsia="Arial" w:hAnsi="Arial" w:cs="Arial"/>
+          <w:b/>
+          <w:bCs/>
+          <w:color w:val="1F1F1F"/>
+          <w:kern w:val="0"/>
+          <w:sz w:val="22"/>
+          <w:szCs w:val="22"/>
+          <w:lang w:eastAsia="es-BO"/>
+          <w14:ligatures w14:val="none"/>
+        </w:rPr>
+        <w:t>Adaptabilidad Arquitectónica:</w:t>
+      </w:r>
+      <w:r>
+        <w:rPr>
+          <w:rFonts w:ascii="Arial" w:eastAsia="Arial" w:hAnsi="Arial" w:cs="Arial"/>
+          <w:color w:val="1F1F1F"/>
+          <w:kern w:val="0"/>
+          <w:sz w:val="22"/>
+          <w:szCs w:val="22"/>
+          <w:lang w:eastAsia="es-BO"/>
+          <w14:ligatures w14:val="none"/>
+        </w:rPr>
+        <w:t xml:space="preserve"> La capacidad de responder a leyes cambiantes de la alcaldía es tan importante como escribir código rápido. La arquitectura del sistema debe ser flexible y modular para permitir cambios rápidos en las reglas de negocio sin alterar las funciones estables del sistema financiero de cobros.</w:t>
+      </w:r>
+    </w:p>
+    <w:p>
+      <w:pPr>
+        <w:widowControl w:val="0"/>
+        <w:pBdr>
+          <w:top w:val="nil"/>
+          <w:left w:val="nil"/>
+          <w:bottom w:val="nil"/>
+          <w:right w:val="nil"/>
+          <w:between w:val="nil"/>
+        </w:pBdr>
+        <w:spacing w:before="240" w:after="120" w:line="275" w:lineRule="auto"/>
+        <w:outlineLvl w:val="2"/>
+        <w:rPr>
+          <w:rFonts w:ascii="Arial" w:eastAsia="Arial" w:hAnsi="Arial" w:cs="Arial"/>
+          <w:b/>
+          <w:bCs/>
+          <w:color w:val="1F1F1F"/>
+          <w:kern w:val="0"/>
+          <w:sz w:val="22"/>
+          <w:szCs w:val="22"/>
+          <w:lang w:eastAsia="es-BO"/>
+          <w14:ligatures w14:val="none"/>
+        </w:rPr>
+      </w:pPr>
+      <w:r>
+        <w:rPr>
+          <w:rFonts w:ascii="Arial" w:eastAsia="Arial" w:hAnsi="Arial" w:cs="Arial"/>
+          <w:b/>
+          <w:bCs/>
+          <w:color w:val="1F1F1F"/>
+          <w:kern w:val="0"/>
+          <w:sz w:val="22"/>
+          <w:szCs w:val="22"/>
+          <w:lang w:eastAsia="es-BO"/>
+          <w14:ligatures w14:val="none"/>
+        </w:rPr>
+        <w:t>Informe de Validación del Producto</w:t>
+      </w:r>
+    </w:p>
+    <w:p>
+      <w:pPr>
+        <w:widowControl w:val="0"/>
+        <w:pBdr>
+          <w:top w:val="nil"/>
+          <w:left w:val="nil"/>
+          <w:bottom w:val="nil"/>
+          <w:right w:val="nil"/>
+          <w:between w:val="nil"/>
+        </w:pBdr>
+        <w:spacing w:before="240" w:after="120" w:line="275" w:lineRule="auto"/>
+        <w:rPr>
+          <w:rFonts w:ascii="Arial" w:eastAsia="Arial" w:hAnsi="Arial" w:cs="Arial"/>
+          <w:color w:val="1F1F1F"/>
+          <w:kern w:val="0"/>
+          <w:sz w:val="22"/>
+          <w:szCs w:val="22"/>
+          <w:lang w:eastAsia="es-BO"/>
+          <w14:ligatures w14:val="none"/>
+        </w:rPr>
+      </w:pPr>
+      <w:r>
+        <w:rPr>
+          <w:rFonts w:ascii="Arial" w:eastAsia="Arial" w:hAnsi="Arial" w:cs="Arial"/>
+          <w:color w:val="1F1F1F"/>
+          <w:kern w:val="0"/>
+          <w:sz w:val="22"/>
+          <w:szCs w:val="22"/>
+          <w:lang w:eastAsia="es-BO"/>
+          <w14:ligatures w14:val="none"/>
+        </w:rPr>
+        <w:lastRenderedPageBreak/>
+        <w:t>La validación del sistema web se llevó a cabo mediante metodologías rigurosas de pruebas:</w:t>
+      </w:r>
+    </w:p>
+    <w:p>
+      <w:pPr>
+        <w:widowControl w:val="0"/>
+        <w:numPr>
+          <w:ilvl w:val="0"/>
+          <w:numId w:val="19"/>
+        </w:numPr>
+        <w:pBdr>
+          <w:top w:val="nil"/>
+          <w:left w:val="nil"/>
+          <w:bottom w:val="nil"/>
+          <w:right w:val="nil"/>
+          <w:between w:val="nil"/>
+        </w:pBdr>
+        <w:spacing w:before="240" w:after="0" w:line="275" w:lineRule="auto"/>
+        <w:rPr>
+          <w:rFonts w:ascii="Arial" w:eastAsia="Arial" w:hAnsi="Arial" w:cs="Arial"/>
+          <w:kern w:val="0"/>
+          <w:sz w:val="22"/>
+          <w:szCs w:val="22"/>
+          <w:lang w:eastAsia="es-BO"/>
+          <w14:ligatures w14:val="none"/>
+        </w:rPr>
+      </w:pPr>
+      <w:r>
+        <w:rPr>
+          <w:rFonts w:ascii="Arial" w:eastAsia="Arial" w:hAnsi="Arial" w:cs="Arial"/>
+          <w:b/>
+          <w:bCs/>
+          <w:color w:val="1F1F1F"/>
+          <w:kern w:val="0"/>
+          <w:sz w:val="22"/>
+          <w:szCs w:val="22"/>
+          <w:lang w:eastAsia="es-BO"/>
+          <w14:ligatures w14:val="none"/>
+        </w:rPr>
+        <w:t xml:space="preserve">Pruebas de Caja Negra (Black Box </w:t>
+      </w:r>
+      <w:proofErr w:type="spellStart"/>
+      <w:r>
+        <w:rPr>
+          <w:rFonts w:ascii="Arial" w:eastAsia="Arial" w:hAnsi="Arial" w:cs="Arial"/>
+          <w:b/>
+          <w:bCs/>
+          <w:color w:val="1F1F1F"/>
+          <w:kern w:val="0"/>
+          <w:sz w:val="22"/>
+          <w:szCs w:val="22"/>
+          <w:lang w:eastAsia="es-BO"/>
+          <w14:ligatures w14:val="none"/>
+        </w:rPr>
+        <w:t>Testing</w:t>
+      </w:r>
+      <w:proofErr w:type="spellEnd"/>
+      <w:r>
+        <w:rPr>
+          <w:rFonts w:ascii="Arial" w:eastAsia="Arial" w:hAnsi="Arial" w:cs="Arial"/>
+          <w:b/>
+          <w:bCs/>
+          <w:color w:val="1F1F1F"/>
+          <w:kern w:val="0"/>
+          <w:sz w:val="22"/>
+          <w:szCs w:val="22"/>
+          <w:lang w:eastAsia="es-BO"/>
+          <w14:ligatures w14:val="none"/>
+        </w:rPr>
+        <w:t>):</w:t>
+      </w:r>
+      <w:r>
+        <w:rPr>
+          <w:rFonts w:ascii="Arial" w:eastAsia="Arial" w:hAnsi="Arial" w:cs="Arial"/>
+          <w:color w:val="1F1F1F"/>
+          <w:kern w:val="0"/>
+          <w:sz w:val="22"/>
+          <w:szCs w:val="22"/>
+          <w:lang w:eastAsia="es-BO"/>
+          <w14:ligatures w14:val="none"/>
+        </w:rPr>
+        <w:t xml:space="preserve"> El equipo de desarrollo ejecutó pruebas simulando entradas de datos erróneas, </w:t>
+      </w:r>
+      <w:proofErr w:type="gramStart"/>
+      <w:r>
+        <w:rPr>
+          <w:rFonts w:ascii="Arial" w:eastAsia="Arial" w:hAnsi="Arial" w:cs="Arial"/>
+          <w:color w:val="1F1F1F"/>
+          <w:kern w:val="0"/>
+          <w:sz w:val="22"/>
+          <w:szCs w:val="22"/>
+          <w:lang w:eastAsia="es-BO"/>
+          <w14:ligatures w14:val="none"/>
+        </w:rPr>
+        <w:t>carnet</w:t>
+      </w:r>
+      <w:proofErr w:type="gramEnd"/>
+      <w:r>
+        <w:rPr>
+          <w:rFonts w:ascii="Arial" w:eastAsia="Arial" w:hAnsi="Arial" w:cs="Arial"/>
+          <w:color w:val="1F1F1F"/>
+          <w:kern w:val="0"/>
+          <w:sz w:val="22"/>
+          <w:szCs w:val="22"/>
+          <w:lang w:eastAsia="es-BO"/>
+          <w14:ligatures w14:val="none"/>
+        </w:rPr>
+        <w:t xml:space="preserve"> de identidad repetidos y montos de cobro negativos para asegurar que el sistema responda de manera segura sin colgarse.</w:t>
+      </w:r>
+    </w:p>
+    <w:p>
+      <w:pPr>
+        <w:widowControl w:val="0"/>
+        <w:numPr>
+          <w:ilvl w:val="0"/>
+          <w:numId w:val="19"/>
+        </w:numPr>
+        <w:pBdr>
+          <w:top w:val="nil"/>
+          <w:left w:val="nil"/>
+          <w:bottom w:val="nil"/>
+          <w:right w:val="nil"/>
+          <w:between w:val="nil"/>
+        </w:pBdr>
+        <w:spacing w:before="240" w:after="120" w:line="275" w:lineRule="auto"/>
+        <w:rPr>
+          <w:rFonts w:ascii="Arial" w:eastAsia="Arial" w:hAnsi="Arial" w:cs="Arial"/>
+          <w:kern w:val="0"/>
+          <w:sz w:val="22"/>
+          <w:szCs w:val="22"/>
+          <w:lang w:eastAsia="es-BO"/>
+          <w14:ligatures w14:val="none"/>
+        </w:rPr>
+      </w:pPr>
+      <w:r>
+        <w:rPr>
+          <w:rFonts w:ascii="Arial" w:eastAsia="Arial" w:hAnsi="Arial" w:cs="Arial"/>
+          <w:b/>
+          <w:bCs/>
+          <w:color w:val="1F1F1F"/>
+          <w:kern w:val="0"/>
+          <w:sz w:val="22"/>
+          <w:szCs w:val="22"/>
+          <w:lang w:eastAsia="es-BO"/>
+          <w14:ligatures w14:val="none"/>
+        </w:rPr>
+        <w:t>Pruebas de Aceptación de Usuario (UAT):</w:t>
+      </w:r>
+      <w:r>
+        <w:rPr>
+          <w:rFonts w:ascii="Arial" w:eastAsia="Arial" w:hAnsi="Arial" w:cs="Arial"/>
+          <w:color w:val="1F1F1F"/>
+          <w:kern w:val="0"/>
+          <w:sz w:val="22"/>
+          <w:szCs w:val="22"/>
+          <w:lang w:eastAsia="es-BO"/>
+          <w14:ligatures w14:val="none"/>
+        </w:rPr>
+        <w:t xml:space="preserve"> Se realizaron pruebas reales con funcionarios de la Dirección de Ingresos y supervisores de los mercados Campesino, Central y Entre Ríos. Los usuarios verificaron directamente que el registro de comerciantes, la emisión de recibos digitales y el sistema de alertas de sanidad responden a la perfección ante las necesidades operativas reales del municipio.</w:t>
+      </w:r>
+    </w:p>
+    <w:p>
+      <w:pPr>
+        <w:widowControl w:val="0"/>
+        <w:pBdr>
+          <w:top w:val="nil"/>
+          <w:left w:val="nil"/>
+          <w:bottom w:val="nil"/>
+          <w:right w:val="nil"/>
+          <w:between w:val="nil"/>
+        </w:pBdr>
+        <w:spacing w:before="240" w:after="120" w:line="275" w:lineRule="auto"/>
+        <w:outlineLvl w:val="2"/>
+        <w:rPr>
+          <w:rFonts w:ascii="Arial" w:eastAsia="Arial" w:hAnsi="Arial" w:cs="Arial"/>
+          <w:b/>
+          <w:bCs/>
+          <w:color w:val="1F1F1F"/>
+          <w:kern w:val="0"/>
+          <w:sz w:val="22"/>
+          <w:szCs w:val="22"/>
+          <w:lang w:eastAsia="es-BO"/>
+          <w14:ligatures w14:val="none"/>
+        </w:rPr>
+      </w:pPr>
+      <w:r>
+        <w:rPr>
+          <w:rFonts w:ascii="Arial" w:eastAsia="Arial" w:hAnsi="Arial" w:cs="Arial"/>
+          <w:b/>
+          <w:bCs/>
+          <w:color w:val="1F1F1F"/>
+          <w:kern w:val="0"/>
+          <w:sz w:val="22"/>
+          <w:szCs w:val="22"/>
+          <w:lang w:eastAsia="es-BO"/>
+          <w14:ligatures w14:val="none"/>
+        </w:rPr>
+        <w:t>Evaluación de las 4P</w:t>
+      </w:r>
+    </w:p>
+    <w:p>
+      <w:pPr>
+        <w:widowControl w:val="0"/>
+        <w:numPr>
+          <w:ilvl w:val="0"/>
+          <w:numId w:val="20"/>
+        </w:numPr>
+        <w:pBdr>
+          <w:top w:val="nil"/>
+          <w:left w:val="nil"/>
+          <w:bottom w:val="nil"/>
+          <w:right w:val="nil"/>
+          <w:between w:val="nil"/>
+        </w:pBdr>
+        <w:spacing w:before="240" w:after="0" w:line="275" w:lineRule="auto"/>
+        <w:rPr>
+          <w:rFonts w:ascii="Arial" w:eastAsia="Arial" w:hAnsi="Arial" w:cs="Arial"/>
+          <w:kern w:val="0"/>
+          <w:sz w:val="22"/>
+          <w:szCs w:val="22"/>
+          <w:lang w:eastAsia="es-BO"/>
+          <w14:ligatures w14:val="none"/>
+        </w:rPr>
+      </w:pPr>
+      <w:r>
+        <w:rPr>
+          <w:rFonts w:ascii="Arial" w:eastAsia="Arial" w:hAnsi="Arial" w:cs="Arial"/>
+          <w:b/>
+          <w:bCs/>
+          <w:color w:val="1F1F1F"/>
+          <w:kern w:val="0"/>
+          <w:sz w:val="22"/>
+          <w:szCs w:val="22"/>
+          <w:lang w:eastAsia="es-BO"/>
+          <w14:ligatures w14:val="none"/>
+        </w:rPr>
+        <w:t>Personas:</w:t>
+      </w:r>
+      <w:r>
+        <w:rPr>
+          <w:rFonts w:ascii="Arial" w:eastAsia="Arial" w:hAnsi="Arial" w:cs="Arial"/>
+          <w:color w:val="1F1F1F"/>
+          <w:kern w:val="0"/>
+          <w:sz w:val="22"/>
+          <w:szCs w:val="22"/>
+          <w:lang w:eastAsia="es-BO"/>
+          <w14:ligatures w14:val="none"/>
+        </w:rPr>
+        <w:t xml:space="preserve"> El equipo demostró resiliencia y compromiso. A pesar de la pérdida del 50% de los programadores, la moral se mantuvo alta gracias a la reestructuración del presupuesto, el pago de horas extra y la dirección transparente del </w:t>
+      </w:r>
+      <w:proofErr w:type="gramStart"/>
+      <w:r>
+        <w:rPr>
+          <w:rFonts w:ascii="Arial" w:eastAsia="Arial" w:hAnsi="Arial" w:cs="Arial"/>
+          <w:color w:val="1F1F1F"/>
+          <w:kern w:val="0"/>
+          <w:sz w:val="22"/>
+          <w:szCs w:val="22"/>
+          <w:lang w:eastAsia="es-BO"/>
+          <w14:ligatures w14:val="none"/>
+        </w:rPr>
+        <w:t>Jefe</w:t>
+      </w:r>
+      <w:proofErr w:type="gramEnd"/>
+      <w:r>
+        <w:rPr>
+          <w:rFonts w:ascii="Arial" w:eastAsia="Arial" w:hAnsi="Arial" w:cs="Arial"/>
+          <w:color w:val="1F1F1F"/>
+          <w:kern w:val="0"/>
+          <w:sz w:val="22"/>
+          <w:szCs w:val="22"/>
+          <w:lang w:eastAsia="es-BO"/>
+          <w14:ligatures w14:val="none"/>
+        </w:rPr>
+        <w:t xml:space="preserve"> de Proyecto.</w:t>
+      </w:r>
+    </w:p>
+    <w:p>
+      <w:pPr>
+        <w:widowControl w:val="0"/>
+        <w:numPr>
+          <w:ilvl w:val="0"/>
+          <w:numId w:val="20"/>
+        </w:numPr>
+        <w:pBdr>
+          <w:top w:val="nil"/>
+          <w:left w:val="nil"/>
+          <w:bottom w:val="nil"/>
+          <w:right w:val="nil"/>
+          <w:between w:val="nil"/>
+        </w:pBdr>
+        <w:spacing w:before="240" w:after="0" w:line="275" w:lineRule="auto"/>
+        <w:rPr>
+          <w:rFonts w:ascii="Arial" w:eastAsia="Arial" w:hAnsi="Arial" w:cs="Arial"/>
+          <w:kern w:val="0"/>
+          <w:sz w:val="22"/>
+          <w:szCs w:val="22"/>
+          <w:lang w:eastAsia="es-BO"/>
+          <w14:ligatures w14:val="none"/>
+        </w:rPr>
+      </w:pPr>
+      <w:r>
+        <w:rPr>
+          <w:rFonts w:ascii="Arial" w:eastAsia="Arial" w:hAnsi="Arial" w:cs="Arial"/>
+          <w:b/>
+          <w:bCs/>
+          <w:color w:val="1F1F1F"/>
+          <w:kern w:val="0"/>
+          <w:sz w:val="22"/>
+          <w:szCs w:val="22"/>
+          <w:lang w:eastAsia="es-BO"/>
+          <w14:ligatures w14:val="none"/>
+        </w:rPr>
+        <w:t>Producto:</w:t>
+      </w:r>
+      <w:r>
+        <w:rPr>
+          <w:rFonts w:ascii="Arial" w:eastAsia="Arial" w:hAnsi="Arial" w:cs="Arial"/>
+          <w:color w:val="1F1F1F"/>
+          <w:kern w:val="0"/>
+          <w:sz w:val="22"/>
+          <w:szCs w:val="22"/>
+          <w:lang w:eastAsia="es-BO"/>
+          <w14:ligatures w14:val="none"/>
+        </w:rPr>
+        <w:t xml:space="preserve"> El MVP entregado es estable, seguro, cumple con el 100% de las necesidades del cliente y cuenta con un módulo de mapas dinámico y preciso.</w:t>
+      </w:r>
+    </w:p>
+    <w:p>
+      <w:pPr>
+        <w:widowControl w:val="0"/>
+        <w:numPr>
+          <w:ilvl w:val="0"/>
+          <w:numId w:val="20"/>
+        </w:numPr>
+        <w:pBdr>
+          <w:top w:val="nil"/>
+          <w:left w:val="nil"/>
+          <w:bottom w:val="nil"/>
+          <w:right w:val="nil"/>
+          <w:between w:val="nil"/>
+        </w:pBdr>
+        <w:spacing w:before="240" w:after="0" w:line="275" w:lineRule="auto"/>
+        <w:rPr>
+          <w:rFonts w:ascii="Arial" w:eastAsia="Arial" w:hAnsi="Arial" w:cs="Arial"/>
+          <w:kern w:val="0"/>
+          <w:sz w:val="22"/>
+          <w:szCs w:val="22"/>
+          <w:lang w:eastAsia="es-BO"/>
+          <w14:ligatures w14:val="none"/>
+        </w:rPr>
+      </w:pPr>
+      <w:r>
+        <w:rPr>
+          <w:rFonts w:ascii="Arial" w:eastAsia="Arial" w:hAnsi="Arial" w:cs="Arial"/>
+          <w:b/>
+          <w:bCs/>
+          <w:color w:val="1F1F1F"/>
+          <w:kern w:val="0"/>
+          <w:sz w:val="22"/>
+          <w:szCs w:val="22"/>
+          <w:lang w:eastAsia="es-BO"/>
+          <w14:ligatures w14:val="none"/>
+        </w:rPr>
+        <w:t>Proceso:</w:t>
+      </w:r>
+      <w:r>
+        <w:rPr>
+          <w:rFonts w:ascii="Arial" w:eastAsia="Arial" w:hAnsi="Arial" w:cs="Arial"/>
+          <w:color w:val="1F1F1F"/>
+          <w:kern w:val="0"/>
+          <w:sz w:val="22"/>
+          <w:szCs w:val="22"/>
+          <w:lang w:eastAsia="es-BO"/>
+          <w14:ligatures w14:val="none"/>
+        </w:rPr>
+        <w:t xml:space="preserve"> La metodología ágil Scrum demostró ser idónea para el contexto de la administración municipal, permitiendo absorber la geolocalización y los cambios de leyes sin retrasar la fecha de entrega final.</w:t>
+      </w:r>
+    </w:p>
+    <w:p>
+      <w:pPr>
+        <w:widowControl w:val="0"/>
+        <w:numPr>
+          <w:ilvl w:val="0"/>
+          <w:numId w:val="20"/>
+        </w:numPr>
+        <w:pBdr>
+          <w:top w:val="nil"/>
+          <w:left w:val="nil"/>
+          <w:bottom w:val="nil"/>
+          <w:right w:val="nil"/>
+          <w:between w:val="nil"/>
+        </w:pBdr>
+        <w:spacing w:before="240" w:after="120" w:line="275" w:lineRule="auto"/>
+        <w:rPr>
+          <w:rFonts w:ascii="Arial" w:eastAsia="Arial" w:hAnsi="Arial" w:cs="Arial"/>
+          <w:kern w:val="0"/>
+          <w:sz w:val="22"/>
+          <w:szCs w:val="22"/>
+          <w:lang w:eastAsia="es-BO"/>
+          <w14:ligatures w14:val="none"/>
+        </w:rPr>
+      </w:pPr>
+      <w:r>
+        <w:rPr>
+          <w:rFonts w:ascii="Arial" w:eastAsia="Arial" w:hAnsi="Arial" w:cs="Arial"/>
+          <w:b/>
+          <w:bCs/>
+          <w:color w:val="1F1F1F"/>
+          <w:kern w:val="0"/>
+          <w:sz w:val="22"/>
+          <w:szCs w:val="22"/>
+          <w:lang w:eastAsia="es-BO"/>
+          <w14:ligatures w14:val="none"/>
+        </w:rPr>
+        <w:t>Proyecto:</w:t>
+      </w:r>
+      <w:r>
+        <w:rPr>
+          <w:rFonts w:ascii="Arial" w:eastAsia="Arial" w:hAnsi="Arial" w:cs="Arial"/>
+          <w:color w:val="1F1F1F"/>
+          <w:kern w:val="0"/>
+          <w:sz w:val="22"/>
+          <w:szCs w:val="22"/>
+          <w:lang w:eastAsia="es-BO"/>
+          <w14:ligatures w14:val="none"/>
+        </w:rPr>
+        <w:t xml:space="preserve"> A pesar de los desafíos críticos, el proyecto se cerró ejecutando exactamente el presupuesto inicial de 70,000 Bs dentro de los plazos establecidos de 6 meses.</w:t>
+      </w:r>
+    </w:p>
+    <w:p>
+      <w:pPr>
+        <w:widowControl w:val="0"/>
+        <w:pBdr>
+          <w:top w:val="nil"/>
+          <w:left w:val="nil"/>
+          <w:bottom w:val="nil"/>
+          <w:right w:val="nil"/>
+          <w:between w:val="nil"/>
+        </w:pBdr>
+        <w:spacing w:before="240" w:after="120" w:line="275" w:lineRule="auto"/>
+        <w:outlineLvl w:val="2"/>
+        <w:rPr>
+          <w:rFonts w:ascii="Arial" w:eastAsia="Arial" w:hAnsi="Arial" w:cs="Arial"/>
+          <w:b/>
+          <w:bCs/>
+          <w:color w:val="1F1F1F"/>
+          <w:kern w:val="0"/>
+          <w:sz w:val="22"/>
+          <w:szCs w:val="22"/>
+          <w:lang w:eastAsia="es-BO"/>
+          <w14:ligatures w14:val="none"/>
+        </w:rPr>
+      </w:pPr>
+      <w:proofErr w:type="spellStart"/>
+      <w:r>
+        <w:rPr>
+          <w:rFonts w:ascii="Arial" w:eastAsia="Arial" w:hAnsi="Arial" w:cs="Arial"/>
+          <w:b/>
+          <w:bCs/>
+          <w:color w:val="1F1F1F"/>
+          <w:kern w:val="0"/>
+          <w:sz w:val="22"/>
+          <w:szCs w:val="22"/>
+          <w:lang w:eastAsia="es-BO"/>
+          <w14:ligatures w14:val="none"/>
+        </w:rPr>
+        <w:t>Value</w:t>
+      </w:r>
+      <w:proofErr w:type="spellEnd"/>
+      <w:r>
+        <w:rPr>
+          <w:rFonts w:ascii="Arial" w:eastAsia="Arial" w:hAnsi="Arial" w:cs="Arial"/>
+          <w:b/>
+          <w:bCs/>
+          <w:color w:val="1F1F1F"/>
+          <w:kern w:val="0"/>
+          <w:sz w:val="22"/>
+          <w:szCs w:val="22"/>
+          <w:lang w:eastAsia="es-BO"/>
+          <w14:ligatures w14:val="none"/>
+        </w:rPr>
+        <w:t xml:space="preserve"> Stream </w:t>
+      </w:r>
+      <w:proofErr w:type="spellStart"/>
+      <w:r>
+        <w:rPr>
+          <w:rFonts w:ascii="Arial" w:eastAsia="Arial" w:hAnsi="Arial" w:cs="Arial"/>
+          <w:b/>
+          <w:bCs/>
+          <w:color w:val="1F1F1F"/>
+          <w:kern w:val="0"/>
+          <w:sz w:val="22"/>
+          <w:szCs w:val="22"/>
+          <w:lang w:eastAsia="es-BO"/>
+          <w14:ligatures w14:val="none"/>
+        </w:rPr>
+        <w:t>Mapping</w:t>
+      </w:r>
+      <w:proofErr w:type="spellEnd"/>
+    </w:p>
+    <w:p>
+      <w:pPr>
+        <w:widowControl w:val="0"/>
+        <w:pBdr>
+          <w:top w:val="nil"/>
+          <w:left w:val="nil"/>
+          <w:bottom w:val="nil"/>
+          <w:right w:val="nil"/>
+          <w:between w:val="nil"/>
+        </w:pBdr>
+        <w:spacing w:before="240" w:after="187" w:line="275" w:lineRule="auto"/>
+        <w:rPr>
+          <w:rFonts w:ascii="Arial" w:eastAsia="Arial" w:hAnsi="Arial" w:cs="Arial"/>
+          <w:color w:val="1F1F1F"/>
+          <w:kern w:val="0"/>
+          <w:sz w:val="22"/>
+          <w:szCs w:val="22"/>
+          <w:lang w:eastAsia="es-BO"/>
+          <w14:ligatures w14:val="none"/>
+        </w:rPr>
+      </w:pPr>
+      <w:r>
+        <w:rPr>
+          <w:rFonts w:ascii="Arial" w:eastAsia="Arial" w:hAnsi="Arial" w:cs="Arial"/>
+          <w:color w:val="1F1F1F"/>
+          <w:kern w:val="0"/>
+          <w:sz w:val="22"/>
+          <w:szCs w:val="22"/>
+          <w:lang w:eastAsia="es-BO"/>
+          <w14:ligatures w14:val="none"/>
+        </w:rPr>
+        <w:t>El flujo de valor se optimizó eliminando tiempos muertos y actividades que no aportaban valor al software final:</w:t>
+      </w:r>
+    </w:p>
+    <w:p>
+      <w:pPr>
+        <w:widowControl w:val="0"/>
+        <w:pBdr>
+          <w:top w:val="nil"/>
+          <w:left w:val="nil"/>
+          <w:bottom w:val="nil"/>
+          <w:right w:val="nil"/>
+          <w:between w:val="nil"/>
+        </w:pBdr>
+        <w:spacing w:before="240" w:after="255" w:line="275" w:lineRule="auto"/>
+        <w:rPr>
+          <w:rFonts w:ascii="Arial" w:eastAsia="Arial" w:hAnsi="Arial" w:cs="Arial"/>
+          <w:color w:val="1F1F1F"/>
+          <w:kern w:val="0"/>
+          <w:sz w:val="22"/>
+          <w:szCs w:val="22"/>
+          <w:lang w:eastAsia="es-BO"/>
+          <w14:ligatures w14:val="none"/>
+        </w:rPr>
+      </w:pPr>
+      <w:r>
+        <w:rPr>
+          <w:rFonts w:ascii="Arial" w:eastAsia="Arial" w:hAnsi="Arial" w:cs="Arial"/>
+          <w:color w:val="1F1F1F"/>
+          <w:kern w:val="0"/>
+          <w:sz w:val="22"/>
+          <w:szCs w:val="22"/>
+          <w:lang w:eastAsia="es-BO"/>
+          <w14:ligatures w14:val="none"/>
+        </w:rPr>
+        <w:t xml:space="preserve">[Requerimiento de la Alcaldía] </w:t>
+      </w:r>
+      <w:r>
+        <w:rPr>
+          <w:rFonts w:ascii="Arial" w:eastAsia="Arial" w:hAnsi="Arial" w:cs="Arial"/>
+          <w:color w:val="1F1F1F"/>
+          <w:kern w:val="0"/>
+          <w:sz w:val="22"/>
+          <w:szCs w:val="22"/>
+          <w:lang w:eastAsia="es-BO"/>
+          <w14:ligatures w14:val="none"/>
+        </w:rPr>
+        <w:br/>
+        <w:t xml:space="preserve">               │ (Espera: 1 día)</w:t>
+      </w:r>
+      <w:r>
+        <w:rPr>
+          <w:rFonts w:ascii="Arial" w:eastAsia="Arial" w:hAnsi="Arial" w:cs="Arial"/>
+          <w:color w:val="1F1F1F"/>
+          <w:kern w:val="0"/>
+          <w:sz w:val="22"/>
+          <w:szCs w:val="22"/>
+          <w:lang w:eastAsia="es-BO"/>
+          <w14:ligatures w14:val="none"/>
+        </w:rPr>
+        <w:br/>
+        <w:t xml:space="preserve">               ▼</w:t>
+      </w:r>
+      <w:r>
+        <w:rPr>
+          <w:rFonts w:ascii="Arial" w:eastAsia="Arial" w:hAnsi="Arial" w:cs="Arial"/>
+          <w:color w:val="1F1F1F"/>
+          <w:kern w:val="0"/>
+          <w:sz w:val="22"/>
+          <w:szCs w:val="22"/>
+          <w:lang w:eastAsia="es-BO"/>
+          <w14:ligatures w14:val="none"/>
+        </w:rPr>
+        <w:br/>
+        <w:t xml:space="preserve">[Análisis Técnico e Impacto] </w:t>
+      </w:r>
+      <w:r>
+        <w:rPr>
+          <w:rFonts w:ascii="Arial" w:eastAsia="Arial" w:hAnsi="Arial" w:cs="Arial"/>
+          <w:color w:val="1F1F1F"/>
+          <w:kern w:val="0"/>
+          <w:sz w:val="22"/>
+          <w:szCs w:val="22"/>
+          <w:lang w:eastAsia="es-BO"/>
+          <w14:ligatures w14:val="none"/>
+        </w:rPr>
+        <w:br/>
+        <w:t xml:space="preserve">               │ (Espera: 1 día)</w:t>
+      </w:r>
+      <w:r>
+        <w:rPr>
+          <w:rFonts w:ascii="Arial" w:eastAsia="Arial" w:hAnsi="Arial" w:cs="Arial"/>
+          <w:color w:val="1F1F1F"/>
+          <w:kern w:val="0"/>
+          <w:sz w:val="22"/>
+          <w:szCs w:val="22"/>
+          <w:lang w:eastAsia="es-BO"/>
+          <w14:ligatures w14:val="none"/>
+        </w:rPr>
+        <w:br/>
+        <w:t xml:space="preserve">               ▼</w:t>
+      </w:r>
+      <w:r>
+        <w:rPr>
+          <w:rFonts w:ascii="Arial" w:eastAsia="Arial" w:hAnsi="Arial" w:cs="Arial"/>
+          <w:color w:val="1F1F1F"/>
+          <w:kern w:val="0"/>
+          <w:sz w:val="22"/>
+          <w:szCs w:val="22"/>
+          <w:lang w:eastAsia="es-BO"/>
+          <w14:ligatures w14:val="none"/>
+        </w:rPr>
+        <w:br/>
+        <w:t xml:space="preserve">[Diseño Visual y Prototipos] </w:t>
+      </w:r>
+      <w:r>
+        <w:rPr>
+          <w:rFonts w:ascii="Arial" w:eastAsia="Arial" w:hAnsi="Arial" w:cs="Arial"/>
+          <w:color w:val="1F1F1F"/>
+          <w:kern w:val="0"/>
+          <w:sz w:val="22"/>
+          <w:szCs w:val="22"/>
+          <w:lang w:eastAsia="es-BO"/>
+          <w14:ligatures w14:val="none"/>
+        </w:rPr>
+        <w:br/>
+        <w:t xml:space="preserve">               │ (Desarrollo: 6 días)</w:t>
+      </w:r>
+      <w:r>
+        <w:rPr>
+          <w:rFonts w:ascii="Arial" w:eastAsia="Arial" w:hAnsi="Arial" w:cs="Arial"/>
+          <w:color w:val="1F1F1F"/>
+          <w:kern w:val="0"/>
+          <w:sz w:val="22"/>
+          <w:szCs w:val="22"/>
+          <w:lang w:eastAsia="es-BO"/>
+          <w14:ligatures w14:val="none"/>
+        </w:rPr>
+        <w:br/>
+        <w:t xml:space="preserve">               ▼</w:t>
+      </w:r>
+      <w:r>
+        <w:rPr>
+          <w:rFonts w:ascii="Arial" w:eastAsia="Arial" w:hAnsi="Arial" w:cs="Arial"/>
+          <w:color w:val="1F1F1F"/>
+          <w:kern w:val="0"/>
+          <w:sz w:val="22"/>
+          <w:szCs w:val="22"/>
+          <w:lang w:eastAsia="es-BO"/>
+          <w14:ligatures w14:val="none"/>
+        </w:rPr>
+        <w:br/>
+        <w:t xml:space="preserve">[Codificación del Código en </w:t>
+      </w:r>
+      <w:proofErr w:type="spellStart"/>
+      <w:r>
+        <w:rPr>
+          <w:rFonts w:ascii="Arial" w:eastAsia="Arial" w:hAnsi="Arial" w:cs="Arial"/>
+          <w:color w:val="1F1F1F"/>
+          <w:kern w:val="0"/>
+          <w:sz w:val="22"/>
+          <w:szCs w:val="22"/>
+          <w:lang w:eastAsia="es-BO"/>
+          <w14:ligatures w14:val="none"/>
+        </w:rPr>
+        <w:t>Sprints</w:t>
+      </w:r>
+      <w:proofErr w:type="spellEnd"/>
+      <w:r>
+        <w:rPr>
+          <w:rFonts w:ascii="Arial" w:eastAsia="Arial" w:hAnsi="Arial" w:cs="Arial"/>
+          <w:color w:val="1F1F1F"/>
+          <w:kern w:val="0"/>
+          <w:sz w:val="22"/>
+          <w:szCs w:val="22"/>
+          <w:lang w:eastAsia="es-BO"/>
+          <w14:ligatures w14:val="none"/>
+        </w:rPr>
+        <w:t xml:space="preserve">] </w:t>
+      </w:r>
+      <w:r>
+        <w:rPr>
+          <w:rFonts w:ascii="Arial" w:eastAsia="Arial" w:hAnsi="Arial" w:cs="Arial"/>
+          <w:color w:val="1F1F1F"/>
+          <w:kern w:val="0"/>
+          <w:sz w:val="22"/>
+          <w:szCs w:val="22"/>
+          <w:lang w:eastAsia="es-BO"/>
+          <w14:ligatures w14:val="none"/>
+        </w:rPr>
+        <w:br/>
+        <w:t xml:space="preserve">               │ (Revisión: 1 día)</w:t>
+      </w:r>
+      <w:r>
+        <w:rPr>
+          <w:rFonts w:ascii="Arial" w:eastAsia="Arial" w:hAnsi="Arial" w:cs="Arial"/>
+          <w:color w:val="1F1F1F"/>
+          <w:kern w:val="0"/>
+          <w:sz w:val="22"/>
+          <w:szCs w:val="22"/>
+          <w:lang w:eastAsia="es-BO"/>
+          <w14:ligatures w14:val="none"/>
+        </w:rPr>
+        <w:br/>
+        <w:t xml:space="preserve">               ▼</w:t>
+      </w:r>
+      <w:r>
+        <w:rPr>
+          <w:rFonts w:ascii="Arial" w:eastAsia="Arial" w:hAnsi="Arial" w:cs="Arial"/>
+          <w:color w:val="1F1F1F"/>
+          <w:kern w:val="0"/>
+          <w:sz w:val="22"/>
+          <w:szCs w:val="22"/>
+          <w:lang w:eastAsia="es-BO"/>
+          <w14:ligatures w14:val="none"/>
+        </w:rPr>
+        <w:br/>
+      </w:r>
+      <w:r>
+        <w:rPr>
+          <w:rFonts w:ascii="Arial" w:eastAsia="Arial" w:hAnsi="Arial" w:cs="Arial"/>
+          <w:color w:val="1F1F1F"/>
+          <w:kern w:val="0"/>
+          <w:sz w:val="22"/>
+          <w:szCs w:val="22"/>
+          <w:lang w:eastAsia="es-BO"/>
+          <w14:ligatures w14:val="none"/>
+        </w:rPr>
+        <w:lastRenderedPageBreak/>
+        <w:t xml:space="preserve">[Pruebas de Calidad (QA) y Aceptación] </w:t>
+      </w:r>
+      <w:r>
+        <w:rPr>
+          <w:rFonts w:ascii="Arial" w:eastAsia="Arial" w:hAnsi="Arial" w:cs="Arial"/>
+          <w:color w:val="1F1F1F"/>
+          <w:kern w:val="0"/>
+          <w:sz w:val="22"/>
+          <w:szCs w:val="22"/>
+          <w:lang w:eastAsia="es-BO"/>
+          <w14:ligatures w14:val="none"/>
+        </w:rPr>
+        <w:br/>
+        <w:t xml:space="preserve">               │ (Despliegue: 1 hora)</w:t>
+      </w:r>
+      <w:r>
+        <w:rPr>
+          <w:rFonts w:ascii="Arial" w:eastAsia="Arial" w:hAnsi="Arial" w:cs="Arial"/>
+          <w:color w:val="1F1F1F"/>
+          <w:kern w:val="0"/>
+          <w:sz w:val="22"/>
+          <w:szCs w:val="22"/>
+          <w:lang w:eastAsia="es-BO"/>
+          <w14:ligatures w14:val="none"/>
+        </w:rPr>
+        <w:br/>
+        <w:t xml:space="preserve">               ▼</w:t>
+      </w:r>
+      <w:r>
+        <w:rPr>
+          <w:rFonts w:ascii="Arial" w:eastAsia="Arial" w:hAnsi="Arial" w:cs="Arial"/>
+          <w:color w:val="1F1F1F"/>
+          <w:kern w:val="0"/>
+          <w:sz w:val="22"/>
+          <w:szCs w:val="22"/>
+          <w:lang w:eastAsia="es-BO"/>
+          <w14:ligatures w14:val="none"/>
+        </w:rPr>
+        <w:br/>
+        <w:t>[Publicación en Servidor de Producción]</w:t>
+      </w:r>
+      <w:r>
+        <w:rPr>
+          <w:rFonts w:ascii="Arial" w:eastAsia="Arial" w:hAnsi="Arial" w:cs="Arial"/>
+          <w:color w:val="1F1F1F"/>
+          <w:kern w:val="0"/>
+          <w:sz w:val="22"/>
+          <w:szCs w:val="22"/>
+          <w:lang w:eastAsia="es-BO"/>
+          <w14:ligatures w14:val="none"/>
+        </w:rPr>
+        <w:br/>
+      </w:r>
+    </w:p>
+    <w:p>
+      <w:pPr>
+        <w:widowControl w:val="0"/>
+        <w:pBdr>
+          <w:top w:val="nil"/>
+          <w:left w:val="nil"/>
+          <w:bottom w:val="nil"/>
+          <w:right w:val="nil"/>
+          <w:between w:val="nil"/>
+        </w:pBdr>
+        <w:spacing w:before="240" w:after="120" w:line="275" w:lineRule="auto"/>
+        <w:outlineLvl w:val="2"/>
+        <w:rPr>
+          <w:rFonts w:ascii="Arial" w:eastAsia="Arial" w:hAnsi="Arial" w:cs="Arial"/>
+          <w:b/>
+          <w:bCs/>
+          <w:color w:val="1F1F1F"/>
+          <w:kern w:val="0"/>
+          <w:sz w:val="22"/>
+          <w:szCs w:val="22"/>
+          <w:lang w:eastAsia="es-BO"/>
+          <w14:ligatures w14:val="none"/>
+        </w:rPr>
+      </w:pPr>
+      <w:r>
+        <w:rPr>
+          <w:rFonts w:ascii="Arial" w:eastAsia="Arial" w:hAnsi="Arial" w:cs="Arial"/>
+          <w:b/>
+          <w:bCs/>
+          <w:color w:val="1F1F1F"/>
+          <w:kern w:val="0"/>
+          <w:sz w:val="22"/>
+          <w:szCs w:val="22"/>
+          <w:lang w:eastAsia="es-BO"/>
+          <w14:ligatures w14:val="none"/>
+        </w:rPr>
+        <w:t>Plan de Escalado Organizacional</w:t>
+      </w:r>
+    </w:p>
+    <w:p>
+      <w:pPr>
+        <w:widowControl w:val="0"/>
+        <w:pBdr>
+          <w:top w:val="nil"/>
+          <w:left w:val="nil"/>
+          <w:bottom w:val="nil"/>
+          <w:right w:val="nil"/>
+          <w:between w:val="nil"/>
+        </w:pBdr>
+        <w:spacing w:before="240" w:after="120" w:line="275" w:lineRule="auto"/>
+        <w:rPr>
+          <w:rFonts w:ascii="Arial" w:eastAsia="Arial" w:hAnsi="Arial" w:cs="Arial"/>
+          <w:color w:val="1F1F1F"/>
+          <w:kern w:val="0"/>
+          <w:sz w:val="22"/>
+          <w:szCs w:val="22"/>
+          <w:lang w:eastAsia="es-BO"/>
+          <w14:ligatures w14:val="none"/>
+        </w:rPr>
+      </w:pPr>
+      <w:r>
+        <w:rPr>
+          <w:rFonts w:ascii="Arial" w:eastAsia="Arial" w:hAnsi="Arial" w:cs="Arial"/>
+          <w:color w:val="1F1F1F"/>
+          <w:kern w:val="0"/>
+          <w:sz w:val="22"/>
+          <w:szCs w:val="22"/>
+          <w:lang w:eastAsia="es-BO"/>
+          <w14:ligatures w14:val="none"/>
+        </w:rPr>
+        <w:t>El sistema está diseñado bajo una arquitectura modular y escalable para permitir su crecimiento futuro de forma sencilla:</w:t>
+      </w:r>
+    </w:p>
+    <w:p>
+      <w:pPr>
+        <w:widowControl w:val="0"/>
+        <w:numPr>
+          <w:ilvl w:val="0"/>
+          <w:numId w:val="21"/>
+        </w:numPr>
+        <w:pBdr>
+          <w:top w:val="nil"/>
+          <w:left w:val="nil"/>
+          <w:bottom w:val="nil"/>
+          <w:right w:val="nil"/>
+          <w:between w:val="nil"/>
+        </w:pBdr>
+        <w:spacing w:before="240" w:after="0" w:line="275" w:lineRule="auto"/>
+        <w:rPr>
+          <w:rFonts w:ascii="Arial" w:eastAsia="Arial" w:hAnsi="Arial" w:cs="Arial"/>
+          <w:kern w:val="0"/>
+          <w:sz w:val="22"/>
+          <w:szCs w:val="22"/>
+          <w:lang w:eastAsia="es-BO"/>
+          <w14:ligatures w14:val="none"/>
+        </w:rPr>
+      </w:pPr>
+      <w:r>
+        <w:rPr>
+          <w:rFonts w:ascii="Arial" w:eastAsia="Arial" w:hAnsi="Arial" w:cs="Arial"/>
+          <w:b/>
+          <w:bCs/>
+          <w:color w:val="1F1F1F"/>
+          <w:kern w:val="0"/>
+          <w:sz w:val="22"/>
+          <w:szCs w:val="22"/>
+          <w:lang w:eastAsia="es-BO"/>
+          <w14:ligatures w14:val="none"/>
+        </w:rPr>
+        <w:t>Fase 2 (Corto Plazo):</w:t>
+      </w:r>
+      <w:r>
+        <w:rPr>
+          <w:rFonts w:ascii="Arial" w:eastAsia="Arial" w:hAnsi="Arial" w:cs="Arial"/>
+          <w:color w:val="1F1F1F"/>
+          <w:kern w:val="0"/>
+          <w:sz w:val="22"/>
+          <w:szCs w:val="22"/>
+          <w:lang w:eastAsia="es-BO"/>
+          <w14:ligatures w14:val="none"/>
+        </w:rPr>
+        <w:t xml:space="preserve"> Integración de pagos móviles a través de pasarelas bancarias y generación de códigos QR automáticos en los puestos para evitar el uso de dinero en efectivo.</w:t>
+      </w:r>
+    </w:p>
+    <w:p>
+      <w:pPr>
+        <w:widowControl w:val="0"/>
+        <w:numPr>
+          <w:ilvl w:val="0"/>
+          <w:numId w:val="21"/>
+        </w:numPr>
+        <w:pBdr>
+          <w:top w:val="nil"/>
+          <w:left w:val="nil"/>
+          <w:bottom w:val="nil"/>
+          <w:right w:val="nil"/>
+          <w:between w:val="nil"/>
+        </w:pBdr>
+        <w:spacing w:before="240" w:after="0" w:line="275" w:lineRule="auto"/>
+        <w:rPr>
+          <w:rFonts w:ascii="Arial" w:eastAsia="Arial" w:hAnsi="Arial" w:cs="Arial"/>
+          <w:kern w:val="0"/>
+          <w:sz w:val="22"/>
+          <w:szCs w:val="22"/>
+          <w:lang w:eastAsia="es-BO"/>
+          <w14:ligatures w14:val="none"/>
+        </w:rPr>
+      </w:pPr>
+      <w:r>
+        <w:rPr>
+          <w:rFonts w:ascii="Arial" w:eastAsia="Arial" w:hAnsi="Arial" w:cs="Arial"/>
+          <w:b/>
+          <w:bCs/>
+          <w:color w:val="1F1F1F"/>
+          <w:kern w:val="0"/>
+          <w:sz w:val="22"/>
+          <w:szCs w:val="22"/>
+          <w:lang w:eastAsia="es-BO"/>
+          <w14:ligatures w14:val="none"/>
+        </w:rPr>
+        <w:t>Fase 3 (Mediano Plazo):</w:t>
+      </w:r>
+      <w:r>
+        <w:rPr>
+          <w:rFonts w:ascii="Arial" w:eastAsia="Arial" w:hAnsi="Arial" w:cs="Arial"/>
+          <w:color w:val="1F1F1F"/>
+          <w:kern w:val="0"/>
+          <w:sz w:val="22"/>
+          <w:szCs w:val="22"/>
+          <w:lang w:eastAsia="es-BO"/>
+          <w14:ligatures w14:val="none"/>
+        </w:rPr>
+        <w:t xml:space="preserve"> Interoperabilidad del sistema de mercados con los sistemas de la Secretaría de Salud y la Intendencia Municipal de Sucre para cruzar información de patentes de forma automática.</w:t>
+      </w:r>
+    </w:p>
+    <w:p>
+      <w:pPr>
+        <w:widowControl w:val="0"/>
+        <w:numPr>
+          <w:ilvl w:val="0"/>
+          <w:numId w:val="21"/>
+        </w:numPr>
+        <w:pBdr>
+          <w:top w:val="nil"/>
+          <w:left w:val="nil"/>
+          <w:bottom w:val="nil"/>
+          <w:right w:val="nil"/>
+          <w:between w:val="nil"/>
+        </w:pBdr>
+        <w:spacing w:before="240" w:after="120" w:line="275" w:lineRule="auto"/>
+        <w:rPr>
+          <w:rFonts w:ascii="Arial" w:eastAsia="Arial" w:hAnsi="Arial" w:cs="Arial"/>
+          <w:kern w:val="0"/>
+          <w:sz w:val="22"/>
+          <w:szCs w:val="22"/>
+          <w:lang w:eastAsia="es-BO"/>
+          <w14:ligatures w14:val="none"/>
+        </w:rPr>
+      </w:pPr>
+      <w:r>
+        <w:rPr>
+          <w:rFonts w:ascii="Arial" w:eastAsia="Arial" w:hAnsi="Arial" w:cs="Arial"/>
+          <w:b/>
+          <w:bCs/>
+          <w:color w:val="1F1F1F"/>
+          <w:kern w:val="0"/>
+          <w:sz w:val="22"/>
+          <w:szCs w:val="22"/>
+          <w:lang w:eastAsia="es-BO"/>
+          <w14:ligatures w14:val="none"/>
+        </w:rPr>
+        <w:t>Fase 4 (Largo Plazo):</w:t>
+      </w:r>
+      <w:r>
+        <w:rPr>
+          <w:rFonts w:ascii="Arial" w:eastAsia="Arial" w:hAnsi="Arial" w:cs="Arial"/>
+          <w:color w:val="1F1F1F"/>
+          <w:kern w:val="0"/>
+          <w:sz w:val="22"/>
+          <w:szCs w:val="22"/>
+          <w:lang w:eastAsia="es-BO"/>
+          <w14:ligatures w14:val="none"/>
+        </w:rPr>
+        <w:t xml:space="preserve"> Expansión geográfica del software para administrar las ferias distritales y mercados periféricos, unificando la base de datos comercial de toda la ciudad de Sucre bajo una sola plataforma digital municipal.</w:t>
+      </w:r>
+    </w:p>
     <w:p/>
     <w:sectPr>
       <w:pgSz w:w="11906" w:h="16838"/>
@@ -6804,6 +8311,227 @@
     </w:lvl>
   </w:abstractNum>
   <w:abstractNum w:abstractNumId="3" w15:restartNumberingAfterBreak="0">
+    <w:nsid w:val="16207A6F"/>
+    <w:multiLevelType w:val="multilevel"/>
+    <w:tmpl w:val="71322802"/>
+    <w:lvl w:ilvl="0">
+      <w:start w:val="1"/>
+      <w:numFmt w:val="bullet"/>
+      <w:lvlText w:val="●"/>
+      <w:lvlJc w:val="left"/>
+      <w:pPr>
+        <w:ind w:left="465" w:hanging="360"/>
+      </w:pPr>
+      <w:rPr>
+        <w:rFonts w:ascii="Arial" w:eastAsia="Arial" w:hAnsi="Arial" w:cs="Arial"/>
+        <w:b w:val="0"/>
+        <w:bCs w:val="0"/>
+        <w:i w:val="0"/>
+        <w:iCs w:val="0"/>
+        <w:smallCaps w:val="0"/>
+        <w:strike w:val="0"/>
+        <w:color w:val="000000"/>
+        <w:sz w:val="22"/>
+        <w:szCs w:val="22"/>
+        <w:u w:val="none"/>
+        <w:shd w:val="clear" w:color="auto" w:fill="auto"/>
+        <w:vertAlign w:val="baseline"/>
+      </w:rPr>
+    </w:lvl>
+    <w:lvl w:ilvl="1">
+      <w:start w:val="1"/>
+      <w:numFmt w:val="bullet"/>
+      <w:lvlText w:val="○"/>
+      <w:lvlJc w:val="left"/>
+      <w:pPr>
+        <w:ind w:left="1440" w:hanging="360"/>
+      </w:pPr>
+      <w:rPr>
+        <w:rFonts w:ascii="Arial" w:eastAsia="Arial" w:hAnsi="Arial" w:cs="Arial"/>
+        <w:b w:val="0"/>
+        <w:bCs w:val="0"/>
+        <w:i w:val="0"/>
+        <w:iCs w:val="0"/>
+        <w:smallCaps w:val="0"/>
+        <w:strike w:val="0"/>
+        <w:color w:val="000000"/>
+        <w:sz w:val="22"/>
+        <w:szCs w:val="22"/>
+        <w:u w:val="none"/>
+        <w:shd w:val="clear" w:color="auto" w:fill="auto"/>
+        <w:vertAlign w:val="baseline"/>
+      </w:rPr>
+    </w:lvl>
+    <w:lvl w:ilvl="2">
+      <w:start w:val="1"/>
+      <w:numFmt w:val="bullet"/>
+      <w:lvlText w:val="■"/>
+      <w:lvlJc w:val="left"/>
+      <w:pPr>
+        <w:ind w:left="2160" w:hanging="360"/>
+      </w:pPr>
+      <w:rPr>
+        <w:rFonts w:ascii="Arial" w:eastAsia="Arial" w:hAnsi="Arial" w:cs="Arial"/>
+        <w:b w:val="0"/>
+        <w:bCs w:val="0"/>
+        <w:i w:val="0"/>
+        <w:iCs w:val="0"/>
+        <w:smallCaps w:val="0"/>
+        <w:strike w:val="0"/>
+        <w:color w:val="000000"/>
+        <w:sz w:val="22"/>
+        <w:szCs w:val="22"/>
+        <w:u w:val="none"/>
+        <w:shd w:val="clear" w:color="auto" w:fill="auto"/>
+        <w:vertAlign w:val="baseline"/>
+      </w:rPr>
+    </w:lvl>
+    <w:lvl w:ilvl="3">
+      <w:start w:val="1"/>
+      <w:numFmt w:val="bullet"/>
+      <w:lvlText w:val="■"/>
+      <w:lvlJc w:val="left"/>
+      <w:pPr>
+        <w:ind w:left="2880" w:hanging="360"/>
+      </w:pPr>
+      <w:rPr>
+        <w:rFonts w:ascii="Arial" w:eastAsia="Arial" w:hAnsi="Arial" w:cs="Arial"/>
+        <w:b w:val="0"/>
+        <w:bCs w:val="0"/>
+        <w:i w:val="0"/>
+        <w:iCs w:val="0"/>
+        <w:smallCaps w:val="0"/>
+        <w:strike w:val="0"/>
+        <w:color w:val="000000"/>
+        <w:sz w:val="22"/>
+        <w:szCs w:val="22"/>
+        <w:u w:val="none"/>
+        <w:shd w:val="clear" w:color="auto" w:fill="auto"/>
+        <w:vertAlign w:val="baseline"/>
+      </w:rPr>
+    </w:lvl>
+    <w:lvl w:ilvl="4">
+      <w:start w:val="1"/>
+      <w:numFmt w:val="bullet"/>
+      <w:lvlText w:val="■"/>
+      <w:lvlJc w:val="left"/>
+      <w:pPr>
+        <w:ind w:left="3600" w:hanging="360"/>
+      </w:pPr>
+      <w:rPr>
+        <w:rFonts w:ascii="Arial" w:eastAsia="Arial" w:hAnsi="Arial" w:cs="Arial"/>
+        <w:b w:val="0"/>
+        <w:bCs w:val="0"/>
+        <w:i w:val="0"/>
+        <w:iCs w:val="0"/>
+        <w:smallCaps w:val="0"/>
+        <w:strike w:val="0"/>
+        <w:color w:val="000000"/>
+        <w:sz w:val="22"/>
+        <w:szCs w:val="22"/>
+        <w:u w:val="none"/>
+        <w:shd w:val="clear" w:color="auto" w:fill="auto"/>
+        <w:vertAlign w:val="baseline"/>
+      </w:rPr>
+    </w:lvl>
+    <w:lvl w:ilvl="5">
+      <w:start w:val="1"/>
+      <w:numFmt w:val="bullet"/>
+      <w:lvlText w:val="■"/>
+      <w:lvlJc w:val="left"/>
+      <w:pPr>
+        <w:ind w:left="4320" w:hanging="360"/>
+      </w:pPr>
+      <w:rPr>
+        <w:rFonts w:ascii="Arial" w:eastAsia="Arial" w:hAnsi="Arial" w:cs="Arial"/>
+        <w:b w:val="0"/>
+        <w:bCs w:val="0"/>
+        <w:i w:val="0"/>
+        <w:iCs w:val="0"/>
+        <w:smallCaps w:val="0"/>
+        <w:strike w:val="0"/>
+        <w:color w:val="000000"/>
+        <w:sz w:val="22"/>
+        <w:szCs w:val="22"/>
+        <w:u w:val="none"/>
+        <w:shd w:val="clear" w:color="auto" w:fill="auto"/>
+        <w:vertAlign w:val="baseline"/>
+      </w:rPr>
+    </w:lvl>
+    <w:lvl w:ilvl="6">
+      <w:start w:val="1"/>
+      <w:numFmt w:val="bullet"/>
+      <w:lvlText w:val="■"/>
+      <w:lvlJc w:val="left"/>
+      <w:pPr>
+        <w:ind w:left="5040" w:hanging="360"/>
+      </w:pPr>
+      <w:rPr>
+        <w:rFonts w:ascii="Arial" w:eastAsia="Arial" w:hAnsi="Arial" w:cs="Arial"/>
+        <w:b w:val="0"/>
+        <w:bCs w:val="0"/>
+        <w:i w:val="0"/>
+        <w:iCs w:val="0"/>
+        <w:smallCaps w:val="0"/>
+        <w:strike w:val="0"/>
+        <w:color w:val="000000"/>
+        <w:sz w:val="22"/>
+        <w:szCs w:val="22"/>
+        <w:u w:val="none"/>
+        <w:shd w:val="clear" w:color="auto" w:fill="auto"/>
+        <w:vertAlign w:val="baseline"/>
+      </w:rPr>
+    </w:lvl>
+    <w:lvl w:ilvl="7">
+      <w:start w:val="1"/>
+      <w:numFmt w:val="bullet"/>
+      <w:lvlText w:val="■"/>
+      <w:lvlJc w:val="left"/>
+      <w:pPr>
+        <w:ind w:left="5760" w:hanging="360"/>
+      </w:pPr>
+      <w:rPr>
+        <w:rFonts w:ascii="Arial" w:eastAsia="Arial" w:hAnsi="Arial" w:cs="Arial"/>
+        <w:b w:val="0"/>
+        <w:bCs w:val="0"/>
+        <w:i w:val="0"/>
+        <w:iCs w:val="0"/>
+        <w:smallCaps w:val="0"/>
+        <w:strike w:val="0"/>
+        <w:color w:val="000000"/>
+        <w:sz w:val="22"/>
+        <w:szCs w:val="22"/>
+        <w:u w:val="none"/>
+        <w:shd w:val="clear" w:color="auto" w:fill="auto"/>
+        <w:vertAlign w:val="baseline"/>
+      </w:rPr>
+    </w:lvl>
+    <w:lvl w:ilvl="8">
+      <w:start w:val="1"/>
+      <w:numFmt w:val="bullet"/>
+      <w:lvlText w:val="■"/>
+      <w:lvlJc w:val="left"/>
+      <w:pPr>
+        <w:ind w:left="6480" w:hanging="360"/>
+      </w:pPr>
+      <w:rPr>
+        <w:rFonts w:ascii="Arial" w:eastAsia="Arial" w:hAnsi="Arial" w:cs="Arial"/>
+        <w:b w:val="0"/>
+        <w:bCs w:val="0"/>
+        <w:i w:val="0"/>
+        <w:iCs w:val="0"/>
+        <w:smallCaps w:val="0"/>
+        <w:strike w:val="0"/>
+        <w:color w:val="000000"/>
+        <w:sz w:val="22"/>
+        <w:szCs w:val="22"/>
+        <w:u w:val="none"/>
+        <w:shd w:val="clear" w:color="auto" w:fill="auto"/>
+        <w:vertAlign w:val="baseline"/>
+      </w:rPr>
+    </w:lvl>
+  </w:abstractNum>
+  <w:abstractNum w:abstractNumId="4" w15:restartNumberingAfterBreak="0">
     <w:nsid w:val="19463D58"/>
     <w:multiLevelType w:val="multilevel"/>
     <w:tmpl w:val="27A6613C"/>
@@ -7024,7 +8752,7 @@
       </w:rPr>
     </w:lvl>
   </w:abstractNum>
-  <w:abstractNum w:abstractNumId="4" w15:restartNumberingAfterBreak="0">
+  <w:abstractNum w:abstractNumId="5" w15:restartNumberingAfterBreak="0">
     <w:nsid w:val="196F7BFD"/>
     <w:multiLevelType w:val="multilevel"/>
     <w:tmpl w:val="DC8806CE"/>
@@ -7245,7 +8973,7 @@
       </w:rPr>
     </w:lvl>
   </w:abstractNum>
-  <w:abstractNum w:abstractNumId="5" w15:restartNumberingAfterBreak="0">
+  <w:abstractNum w:abstractNumId="6" w15:restartNumberingAfterBreak="0">
     <w:nsid w:val="271F0711"/>
     <w:multiLevelType w:val="multilevel"/>
     <w:tmpl w:val="943C6860"/>
@@ -7466,7 +9194,7 @@
       </w:rPr>
     </w:lvl>
   </w:abstractNum>
-  <w:abstractNum w:abstractNumId="6" w15:restartNumberingAfterBreak="0">
+  <w:abstractNum w:abstractNumId="7" w15:restartNumberingAfterBreak="0">
     <w:nsid w:val="308F252C"/>
     <w:multiLevelType w:val="multilevel"/>
     <w:tmpl w:val="61766410"/>
@@ -7687,7 +9415,7 @@
       </w:rPr>
     </w:lvl>
   </w:abstractNum>
-  <w:abstractNum w:abstractNumId="7" w15:restartNumberingAfterBreak="0">
+  <w:abstractNum w:abstractNumId="8" w15:restartNumberingAfterBreak="0">
     <w:nsid w:val="3AAE717A"/>
     <w:multiLevelType w:val="hybridMultilevel"/>
     <w:tmpl w:val="7CCAD1B8"/>
@@ -7799,7 +9527,7 @@
       </w:rPr>
     </w:lvl>
   </w:abstractNum>
-  <w:abstractNum w:abstractNumId="8" w15:restartNumberingAfterBreak="0">
+  <w:abstractNum w:abstractNumId="9" w15:restartNumberingAfterBreak="0">
     <w:nsid w:val="3D7858A5"/>
     <w:multiLevelType w:val="multilevel"/>
     <w:tmpl w:val="C6229DE4"/>
@@ -8020,7 +9748,7 @@
       </w:rPr>
     </w:lvl>
   </w:abstractNum>
-  <w:abstractNum w:abstractNumId="9" w15:restartNumberingAfterBreak="0">
+  <w:abstractNum w:abstractNumId="10" w15:restartNumberingAfterBreak="0">
     <w:nsid w:val="42B1333A"/>
     <w:multiLevelType w:val="multilevel"/>
     <w:tmpl w:val="F2CC0728"/>
@@ -8169,7 +9897,7 @@
       </w:rPr>
     </w:lvl>
   </w:abstractNum>
-  <w:abstractNum w:abstractNumId="10" w15:restartNumberingAfterBreak="0">
+  <w:abstractNum w:abstractNumId="11" w15:restartNumberingAfterBreak="0">
     <w:nsid w:val="43BF3054"/>
     <w:multiLevelType w:val="multilevel"/>
     <w:tmpl w:val="A6BA997A"/>
@@ -8390,7 +10118,228 @@
       </w:rPr>
     </w:lvl>
   </w:abstractNum>
-  <w:abstractNum w:abstractNumId="11" w15:restartNumberingAfterBreak="0">
+  <w:abstractNum w:abstractNumId="12" w15:restartNumberingAfterBreak="0">
+    <w:nsid w:val="492F4CBB"/>
+    <w:multiLevelType w:val="multilevel"/>
+    <w:tmpl w:val="EFF2AAB2"/>
+    <w:lvl w:ilvl="0">
+      <w:start w:val="1"/>
+      <w:numFmt w:val="bullet"/>
+      <w:lvlText w:val="●"/>
+      <w:lvlJc w:val="left"/>
+      <w:pPr>
+        <w:ind w:left="465" w:hanging="360"/>
+      </w:pPr>
+      <w:rPr>
+        <w:rFonts w:ascii="Arial" w:eastAsia="Arial" w:hAnsi="Arial" w:cs="Arial"/>
+        <w:b w:val="0"/>
+        <w:bCs w:val="0"/>
+        <w:i w:val="0"/>
+        <w:iCs w:val="0"/>
+        <w:smallCaps w:val="0"/>
+        <w:strike w:val="0"/>
+        <w:color w:val="000000"/>
+        <w:sz w:val="22"/>
+        <w:szCs w:val="22"/>
+        <w:u w:val="none"/>
+        <w:shd w:val="clear" w:color="auto" w:fill="auto"/>
+        <w:vertAlign w:val="baseline"/>
+      </w:rPr>
+    </w:lvl>
+    <w:lvl w:ilvl="1">
+      <w:start w:val="1"/>
+      <w:numFmt w:val="bullet"/>
+      <w:lvlText w:val="○"/>
+      <w:lvlJc w:val="left"/>
+      <w:pPr>
+        <w:ind w:left="1440" w:hanging="360"/>
+      </w:pPr>
+      <w:rPr>
+        <w:rFonts w:ascii="Arial" w:eastAsia="Arial" w:hAnsi="Arial" w:cs="Arial"/>
+        <w:b w:val="0"/>
+        <w:bCs w:val="0"/>
+        <w:i w:val="0"/>
+        <w:iCs w:val="0"/>
+        <w:smallCaps w:val="0"/>
+        <w:strike w:val="0"/>
+        <w:color w:val="000000"/>
+        <w:sz w:val="22"/>
+        <w:szCs w:val="22"/>
+        <w:u w:val="none"/>
+        <w:shd w:val="clear" w:color="auto" w:fill="auto"/>
+        <w:vertAlign w:val="baseline"/>
+      </w:rPr>
+    </w:lvl>
+    <w:lvl w:ilvl="2">
+      <w:start w:val="1"/>
+      <w:numFmt w:val="bullet"/>
+      <w:lvlText w:val="■"/>
+      <w:lvlJc w:val="left"/>
+      <w:pPr>
+        <w:ind w:left="2160" w:hanging="360"/>
+      </w:pPr>
+      <w:rPr>
+        <w:rFonts w:ascii="Arial" w:eastAsia="Arial" w:hAnsi="Arial" w:cs="Arial"/>
+        <w:b w:val="0"/>
+        <w:bCs w:val="0"/>
+        <w:i w:val="0"/>
+        <w:iCs w:val="0"/>
+        <w:smallCaps w:val="0"/>
+        <w:strike w:val="0"/>
+        <w:color w:val="000000"/>
+        <w:sz w:val="22"/>
+        <w:szCs w:val="22"/>
+        <w:u w:val="none"/>
+        <w:shd w:val="clear" w:color="auto" w:fill="auto"/>
+        <w:vertAlign w:val="baseline"/>
+      </w:rPr>
+    </w:lvl>
+    <w:lvl w:ilvl="3">
+      <w:start w:val="1"/>
+      <w:numFmt w:val="bullet"/>
+      <w:lvlText w:val="■"/>
+      <w:lvlJc w:val="left"/>
+      <w:pPr>
+        <w:ind w:left="2880" w:hanging="360"/>
+      </w:pPr>
+      <w:rPr>
+        <w:rFonts w:ascii="Arial" w:eastAsia="Arial" w:hAnsi="Arial" w:cs="Arial"/>
+        <w:b w:val="0"/>
+        <w:bCs w:val="0"/>
+        <w:i w:val="0"/>
+        <w:iCs w:val="0"/>
+        <w:smallCaps w:val="0"/>
+        <w:strike w:val="0"/>
+        <w:color w:val="000000"/>
+        <w:sz w:val="22"/>
+        <w:szCs w:val="22"/>
+        <w:u w:val="none"/>
+        <w:shd w:val="clear" w:color="auto" w:fill="auto"/>
+        <w:vertAlign w:val="baseline"/>
+      </w:rPr>
+    </w:lvl>
+    <w:lvl w:ilvl="4">
+      <w:start w:val="1"/>
+      <w:numFmt w:val="bullet"/>
+      <w:lvlText w:val="■"/>
+      <w:lvlJc w:val="left"/>
+      <w:pPr>
+        <w:ind w:left="3600" w:hanging="360"/>
+      </w:pPr>
+      <w:rPr>
+        <w:rFonts w:ascii="Arial" w:eastAsia="Arial" w:hAnsi="Arial" w:cs="Arial"/>
+        <w:b w:val="0"/>
+        <w:bCs w:val="0"/>
+        <w:i w:val="0"/>
+        <w:iCs w:val="0"/>
+        <w:smallCaps w:val="0"/>
+        <w:strike w:val="0"/>
+        <w:color w:val="000000"/>
+        <w:sz w:val="22"/>
+        <w:szCs w:val="22"/>
+        <w:u w:val="none"/>
+        <w:shd w:val="clear" w:color="auto" w:fill="auto"/>
+        <w:vertAlign w:val="baseline"/>
+      </w:rPr>
+    </w:lvl>
+    <w:lvl w:ilvl="5">
+      <w:start w:val="1"/>
+      <w:numFmt w:val="bullet"/>
+      <w:lvlText w:val="■"/>
+      <w:lvlJc w:val="left"/>
+      <w:pPr>
+        <w:ind w:left="4320" w:hanging="360"/>
+      </w:pPr>
+      <w:rPr>
+        <w:rFonts w:ascii="Arial" w:eastAsia="Arial" w:hAnsi="Arial" w:cs="Arial"/>
+        <w:b w:val="0"/>
+        <w:bCs w:val="0"/>
+        <w:i w:val="0"/>
+        <w:iCs w:val="0"/>
+        <w:smallCaps w:val="0"/>
+        <w:strike w:val="0"/>
+        <w:color w:val="000000"/>
+        <w:sz w:val="22"/>
+        <w:szCs w:val="22"/>
+        <w:u w:val="none"/>
+        <w:shd w:val="clear" w:color="auto" w:fill="auto"/>
+        <w:vertAlign w:val="baseline"/>
+      </w:rPr>
+    </w:lvl>
+    <w:lvl w:ilvl="6">
+      <w:start w:val="1"/>
+      <w:numFmt w:val="bullet"/>
+      <w:lvlText w:val="■"/>
+      <w:lvlJc w:val="left"/>
+      <w:pPr>
+        <w:ind w:left="5040" w:hanging="360"/>
+      </w:pPr>
+      <w:rPr>
+        <w:rFonts w:ascii="Arial" w:eastAsia="Arial" w:hAnsi="Arial" w:cs="Arial"/>
+        <w:b w:val="0"/>
+        <w:bCs w:val="0"/>
+        <w:i w:val="0"/>
+        <w:iCs w:val="0"/>
+        <w:smallCaps w:val="0"/>
+        <w:strike w:val="0"/>
+        <w:color w:val="000000"/>
+        <w:sz w:val="22"/>
+        <w:szCs w:val="22"/>
+        <w:u w:val="none"/>
+        <w:shd w:val="clear" w:color="auto" w:fill="auto"/>
+        <w:vertAlign w:val="baseline"/>
+      </w:rPr>
+    </w:lvl>
+    <w:lvl w:ilvl="7">
+      <w:start w:val="1"/>
+      <w:numFmt w:val="bullet"/>
+      <w:lvlText w:val="■"/>
+      <w:lvlJc w:val="left"/>
+      <w:pPr>
+        <w:ind w:left="5760" w:hanging="360"/>
+      </w:pPr>
+      <w:rPr>
+        <w:rFonts w:ascii="Arial" w:eastAsia="Arial" w:hAnsi="Arial" w:cs="Arial"/>
+        <w:b w:val="0"/>
+        <w:bCs w:val="0"/>
+        <w:i w:val="0"/>
+        <w:iCs w:val="0"/>
+        <w:smallCaps w:val="0"/>
+        <w:strike w:val="0"/>
+        <w:color w:val="000000"/>
+        <w:sz w:val="22"/>
+        <w:szCs w:val="22"/>
+        <w:u w:val="none"/>
+        <w:shd w:val="clear" w:color="auto" w:fill="auto"/>
+        <w:vertAlign w:val="baseline"/>
+      </w:rPr>
+    </w:lvl>
+    <w:lvl w:ilvl="8">
+      <w:start w:val="1"/>
+      <w:numFmt w:val="bullet"/>
+      <w:lvlText w:val="■"/>
+      <w:lvlJc w:val="left"/>
+      <w:pPr>
+        <w:ind w:left="6480" w:hanging="360"/>
+      </w:pPr>
+      <w:rPr>
+        <w:rFonts w:ascii="Arial" w:eastAsia="Arial" w:hAnsi="Arial" w:cs="Arial"/>
+        <w:b w:val="0"/>
+        <w:bCs w:val="0"/>
+        <w:i w:val="0"/>
+        <w:iCs w:val="0"/>
+        <w:smallCaps w:val="0"/>
+        <w:strike w:val="0"/>
+        <w:color w:val="000000"/>
+        <w:sz w:val="22"/>
+        <w:szCs w:val="22"/>
+        <w:u w:val="none"/>
+        <w:shd w:val="clear" w:color="auto" w:fill="auto"/>
+        <w:vertAlign w:val="baseline"/>
+      </w:rPr>
+    </w:lvl>
+  </w:abstractNum>
+  <w:abstractNum w:abstractNumId="13" w15:restartNumberingAfterBreak="0">
     <w:nsid w:val="5933549B"/>
     <w:multiLevelType w:val="multilevel"/>
     <w:tmpl w:val="FAF64B00"/>
@@ -8539,7 +10488,449 @@
       </w:rPr>
     </w:lvl>
   </w:abstractNum>
-  <w:abstractNum w:abstractNumId="12" w15:restartNumberingAfterBreak="0">
+  <w:abstractNum w:abstractNumId="14" w15:restartNumberingAfterBreak="0">
+    <w:nsid w:val="679470D0"/>
+    <w:multiLevelType w:val="multilevel"/>
+    <w:tmpl w:val="39EA502C"/>
+    <w:lvl w:ilvl="0">
+      <w:start w:val="1"/>
+      <w:numFmt w:val="bullet"/>
+      <w:lvlText w:val="●"/>
+      <w:lvlJc w:val="left"/>
+      <w:pPr>
+        <w:ind w:left="465" w:hanging="360"/>
+      </w:pPr>
+      <w:rPr>
+        <w:rFonts w:ascii="Arial" w:eastAsia="Arial" w:hAnsi="Arial" w:cs="Arial"/>
+        <w:b w:val="0"/>
+        <w:bCs w:val="0"/>
+        <w:i w:val="0"/>
+        <w:iCs w:val="0"/>
+        <w:smallCaps w:val="0"/>
+        <w:strike w:val="0"/>
+        <w:color w:val="000000"/>
+        <w:sz w:val="22"/>
+        <w:szCs w:val="22"/>
+        <w:u w:val="none"/>
+        <w:shd w:val="clear" w:color="auto" w:fill="auto"/>
+        <w:vertAlign w:val="baseline"/>
+      </w:rPr>
+    </w:lvl>
+    <w:lvl w:ilvl="1">
+      <w:start w:val="1"/>
+      <w:numFmt w:val="bullet"/>
+      <w:lvlText w:val="○"/>
+      <w:lvlJc w:val="left"/>
+      <w:pPr>
+        <w:ind w:left="1440" w:hanging="360"/>
+      </w:pPr>
+      <w:rPr>
+        <w:rFonts w:ascii="Arial" w:eastAsia="Arial" w:hAnsi="Arial" w:cs="Arial"/>
+        <w:b w:val="0"/>
+        <w:bCs w:val="0"/>
+        <w:i w:val="0"/>
+        <w:iCs w:val="0"/>
+        <w:smallCaps w:val="0"/>
+        <w:strike w:val="0"/>
+        <w:color w:val="000000"/>
+        <w:sz w:val="22"/>
+        <w:szCs w:val="22"/>
+        <w:u w:val="none"/>
+        <w:shd w:val="clear" w:color="auto" w:fill="auto"/>
+        <w:vertAlign w:val="baseline"/>
+      </w:rPr>
+    </w:lvl>
+    <w:lvl w:ilvl="2">
+      <w:start w:val="1"/>
+      <w:numFmt w:val="bullet"/>
+      <w:lvlText w:val="■"/>
+      <w:lvlJc w:val="left"/>
+      <w:pPr>
+        <w:ind w:left="2160" w:hanging="360"/>
+      </w:pPr>
+      <w:rPr>
+        <w:rFonts w:ascii="Arial" w:eastAsia="Arial" w:hAnsi="Arial" w:cs="Arial"/>
+        <w:b w:val="0"/>
+        <w:bCs w:val="0"/>
+        <w:i w:val="0"/>
+        <w:iCs w:val="0"/>
+        <w:smallCaps w:val="0"/>
+        <w:strike w:val="0"/>
+        <w:color w:val="000000"/>
+        <w:sz w:val="22"/>
+        <w:szCs w:val="22"/>
+        <w:u w:val="none"/>
+        <w:shd w:val="clear" w:color="auto" w:fill="auto"/>
+        <w:vertAlign w:val="baseline"/>
+      </w:rPr>
+    </w:lvl>
+    <w:lvl w:ilvl="3">
+      <w:start w:val="1"/>
+      <w:numFmt w:val="bullet"/>
+      <w:lvlText w:val="■"/>
+      <w:lvlJc w:val="left"/>
+      <w:pPr>
+        <w:ind w:left="2880" w:hanging="360"/>
+      </w:pPr>
+      <w:rPr>
+        <w:rFonts w:ascii="Arial" w:eastAsia="Arial" w:hAnsi="Arial" w:cs="Arial"/>
+        <w:b w:val="0"/>
+        <w:bCs w:val="0"/>
+        <w:i w:val="0"/>
+        <w:iCs w:val="0"/>
+        <w:smallCaps w:val="0"/>
+        <w:strike w:val="0"/>
+        <w:color w:val="000000"/>
+        <w:sz w:val="22"/>
+        <w:szCs w:val="22"/>
+        <w:u w:val="none"/>
+        <w:shd w:val="clear" w:color="auto" w:fill="auto"/>
+        <w:vertAlign w:val="baseline"/>
+      </w:rPr>
+    </w:lvl>
+    <w:lvl w:ilvl="4">
+      <w:start w:val="1"/>
+      <w:numFmt w:val="bullet"/>
+      <w:lvlText w:val="■"/>
+      <w:lvlJc w:val="left"/>
+      <w:pPr>
+        <w:ind w:left="3600" w:hanging="360"/>
+      </w:pPr>
+      <w:rPr>
+        <w:rFonts w:ascii="Arial" w:eastAsia="Arial" w:hAnsi="Arial" w:cs="Arial"/>
+        <w:b w:val="0"/>
+        <w:bCs w:val="0"/>
+        <w:i w:val="0"/>
+        <w:iCs w:val="0"/>
+        <w:smallCaps w:val="0"/>
+        <w:strike w:val="0"/>
+        <w:color w:val="000000"/>
+        <w:sz w:val="22"/>
+        <w:szCs w:val="22"/>
+        <w:u w:val="none"/>
+        <w:shd w:val="clear" w:color="auto" w:fill="auto"/>
+        <w:vertAlign w:val="baseline"/>
+      </w:rPr>
+    </w:lvl>
+    <w:lvl w:ilvl="5">
+      <w:start w:val="1"/>
+      <w:numFmt w:val="bullet"/>
+      <w:lvlText w:val="■"/>
+      <w:lvlJc w:val="left"/>
+      <w:pPr>
+        <w:ind w:left="4320" w:hanging="360"/>
+      </w:pPr>
+      <w:rPr>
+        <w:rFonts w:ascii="Arial" w:eastAsia="Arial" w:hAnsi="Arial" w:cs="Arial"/>
+        <w:b w:val="0"/>
+        <w:bCs w:val="0"/>
+        <w:i w:val="0"/>
+        <w:iCs w:val="0"/>
+        <w:smallCaps w:val="0"/>
+        <w:strike w:val="0"/>
+        <w:color w:val="000000"/>
+        <w:sz w:val="22"/>
+        <w:szCs w:val="22"/>
+        <w:u w:val="none"/>
+        <w:shd w:val="clear" w:color="auto" w:fill="auto"/>
+        <w:vertAlign w:val="baseline"/>
+      </w:rPr>
+    </w:lvl>
+    <w:lvl w:ilvl="6">
+      <w:start w:val="1"/>
+      <w:numFmt w:val="bullet"/>
+      <w:lvlText w:val="■"/>
+      <w:lvlJc w:val="left"/>
+      <w:pPr>
+        <w:ind w:left="5040" w:hanging="360"/>
+      </w:pPr>
+      <w:rPr>
+        <w:rFonts w:ascii="Arial" w:eastAsia="Arial" w:hAnsi="Arial" w:cs="Arial"/>
+        <w:b w:val="0"/>
+        <w:bCs w:val="0"/>
+        <w:i w:val="0"/>
+        <w:iCs w:val="0"/>
+        <w:smallCaps w:val="0"/>
+        <w:strike w:val="0"/>
+        <w:color w:val="000000"/>
+        <w:sz w:val="22"/>
+        <w:szCs w:val="22"/>
+        <w:u w:val="none"/>
+        <w:shd w:val="clear" w:color="auto" w:fill="auto"/>
+        <w:vertAlign w:val="baseline"/>
+      </w:rPr>
+    </w:lvl>
+    <w:lvl w:ilvl="7">
+      <w:start w:val="1"/>
+      <w:numFmt w:val="bullet"/>
+      <w:lvlText w:val="■"/>
+      <w:lvlJc w:val="left"/>
+      <w:pPr>
+        <w:ind w:left="5760" w:hanging="360"/>
+      </w:pPr>
+      <w:rPr>
+        <w:rFonts w:ascii="Arial" w:eastAsia="Arial" w:hAnsi="Arial" w:cs="Arial"/>
+        <w:b w:val="0"/>
+        <w:bCs w:val="0"/>
+        <w:i w:val="0"/>
+        <w:iCs w:val="0"/>
+        <w:smallCaps w:val="0"/>
+        <w:strike w:val="0"/>
+        <w:color w:val="000000"/>
+        <w:sz w:val="22"/>
+        <w:szCs w:val="22"/>
+        <w:u w:val="none"/>
+        <w:shd w:val="clear" w:color="auto" w:fill="auto"/>
+        <w:vertAlign w:val="baseline"/>
+      </w:rPr>
+    </w:lvl>
+    <w:lvl w:ilvl="8">
+      <w:start w:val="1"/>
+      <w:numFmt w:val="bullet"/>
+      <w:lvlText w:val="■"/>
+      <w:lvlJc w:val="left"/>
+      <w:pPr>
+        <w:ind w:left="6480" w:hanging="360"/>
+      </w:pPr>
+      <w:rPr>
+        <w:rFonts w:ascii="Arial" w:eastAsia="Arial" w:hAnsi="Arial" w:cs="Arial"/>
+        <w:b w:val="0"/>
+        <w:bCs w:val="0"/>
+        <w:i w:val="0"/>
+        <w:iCs w:val="0"/>
+        <w:smallCaps w:val="0"/>
+        <w:strike w:val="0"/>
+        <w:color w:val="000000"/>
+        <w:sz w:val="22"/>
+        <w:szCs w:val="22"/>
+        <w:u w:val="none"/>
+        <w:shd w:val="clear" w:color="auto" w:fill="auto"/>
+        <w:vertAlign w:val="baseline"/>
+      </w:rPr>
+    </w:lvl>
+  </w:abstractNum>
+  <w:abstractNum w:abstractNumId="15" w15:restartNumberingAfterBreak="0">
+    <w:nsid w:val="6FB66559"/>
+    <w:multiLevelType w:val="multilevel"/>
+    <w:tmpl w:val="A0B49D44"/>
+    <w:lvl w:ilvl="0">
+      <w:start w:val="1"/>
+      <w:numFmt w:val="bullet"/>
+      <w:lvlText w:val="●"/>
+      <w:lvlJc w:val="left"/>
+      <w:pPr>
+        <w:ind w:left="465" w:hanging="360"/>
+      </w:pPr>
+      <w:rPr>
+        <w:rFonts w:ascii="Arial" w:eastAsia="Arial" w:hAnsi="Arial" w:cs="Arial"/>
+        <w:b w:val="0"/>
+        <w:bCs w:val="0"/>
+        <w:i w:val="0"/>
+        <w:iCs w:val="0"/>
+        <w:smallCaps w:val="0"/>
+        <w:strike w:val="0"/>
+        <w:color w:val="000000"/>
+        <w:sz w:val="22"/>
+        <w:szCs w:val="22"/>
+        <w:u w:val="none"/>
+        <w:shd w:val="clear" w:color="auto" w:fill="auto"/>
+        <w:vertAlign w:val="baseline"/>
+      </w:rPr>
+    </w:lvl>
+    <w:lvl w:ilvl="1">
+      <w:start w:val="1"/>
+      <w:numFmt w:val="bullet"/>
+      <w:lvlText w:val="○"/>
+      <w:lvlJc w:val="left"/>
+      <w:pPr>
+        <w:ind w:left="1440" w:hanging="360"/>
+      </w:pPr>
+      <w:rPr>
+        <w:rFonts w:ascii="Arial" w:eastAsia="Arial" w:hAnsi="Arial" w:cs="Arial"/>
+        <w:b w:val="0"/>
+        <w:bCs w:val="0"/>
+        <w:i w:val="0"/>
+        <w:iCs w:val="0"/>
+        <w:smallCaps w:val="0"/>
+        <w:strike w:val="0"/>
+        <w:color w:val="000000"/>
+        <w:sz w:val="22"/>
+        <w:szCs w:val="22"/>
+        <w:u w:val="none"/>
+        <w:shd w:val="clear" w:color="auto" w:fill="auto"/>
+        <w:vertAlign w:val="baseline"/>
+      </w:rPr>
+    </w:lvl>
+    <w:lvl w:ilvl="2">
+      <w:start w:val="1"/>
+      <w:numFmt w:val="bullet"/>
+      <w:lvlText w:val="■"/>
+      <w:lvlJc w:val="left"/>
+      <w:pPr>
+        <w:ind w:left="2160" w:hanging="360"/>
+      </w:pPr>
+      <w:rPr>
+        <w:rFonts w:ascii="Arial" w:eastAsia="Arial" w:hAnsi="Arial" w:cs="Arial"/>
+        <w:b w:val="0"/>
+        <w:bCs w:val="0"/>
+        <w:i w:val="0"/>
+        <w:iCs w:val="0"/>
+        <w:smallCaps w:val="0"/>
+        <w:strike w:val="0"/>
+        <w:color w:val="000000"/>
+        <w:sz w:val="22"/>
+        <w:szCs w:val="22"/>
+        <w:u w:val="none"/>
+        <w:shd w:val="clear" w:color="auto" w:fill="auto"/>
+        <w:vertAlign w:val="baseline"/>
+      </w:rPr>
+    </w:lvl>
+    <w:lvl w:ilvl="3">
+      <w:start w:val="1"/>
+      <w:numFmt w:val="bullet"/>
+      <w:lvlText w:val="■"/>
+      <w:lvlJc w:val="left"/>
+      <w:pPr>
+        <w:ind w:left="2880" w:hanging="360"/>
+      </w:pPr>
+      <w:rPr>
+        <w:rFonts w:ascii="Arial" w:eastAsia="Arial" w:hAnsi="Arial" w:cs="Arial"/>
+        <w:b w:val="0"/>
+        <w:bCs w:val="0"/>
+        <w:i w:val="0"/>
+        <w:iCs w:val="0"/>
+        <w:smallCaps w:val="0"/>
+        <w:strike w:val="0"/>
+        <w:color w:val="000000"/>
+        <w:sz w:val="22"/>
+        <w:szCs w:val="22"/>
+        <w:u w:val="none"/>
+        <w:shd w:val="clear" w:color="auto" w:fill="auto"/>
+        <w:vertAlign w:val="baseline"/>
+      </w:rPr>
+    </w:lvl>
+    <w:lvl w:ilvl="4">
+      <w:start w:val="1"/>
+      <w:numFmt w:val="bullet"/>
+      <w:lvlText w:val="■"/>
+      <w:lvlJc w:val="left"/>
+      <w:pPr>
+        <w:ind w:left="3600" w:hanging="360"/>
+      </w:pPr>
+      <w:rPr>
+        <w:rFonts w:ascii="Arial" w:eastAsia="Arial" w:hAnsi="Arial" w:cs="Arial"/>
+        <w:b w:val="0"/>
+        <w:bCs w:val="0"/>
+        <w:i w:val="0"/>
+        <w:iCs w:val="0"/>
+        <w:smallCaps w:val="0"/>
+        <w:strike w:val="0"/>
+        <w:color w:val="000000"/>
+        <w:sz w:val="22"/>
+        <w:szCs w:val="22"/>
+        <w:u w:val="none"/>
+        <w:shd w:val="clear" w:color="auto" w:fill="auto"/>
+        <w:vertAlign w:val="baseline"/>
+      </w:rPr>
+    </w:lvl>
+    <w:lvl w:ilvl="5">
+      <w:start w:val="1"/>
+      <w:numFmt w:val="bullet"/>
+      <w:lvlText w:val="■"/>
+      <w:lvlJc w:val="left"/>
+      <w:pPr>
+        <w:ind w:left="4320" w:hanging="360"/>
+      </w:pPr>
+      <w:rPr>
+        <w:rFonts w:ascii="Arial" w:eastAsia="Arial" w:hAnsi="Arial" w:cs="Arial"/>
+        <w:b w:val="0"/>
+        <w:bCs w:val="0"/>
+        <w:i w:val="0"/>
+        <w:iCs w:val="0"/>
+        <w:smallCaps w:val="0"/>
+        <w:strike w:val="0"/>
+        <w:color w:val="000000"/>
+        <w:sz w:val="22"/>
+        <w:szCs w:val="22"/>
+        <w:u w:val="none"/>
+        <w:shd w:val="clear" w:color="auto" w:fill="auto"/>
+        <w:vertAlign w:val="baseline"/>
+      </w:rPr>
+    </w:lvl>
+    <w:lvl w:ilvl="6">
+      <w:start w:val="1"/>
+      <w:numFmt w:val="bullet"/>
+      <w:lvlText w:val="■"/>
+      <w:lvlJc w:val="left"/>
+      <w:pPr>
+        <w:ind w:left="5040" w:hanging="360"/>
+      </w:pPr>
+      <w:rPr>
+        <w:rFonts w:ascii="Arial" w:eastAsia="Arial" w:hAnsi="Arial" w:cs="Arial"/>
+        <w:b w:val="0"/>
+        <w:bCs w:val="0"/>
+        <w:i w:val="0"/>
+        <w:iCs w:val="0"/>
+        <w:smallCaps w:val="0"/>
+        <w:strike w:val="0"/>
+        <w:color w:val="000000"/>
+        <w:sz w:val="22"/>
+        <w:szCs w:val="22"/>
+        <w:u w:val="none"/>
+        <w:shd w:val="clear" w:color="auto" w:fill="auto"/>
+        <w:vertAlign w:val="baseline"/>
+      </w:rPr>
+    </w:lvl>
+    <w:lvl w:ilvl="7">
+      <w:start w:val="1"/>
+      <w:numFmt w:val="bullet"/>
+      <w:lvlText w:val="■"/>
+      <w:lvlJc w:val="left"/>
+      <w:pPr>
+        <w:ind w:left="5760" w:hanging="360"/>
+      </w:pPr>
+      <w:rPr>
+        <w:rFonts w:ascii="Arial" w:eastAsia="Arial" w:hAnsi="Arial" w:cs="Arial"/>
+        <w:b w:val="0"/>
+        <w:bCs w:val="0"/>
+        <w:i w:val="0"/>
+        <w:iCs w:val="0"/>
+        <w:smallCaps w:val="0"/>
+        <w:strike w:val="0"/>
+        <w:color w:val="000000"/>
+        <w:sz w:val="22"/>
+        <w:szCs w:val="22"/>
+        <w:u w:val="none"/>
+        <w:shd w:val="clear" w:color="auto" w:fill="auto"/>
+        <w:vertAlign w:val="baseline"/>
+      </w:rPr>
+    </w:lvl>
+    <w:lvl w:ilvl="8">
+      <w:start w:val="1"/>
+      <w:numFmt w:val="bullet"/>
+      <w:lvlText w:val="■"/>
+      <w:lvlJc w:val="left"/>
+      <w:pPr>
+        <w:ind w:left="6480" w:hanging="360"/>
+      </w:pPr>
+      <w:rPr>
+        <w:rFonts w:ascii="Arial" w:eastAsia="Arial" w:hAnsi="Arial" w:cs="Arial"/>
+        <w:b w:val="0"/>
+        <w:bCs w:val="0"/>
+        <w:i w:val="0"/>
+        <w:iCs w:val="0"/>
+        <w:smallCaps w:val="0"/>
+        <w:strike w:val="0"/>
+        <w:color w:val="000000"/>
+        <w:sz w:val="22"/>
+        <w:szCs w:val="22"/>
+        <w:u w:val="none"/>
+        <w:shd w:val="clear" w:color="auto" w:fill="auto"/>
+        <w:vertAlign w:val="baseline"/>
+      </w:rPr>
+    </w:lvl>
+  </w:abstractNum>
+  <w:abstractNum w:abstractNumId="16" w15:restartNumberingAfterBreak="0">
     <w:nsid w:val="70646CBA"/>
     <w:multiLevelType w:val="hybridMultilevel"/>
     <w:tmpl w:val="BC9C5C7A"/>
@@ -8652,7 +11043,228 @@
       </w:rPr>
     </w:lvl>
   </w:abstractNum>
-  <w:abstractNum w:abstractNumId="13" w15:restartNumberingAfterBreak="0">
+  <w:abstractNum w:abstractNumId="17" w15:restartNumberingAfterBreak="0">
+    <w:nsid w:val="70D57C16"/>
+    <w:multiLevelType w:val="multilevel"/>
+    <w:tmpl w:val="3A760B6C"/>
+    <w:lvl w:ilvl="0">
+      <w:start w:val="1"/>
+      <w:numFmt w:val="bullet"/>
+      <w:lvlText w:val="●"/>
+      <w:lvlJc w:val="left"/>
+      <w:pPr>
+        <w:ind w:left="465" w:hanging="360"/>
+      </w:pPr>
+      <w:rPr>
+        <w:rFonts w:ascii="Arial" w:eastAsia="Arial" w:hAnsi="Arial" w:cs="Arial"/>
+        <w:b w:val="0"/>
+        <w:bCs w:val="0"/>
+        <w:i w:val="0"/>
+        <w:iCs w:val="0"/>
+        <w:smallCaps w:val="0"/>
+        <w:strike w:val="0"/>
+        <w:color w:val="000000"/>
+        <w:sz w:val="22"/>
+        <w:szCs w:val="22"/>
+        <w:u w:val="none"/>
+        <w:shd w:val="clear" w:color="auto" w:fill="auto"/>
+        <w:vertAlign w:val="baseline"/>
+      </w:rPr>
+    </w:lvl>
+    <w:lvl w:ilvl="1">
+      <w:start w:val="1"/>
+      <w:numFmt w:val="bullet"/>
+      <w:lvlText w:val="○"/>
+      <w:lvlJc w:val="left"/>
+      <w:pPr>
+        <w:ind w:left="1440" w:hanging="360"/>
+      </w:pPr>
+      <w:rPr>
+        <w:rFonts w:ascii="Arial" w:eastAsia="Arial" w:hAnsi="Arial" w:cs="Arial"/>
+        <w:b w:val="0"/>
+        <w:bCs w:val="0"/>
+        <w:i w:val="0"/>
+        <w:iCs w:val="0"/>
+        <w:smallCaps w:val="0"/>
+        <w:strike w:val="0"/>
+        <w:color w:val="000000"/>
+        <w:sz w:val="22"/>
+        <w:szCs w:val="22"/>
+        <w:u w:val="none"/>
+        <w:shd w:val="clear" w:color="auto" w:fill="auto"/>
+        <w:vertAlign w:val="baseline"/>
+      </w:rPr>
+    </w:lvl>
+    <w:lvl w:ilvl="2">
+      <w:start w:val="1"/>
+      <w:numFmt w:val="bullet"/>
+      <w:lvlText w:val="■"/>
+      <w:lvlJc w:val="left"/>
+      <w:pPr>
+        <w:ind w:left="2160" w:hanging="360"/>
+      </w:pPr>
+      <w:rPr>
+        <w:rFonts w:ascii="Arial" w:eastAsia="Arial" w:hAnsi="Arial" w:cs="Arial"/>
+        <w:b w:val="0"/>
+        <w:bCs w:val="0"/>
+        <w:i w:val="0"/>
+        <w:iCs w:val="0"/>
+        <w:smallCaps w:val="0"/>
+        <w:strike w:val="0"/>
+        <w:color w:val="000000"/>
+        <w:sz w:val="22"/>
+        <w:szCs w:val="22"/>
+        <w:u w:val="none"/>
+        <w:shd w:val="clear" w:color="auto" w:fill="auto"/>
+        <w:vertAlign w:val="baseline"/>
+      </w:rPr>
+    </w:lvl>
+    <w:lvl w:ilvl="3">
+      <w:start w:val="1"/>
+      <w:numFmt w:val="bullet"/>
+      <w:lvlText w:val="■"/>
+      <w:lvlJc w:val="left"/>
+      <w:pPr>
+        <w:ind w:left="2880" w:hanging="360"/>
+      </w:pPr>
+      <w:rPr>
+        <w:rFonts w:ascii="Arial" w:eastAsia="Arial" w:hAnsi="Arial" w:cs="Arial"/>
+        <w:b w:val="0"/>
+        <w:bCs w:val="0"/>
+        <w:i w:val="0"/>
+        <w:iCs w:val="0"/>
+        <w:smallCaps w:val="0"/>
+        <w:strike w:val="0"/>
+        <w:color w:val="000000"/>
+        <w:sz w:val="22"/>
+        <w:szCs w:val="22"/>
+        <w:u w:val="none"/>
+        <w:shd w:val="clear" w:color="auto" w:fill="auto"/>
+        <w:vertAlign w:val="baseline"/>
+      </w:rPr>
+    </w:lvl>
+    <w:lvl w:ilvl="4">
+      <w:start w:val="1"/>
+      <w:numFmt w:val="bullet"/>
+      <w:lvlText w:val="■"/>
+      <w:lvlJc w:val="left"/>
+      <w:pPr>
+        <w:ind w:left="3600" w:hanging="360"/>
+      </w:pPr>
+      <w:rPr>
+        <w:rFonts w:ascii="Arial" w:eastAsia="Arial" w:hAnsi="Arial" w:cs="Arial"/>
+        <w:b w:val="0"/>
+        <w:bCs w:val="0"/>
+        <w:i w:val="0"/>
+        <w:iCs w:val="0"/>
+        <w:smallCaps w:val="0"/>
+        <w:strike w:val="0"/>
+        <w:color w:val="000000"/>
+        <w:sz w:val="22"/>
+        <w:szCs w:val="22"/>
+        <w:u w:val="none"/>
+        <w:shd w:val="clear" w:color="auto" w:fill="auto"/>
+        <w:vertAlign w:val="baseline"/>
+      </w:rPr>
+    </w:lvl>
+    <w:lvl w:ilvl="5">
+      <w:start w:val="1"/>
+      <w:numFmt w:val="bullet"/>
+      <w:lvlText w:val="■"/>
+      <w:lvlJc w:val="left"/>
+      <w:pPr>
+        <w:ind w:left="4320" w:hanging="360"/>
+      </w:pPr>
+      <w:rPr>
+        <w:rFonts w:ascii="Arial" w:eastAsia="Arial" w:hAnsi="Arial" w:cs="Arial"/>
+        <w:b w:val="0"/>
+        <w:bCs w:val="0"/>
+        <w:i w:val="0"/>
+        <w:iCs w:val="0"/>
+        <w:smallCaps w:val="0"/>
+        <w:strike w:val="0"/>
+        <w:color w:val="000000"/>
+        <w:sz w:val="22"/>
+        <w:szCs w:val="22"/>
+        <w:u w:val="none"/>
+        <w:shd w:val="clear" w:color="auto" w:fill="auto"/>
+        <w:vertAlign w:val="baseline"/>
+      </w:rPr>
+    </w:lvl>
+    <w:lvl w:ilvl="6">
+      <w:start w:val="1"/>
+      <w:numFmt w:val="bullet"/>
+      <w:lvlText w:val="■"/>
+      <w:lvlJc w:val="left"/>
+      <w:pPr>
+        <w:ind w:left="5040" w:hanging="360"/>
+      </w:pPr>
+      <w:rPr>
+        <w:rFonts w:ascii="Arial" w:eastAsia="Arial" w:hAnsi="Arial" w:cs="Arial"/>
+        <w:b w:val="0"/>
+        <w:bCs w:val="0"/>
+        <w:i w:val="0"/>
+        <w:iCs w:val="0"/>
+        <w:smallCaps w:val="0"/>
+        <w:strike w:val="0"/>
+        <w:color w:val="000000"/>
+        <w:sz w:val="22"/>
+        <w:szCs w:val="22"/>
+        <w:u w:val="none"/>
+        <w:shd w:val="clear" w:color="auto" w:fill="auto"/>
+        <w:vertAlign w:val="baseline"/>
+      </w:rPr>
+    </w:lvl>
+    <w:lvl w:ilvl="7">
+      <w:start w:val="1"/>
+      <w:numFmt w:val="bullet"/>
+      <w:lvlText w:val="■"/>
+      <w:lvlJc w:val="left"/>
+      <w:pPr>
+        <w:ind w:left="5760" w:hanging="360"/>
+      </w:pPr>
+      <w:rPr>
+        <w:rFonts w:ascii="Arial" w:eastAsia="Arial" w:hAnsi="Arial" w:cs="Arial"/>
+        <w:b w:val="0"/>
+        <w:bCs w:val="0"/>
+        <w:i w:val="0"/>
+        <w:iCs w:val="0"/>
+        <w:smallCaps w:val="0"/>
+        <w:strike w:val="0"/>
+        <w:color w:val="000000"/>
+        <w:sz w:val="22"/>
+        <w:szCs w:val="22"/>
+        <w:u w:val="none"/>
+        <w:shd w:val="clear" w:color="auto" w:fill="auto"/>
+        <w:vertAlign w:val="baseline"/>
+      </w:rPr>
+    </w:lvl>
+    <w:lvl w:ilvl="8">
+      <w:start w:val="1"/>
+      <w:numFmt w:val="bullet"/>
+      <w:lvlText w:val="■"/>
+      <w:lvlJc w:val="left"/>
+      <w:pPr>
+        <w:ind w:left="6480" w:hanging="360"/>
+      </w:pPr>
+      <w:rPr>
+        <w:rFonts w:ascii="Arial" w:eastAsia="Arial" w:hAnsi="Arial" w:cs="Arial"/>
+        <w:b w:val="0"/>
+        <w:bCs w:val="0"/>
+        <w:i w:val="0"/>
+        <w:iCs w:val="0"/>
+        <w:smallCaps w:val="0"/>
+        <w:strike w:val="0"/>
+        <w:color w:val="000000"/>
+        <w:sz w:val="22"/>
+        <w:szCs w:val="22"/>
+        <w:u w:val="none"/>
+        <w:shd w:val="clear" w:color="auto" w:fill="auto"/>
+        <w:vertAlign w:val="baseline"/>
+      </w:rPr>
+    </w:lvl>
+  </w:abstractNum>
+  <w:abstractNum w:abstractNumId="18" w15:restartNumberingAfterBreak="0">
     <w:nsid w:val="7700129D"/>
     <w:multiLevelType w:val="multilevel"/>
     <w:tmpl w:val="A774B62C"/>
@@ -8873,7 +11485,7 @@
       </w:rPr>
     </w:lvl>
   </w:abstractNum>
-  <w:abstractNum w:abstractNumId="14" w15:restartNumberingAfterBreak="0">
+  <w:abstractNum w:abstractNumId="19" w15:restartNumberingAfterBreak="0">
     <w:nsid w:val="79586CD1"/>
     <w:multiLevelType w:val="multilevel"/>
     <w:tmpl w:val="B99AE416"/>
@@ -9094,7 +11706,7 @@
       </w:rPr>
     </w:lvl>
   </w:abstractNum>
-  <w:abstractNum w:abstractNumId="15" w15:restartNumberingAfterBreak="0">
+  <w:abstractNum w:abstractNumId="20" w15:restartNumberingAfterBreak="0">
     <w:nsid w:val="7BDA2D2F"/>
     <w:multiLevelType w:val="multilevel"/>
     <w:tmpl w:val="54222346"/>
@@ -9244,52 +11856,67 @@
     </w:lvl>
   </w:abstractNum>
   <w:num w:numId="1" w16cid:durableId="1285692316">
-    <w:abstractNumId w:val="12"/>
+    <w:abstractNumId w:val="16"/>
   </w:num>
   <w:num w:numId="2" w16cid:durableId="967052676">
-    <w:abstractNumId w:val="7"/>
+    <w:abstractNumId w:val="8"/>
   </w:num>
   <w:num w:numId="3" w16cid:durableId="1169246334">
-    <w:abstractNumId w:val="15"/>
+    <w:abstractNumId w:val="20"/>
   </w:num>
   <w:num w:numId="4" w16cid:durableId="349989933">
     <w:abstractNumId w:val="1"/>
   </w:num>
   <w:num w:numId="5" w16cid:durableId="2121532888">
-    <w:abstractNumId w:val="9"/>
+    <w:abstractNumId w:val="10"/>
   </w:num>
   <w:num w:numId="6" w16cid:durableId="1175458488">
-    <w:abstractNumId w:val="11"/>
+    <w:abstractNumId w:val="13"/>
   </w:num>
   <w:num w:numId="7" w16cid:durableId="2090927593">
-    <w:abstractNumId w:val="8"/>
+    <w:abstractNumId w:val="9"/>
   </w:num>
   <w:num w:numId="8" w16cid:durableId="1096823365">
     <w:abstractNumId w:val="2"/>
   </w:num>
   <w:num w:numId="9" w16cid:durableId="1821270112">
-    <w:abstractNumId w:val="3"/>
+    <w:abstractNumId w:val="4"/>
   </w:num>
   <w:num w:numId="10" w16cid:durableId="1205948725">
-    <w:abstractNumId w:val="14"/>
+    <w:abstractNumId w:val="19"/>
   </w:num>
   <w:num w:numId="11" w16cid:durableId="1179542083">
     <w:abstractNumId w:val="0"/>
   </w:num>
   <w:num w:numId="12" w16cid:durableId="1996449380">
-    <w:abstractNumId w:val="10"/>
+    <w:abstractNumId w:val="11"/>
   </w:num>
   <w:num w:numId="13" w16cid:durableId="116220854">
-    <w:abstractNumId w:val="4"/>
+    <w:abstractNumId w:val="5"/>
   </w:num>
   <w:num w:numId="14" w16cid:durableId="1124540011">
+    <w:abstractNumId w:val="7"/>
+  </w:num>
+  <w:num w:numId="15" w16cid:durableId="1861581687">
+    <w:abstractNumId w:val="18"/>
+  </w:num>
+  <w:num w:numId="16" w16cid:durableId="1701858196">
     <w:abstractNumId w:val="6"/>
   </w:num>
-  <w:num w:numId="15" w16cid:durableId="1861581687">
-    <w:abstractNumId w:val="13"/>
+  <w:num w:numId="17" w16cid:durableId="1997562608">
+    <w:abstractNumId w:val="3"/>
   </w:num>
-  <w:num w:numId="16" w16cid:durableId="1701858196">
-    <w:abstractNumId w:val="5"/>
+  <w:num w:numId="18" w16cid:durableId="700932351">
+    <w:abstractNumId w:val="17"/>
+  </w:num>
+  <w:num w:numId="19" w16cid:durableId="1737051822">
+    <w:abstractNumId w:val="12"/>
+  </w:num>
+  <w:num w:numId="20" w16cid:durableId="72169607">
+    <w:abstractNumId w:val="14"/>
+  </w:num>
+  <w:num w:numId="21" w16cid:durableId="2085107647">
+    <w:abstractNumId w:val="15"/>
   </w:num>
 </w:numbering>
 </file>

</xml_diff>